<commit_message>
Refresh handoff report docx
</commit_message>
<xml_diff>
--- a/wall_x/wallx_time_flops_handoff_report.docx
+++ b/wall_x/wallx_time_flops_handoff_report.docx
@@ -10,9 +10,9 @@
         <w:rPr>
           <w:rFonts w:ascii="Arial" w:hAnsi="Arial" w:eastAsia="Microsoft YaHei"/>
           <w:b/>
-          <w:sz w:val="36"/>
+          <w:sz w:val="32"/>
         </w:rPr>
-        <w:t>Wall-X 时间节点与复杂度测量工作交接报告</w:t>
+        <w:t>wall_x 时间节点与复杂度评估交接报告</w:t>
       </w:r>
     </w:p>
     <w:p>
@@ -22,42 +22,54 @@
       <w:r>
         <w:rPr>
           <w:rFonts w:ascii="Arial" w:hAnsi="Arial" w:eastAsia="Microsoft YaHei"/>
-          <w:b w:val="0"/>
-          <w:sz w:val="21"/>
+          <w:sz w:val="22"/>
         </w:rPr>
-        <w:t>任务：确认如何添加时间节点和复杂度测量 | 日期：2026-05-23</w:t>
+        <w:t>面向机器人的轻量化 VLA 算法与高效部署研究</w:t>
+      </w:r>
+    </w:p>
+    <w:p>
+      <w:r>
+        <w:rPr>
+          <w:b/>
+        </w:rPr>
+        <w:t>生成日期：</w:t>
+      </w:r>
+      <w:r>
+        <w:t>2026-05-23</w:t>
+      </w:r>
+      <w:r>
+        <w:t xml:space="preserve">    </w:t>
+      </w:r>
+      <w:r>
+        <w:rPr>
+          <w:b/>
+        </w:rPr>
+        <w:t>对象：</w:t>
+      </w:r>
+      <w:r>
+        <w:t>vispruner 移植后的 wall_x 动作预测模型</w:t>
+      </w:r>
+      <w:r>
+        <w:t xml:space="preserve">    </w:t>
+      </w:r>
+      <w:r>
+        <w:rPr>
+          <w:b/>
+        </w:rPr>
+        <w:t>状态：</w:t>
+      </w:r>
+      <w:r>
+        <w:t>已完成时间统计与复杂度统计的可复现实验</w:t>
       </w:r>
     </w:p>
     <w:p>
       <w:r>
         <w:rPr>
           <w:rFonts w:ascii="Arial" w:hAnsi="Arial" w:eastAsia="Microsoft YaHei"/>
-          <w:b w:val="0"/>
-          <w:sz w:val="21"/>
+          <w:b/>
+          <w:sz w:val="24"/>
         </w:rPr>
-      </w:r>
-    </w:p>
-    <w:p>
-      <w:pPr>
-        <w:pStyle w:val="Heading1"/>
-      </w:pPr>
-      <w:r>
-        <w:rPr>
-          <w:rFonts w:ascii="Arial" w:hAnsi="Arial" w:eastAsia="Microsoft YaHei"/>
-          <w:b/>
-          <w:sz w:val="28"/>
-        </w:rPr>
-        <w:t>1. 本次要解决的问题</w:t>
-      </w:r>
-    </w:p>
-    <w:p>
-      <w:r>
-        <w:rPr>
-          <w:rFonts w:ascii="Arial" w:hAnsi="Arial" w:eastAsia="Microsoft YaHei"/>
-          <w:b w:val="0"/>
-          <w:sz w:val="21"/>
-        </w:rPr>
-        <w:t>本次工作的目标是完成第 ⑤ 点：“确认如何添加时间节点和复杂度”。具体来说，不是实现 VisPruner 剪枝算法本身，而是为 Wall-X/VLA 动作预测模型加入可复用的性能评估手段。后续将 VisPruner 移植到模型中后，可以用同一套测量入口对比剪枝前后的实际推理时间和理论计算量。</w:t>
+        <w:t>1. 任务目标</w:t>
       </w:r>
     </w:p>
     <w:p>
@@ -67,10 +79,8 @@
       <w:r>
         <w:rPr>
           <w:rFonts w:ascii="Arial" w:hAnsi="Arial" w:eastAsia="Microsoft YaHei"/>
-          <w:b w:val="0"/>
-          <w:sz w:val="21"/>
         </w:rPr>
-        <w:t>时间节点：统计一次动作预测推理中各关键阶段的真实 GPU 耗时。</w:t>
+        <w:t>确认如何在模型中添加时间节点，用于统计完整推理链路的真实耗时。</w:t>
       </w:r>
     </w:p>
     <w:p>
@@ -80,10 +90,8 @@
       <w:r>
         <w:rPr>
           <w:rFonts w:ascii="Arial" w:hAnsi="Arial" w:eastAsia="Microsoft YaHei"/>
-          <w:b w:val="0"/>
-          <w:sz w:val="21"/>
         </w:rPr>
-        <w:t>复杂度：统计或估算一次 forward 的理论 FLOPs/GFLOPs，用于量化计算量变化。</w:t>
+        <w:t>确认如何统计 vispruner 剪枝前后复杂度变化，用于量化理论计算量下降。</w:t>
       </w:r>
     </w:p>
     <w:p>
@@ -93,43 +101,461 @@
       <w:r>
         <w:rPr>
           <w:rFonts w:ascii="Arial" w:hAnsi="Arial" w:eastAsia="Microsoft YaHei"/>
-          <w:b w:val="0"/>
-          <w:sz w:val="21"/>
         </w:rPr>
-        <w:t>核心目的：为“视觉 token 剪枝是否真的带来加速和计算量下降”提供可复现实验依据。</w:t>
-      </w:r>
-    </w:p>
-    <w:p>
-      <w:pPr>
-        <w:pStyle w:val="Heading1"/>
-      </w:pPr>
-      <w:r>
-        <w:rPr>
-          <w:rFonts w:ascii="Arial" w:hAnsi="Arial" w:eastAsia="Microsoft YaHei"/>
-          <w:b/>
-          <w:sz w:val="28"/>
-        </w:rPr>
-        <w:t>2. 时间节点是什么，为什么要测</w:t>
+        <w:t>避免把完整动作预测链路强行交给 fvcore tracing，改用更稳定的 token 级估算方案。</w:t>
       </w:r>
     </w:p>
     <w:p>
       <w:r>
         <w:rPr>
           <w:rFonts w:ascii="Arial" w:hAnsi="Arial" w:eastAsia="Microsoft YaHei"/>
-          <w:b w:val="0"/>
-          <w:sz w:val="21"/>
+          <w:b/>
+          <w:sz w:val="24"/>
         </w:rPr>
-        <w:t>时间节点指模型推理流程中的分段计时点。本项目中动作预测路径主要经过视觉编码、输入 embedding、位置编码、Transformer prefill、KV-cache 处理、ODE/flow action 多步迭代和后处理等阶段。</w:t>
+        <w:t>2. 为什么要测</w:t>
+      </w:r>
+    </w:p>
+    <w:p>
+      <w:pPr>
+        <w:pStyle w:val="ListBullet"/>
+      </w:pPr>
+      <w:r>
+        <w:rPr>
+          <w:rFonts w:ascii="Arial" w:hAnsi="Arial" w:eastAsia="Microsoft YaHei"/>
+        </w:rPr>
+        <w:t>时间节点回答的是“实际有没有变快”，依赖 CUDA Event 的真实推理计时。</w:t>
+      </w:r>
+    </w:p>
+    <w:p>
+      <w:pPr>
+        <w:pStyle w:val="ListBullet"/>
+      </w:pPr>
+      <w:r>
+        <w:rPr>
+          <w:rFonts w:ascii="Arial" w:hAnsi="Arial" w:eastAsia="Microsoft YaHei"/>
+        </w:rPr>
+        <w:t>复杂度回答的是“理论上有没有变轻”，重点是视觉 token 减少后 attention 计算是否下降。</w:t>
+      </w:r>
+    </w:p>
+    <w:p>
+      <w:pPr>
+        <w:pStyle w:val="ListBullet"/>
+      </w:pPr>
+      <w:r>
+        <w:rPr>
+          <w:rFonts w:ascii="Arial" w:hAnsi="Arial" w:eastAsia="Microsoft YaHei"/>
+        </w:rPr>
+        <w:t>两者是互补关系：时间看工程效果，复杂度看算法代价。</w:t>
       </w:r>
     </w:p>
     <w:p>
       <w:r>
         <w:rPr>
           <w:rFonts w:ascii="Arial" w:hAnsi="Arial" w:eastAsia="Microsoft YaHei"/>
-          <w:b w:val="0"/>
-          <w:sz w:val="21"/>
+          <w:b/>
+          <w:sz w:val="24"/>
         </w:rPr>
-        <w:t>PyTorch CUDA 算子是异步执行的，不能直接用 time.time() 作为 GPU 推理耗时的严格测量方式。否则 Python 代码返回时 GPU 可能还没有执行完，测出来的时间会偏小。因此本次改动使用 torch.cuda.Event(enable_timing=True) 并配合 torch.cuda.synchronize() 做 GPU 计时。</w:t>
+        <w:t>3. 最终方案</w:t>
+      </w:r>
+    </w:p>
+    <w:p>
+      <w:pPr>
+        <w:pStyle w:val="ListBullet"/>
+      </w:pPr>
+      <w:r>
+        <w:rPr>
+          <w:rFonts w:ascii="Arial" w:hAnsi="Arial" w:eastAsia="Microsoft YaHei"/>
+        </w:rPr>
+        <w:t>时间统计：使用 torch.cuda.Event，在推理入口前后记录总耗时，并保留 warm-up 机制。</w:t>
+      </w:r>
+    </w:p>
+    <w:p>
+      <w:pPr>
+        <w:pStyle w:val="ListBullet"/>
+      </w:pPr>
+      <w:r>
+        <w:rPr>
+          <w:rFonts w:ascii="Arial" w:hAnsi="Arial" w:eastAsia="Microsoft YaHei"/>
+        </w:rPr>
+        <w:t>复杂度统计：基于 token 数量计算 seq_len_before / seq_len_after，再用 attention ~ L^2 估算下降比例。</w:t>
+      </w:r>
+    </w:p>
+    <w:p>
+      <w:pPr>
+        <w:pStyle w:val="ListBullet"/>
+      </w:pPr>
+      <w:r>
+        <w:rPr>
+          <w:rFonts w:ascii="Arial" w:hAnsi="Arial" w:eastAsia="Microsoft YaHei"/>
+        </w:rPr>
+        <w:t>FLOPs 统计：复用 model/model_utils.py 中的 num_floating_point_operations(...) 作为粗粒度辅助估算。</w:t>
+      </w:r>
+    </w:p>
+    <w:p>
+      <w:pPr>
+        <w:pStyle w:val="ListBullet"/>
+      </w:pPr>
+      <w:r>
+        <w:rPr>
+          <w:rFonts w:ascii="Arial" w:hAnsi="Arial" w:eastAsia="Microsoft YaHei"/>
+        </w:rPr>
+        <w:t>不再对完整 generate_flow_action / diffusion 链路强行做 fvcore tracing。</w:t>
+      </w:r>
+    </w:p>
+    <w:p>
+      <w:r>
+        <w:rPr>
+          <w:rFonts w:ascii="Arial" w:hAnsi="Arial" w:eastAsia="Microsoft YaHei"/>
+          <w:b/>
+          <w:sz w:val="24"/>
+        </w:rPr>
+        <w:t>4. 代码改动</w:t>
+      </w:r>
+    </w:p>
+    <w:p>
+      <w:pPr>
+        <w:pStyle w:val="ListBullet"/>
+      </w:pPr>
+      <w:r>
+        <w:rPr>
+          <w:rFonts w:ascii="Arial" w:hAnsi="Arial" w:eastAsia="Microsoft YaHei"/>
+        </w:rPr>
+        <w:t>model/qwen2_5_based/modeling_qwen2_5_vl_act.py：新增/保留 _InferencePerfTimer、_log_complexity_track、profile_timing、profile_complexity 等逻辑。</w:t>
+      </w:r>
+    </w:p>
+    <w:p>
+      <w:pPr>
+        <w:pStyle w:val="ListBullet"/>
+      </w:pPr>
+      <w:r>
+        <w:rPr>
+          <w:rFonts w:ascii="Arial" w:hAnsi="Arial" w:eastAsia="Microsoft YaHei"/>
+        </w:rPr>
+        <w:t>model/model_utils.py：复用 num_floating_point_operations(...)，用于对剪枝前后序列长度做辅助 FLOPs 估算。</w:t>
+      </w:r>
+    </w:p>
+    <w:p>
+      <w:pPr>
+        <w:pStyle w:val="ListBullet"/>
+      </w:pPr>
+      <w:r>
+        <w:rPr>
+          <w:rFonts w:ascii="Arial" w:hAnsi="Arial" w:eastAsia="Microsoft YaHei"/>
+        </w:rPr>
+        <w:t>serving/policy/wall_x_policy.py：通过环境变量 WALLX_PROFILE_TIMING 控制是否输出实际推理计时。</w:t>
+      </w:r>
+    </w:p>
+    <w:p>
+      <w:pPr>
+        <w:pStyle w:val="ListBullet"/>
+      </w:pPr>
+      <w:r>
+        <w:rPr>
+          <w:rFonts w:ascii="Arial" w:hAnsi="Arial" w:eastAsia="Microsoft YaHei"/>
+        </w:rPr>
+        <w:t>调试脚本 /tmp/wallx_profile_once.py：用于单次离线验证 warmup、iters、vision_keep_ratio 和结果打印。</w:t>
+      </w:r>
+    </w:p>
+    <w:p>
+      <w:r>
+        <w:rPr>
+          <w:rFonts w:ascii="Arial" w:hAnsi="Arial" w:eastAsia="Microsoft YaHei"/>
+          <w:b/>
+          <w:sz w:val="24"/>
+        </w:rPr>
+        <w:t>5. 运行方式</w:t>
+      </w:r>
+    </w:p>
+    <w:p>
+      <w:pPr>
+        <w:pStyle w:val="ListBullet"/>
+      </w:pPr>
+      <w:r>
+        <w:rPr>
+          <w:rFonts w:ascii="Arial" w:hAnsi="Arial" w:eastAsia="Microsoft YaHei"/>
+        </w:rPr>
+        <w:t>在 wallx 环境下运行：source /root/miniconda3/etc/profile.d/conda.sh &amp;&amp; conda activate wallx。</w:t>
+      </w:r>
+    </w:p>
+    <w:p>
+      <w:pPr>
+        <w:pStyle w:val="ListBullet"/>
+      </w:pPr>
+      <w:r>
+        <w:rPr>
+          <w:rFonts w:ascii="Arial" w:hAnsi="Arial" w:eastAsia="Microsoft YaHei"/>
+        </w:rPr>
+        <w:t>设置 PYTHONPATH=/root/autodl-tmp/wall_x:$PYTHONPATH。</w:t>
+      </w:r>
+    </w:p>
+    <w:p>
+      <w:pPr>
+        <w:pStyle w:val="ListBullet"/>
+      </w:pPr>
+      <w:r>
+        <w:rPr>
+          <w:rFonts w:ascii="Arial" w:hAnsi="Arial" w:eastAsia="Microsoft YaHei"/>
+        </w:rPr>
+        <w:t>执行：python /tmp/wallx_profile_once.py --warmup 5 --iters 20 --vision_keep_ratio 0.5。</w:t>
+      </w:r>
+    </w:p>
+    <w:p>
+      <w:r>
+        <w:rPr>
+          <w:rFonts w:ascii="Arial" w:hAnsi="Arial" w:eastAsia="Microsoft YaHei"/>
+          <w:b/>
+          <w:sz w:val="24"/>
+        </w:rPr>
+        <w:t>6. 实际结果</w:t>
+      </w:r>
+    </w:p>
+    <w:p>
+      <w:pPr>
+        <w:pStyle w:val="ListBullet"/>
+      </w:pPr>
+      <w:r>
+        <w:rPr>
+          <w:rFonts w:ascii="Arial" w:hAnsi="Arial" w:eastAsia="Microsoft YaHei"/>
+        </w:rPr>
+        <w:t>视觉 token：81 -&gt; 41。</w:t>
+      </w:r>
+    </w:p>
+    <w:p>
+      <w:pPr>
+        <w:pStyle w:val="ListBullet"/>
+      </w:pPr>
+      <w:r>
+        <w:rPr>
+          <w:rFonts w:ascii="Arial" w:hAnsi="Arial" w:eastAsia="Microsoft YaHei"/>
+        </w:rPr>
+        <w:t>文本 token：53。</w:t>
+      </w:r>
+    </w:p>
+    <w:p>
+      <w:pPr>
+        <w:pStyle w:val="ListBullet"/>
+      </w:pPr>
+      <w:r>
+        <w:rPr>
+          <w:rFonts w:ascii="Arial" w:hAnsi="Arial" w:eastAsia="Microsoft YaHei"/>
+        </w:rPr>
+        <w:t>action token：32。</w:t>
+      </w:r>
+    </w:p>
+    <w:p>
+      <w:pPr>
+        <w:pStyle w:val="ListBullet"/>
+      </w:pPr>
+      <w:r>
+        <w:rPr>
+          <w:rFonts w:ascii="Arial" w:hAnsi="Arial" w:eastAsia="Microsoft YaHei"/>
+        </w:rPr>
+        <w:t>总序列长度：166 -&gt; 126。</w:t>
+      </w:r>
+    </w:p>
+    <w:p>
+      <w:pPr>
+        <w:pStyle w:val="ListBullet"/>
+      </w:pPr>
+      <w:r>
+        <w:rPr>
+          <w:rFonts w:ascii="Arial" w:hAnsi="Arial" w:eastAsia="Microsoft YaHei"/>
+        </w:rPr>
+        <w:t>attention_ratio = 0.576136，理论 attention 降低 42.39%。</w:t>
+      </w:r>
+    </w:p>
+    <w:p>
+      <w:pPr>
+        <w:pStyle w:val="ListBullet"/>
+      </w:pPr>
+      <w:r>
+        <w:rPr>
+          <w:rFonts w:ascii="Arial" w:hAnsi="Arial" w:eastAsia="Microsoft YaHei"/>
+        </w:rPr>
+        <w:t>estimated_train_flops_before = 1509725809920.0。</w:t>
+      </w:r>
+    </w:p>
+    <w:p>
+      <w:pPr>
+        <w:pStyle w:val="ListBullet"/>
+      </w:pPr>
+      <w:r>
+        <w:rPr>
+          <w:rFonts w:ascii="Arial" w:hAnsi="Arial" w:eastAsia="Microsoft YaHei"/>
+        </w:rPr>
+        <w:t>estimated_train_flops_after = 1357458597120.0。</w:t>
+      </w:r>
+    </w:p>
+    <w:p>
+      <w:pPr>
+        <w:pStyle w:val="ListBullet"/>
+      </w:pPr>
+      <w:r>
+        <w:rPr>
+          <w:rFonts w:ascii="Arial" w:hAnsi="Arial" w:eastAsia="Microsoft YaHei"/>
+        </w:rPr>
+        <w:t>estimated_train_flops_reduction = 10.09%。</w:t>
+      </w:r>
+    </w:p>
+    <w:p>
+      <w:pPr>
+        <w:pStyle w:val="ListBullet"/>
+      </w:pPr>
+      <w:r>
+        <w:rPr>
+          <w:rFonts w:ascii="Arial" w:hAnsi="Arial" w:eastAsia="Microsoft YaHei"/>
+        </w:rPr>
+        <w:t>完整推理平均时间 = 339.891 ms。最后一次推理 total_time = 335.468 ms。</w:t>
+      </w:r>
+    </w:p>
+    <w:p>
+      <w:r>
+        <w:rPr>
+          <w:rFonts w:ascii="Arial" w:hAnsi="Arial" w:eastAsia="Microsoft YaHei"/>
+          <w:b/>
+          <w:sz w:val="24"/>
+        </w:rPr>
+        <w:t>7. 结果分析</w:t>
+      </w:r>
+    </w:p>
+    <w:p>
+      <w:pPr>
+        <w:pStyle w:val="ListBullet"/>
+      </w:pPr>
+      <w:r>
+        <w:rPr>
+          <w:rFonts w:ascii="Arial" w:hAnsi="Arial" w:eastAsia="Microsoft YaHei"/>
+        </w:rPr>
+        <w:t>复杂度下降主要来自视觉 token 减少后，Transformer attention 的平方级代价下降。</w:t>
+      </w:r>
+    </w:p>
+    <w:p>
+      <w:pPr>
+        <w:pStyle w:val="ListBullet"/>
+      </w:pPr>
+      <w:r>
+        <w:rPr>
+          <w:rFonts w:ascii="Arial" w:hAnsi="Arial" w:eastAsia="Microsoft YaHei"/>
+        </w:rPr>
+        <w:t>FLOPs 下降幅度小于 attention 降幅，是因为全模型还包含视觉编码、MLP、action head、ODE integration 等非 attention 成分。</w:t>
+      </w:r>
+    </w:p>
+    <w:p>
+      <w:pPr>
+        <w:pStyle w:val="ListBullet"/>
+      </w:pPr>
+      <w:r>
+        <w:rPr>
+          <w:rFonts w:ascii="Arial" w:hAnsi="Arial" w:eastAsia="Microsoft YaHei"/>
+        </w:rPr>
+        <w:t>实际时间并不会按理论复杂度同比下降，因为完整链路中 ODE integration 仍占很大比例。</w:t>
+      </w:r>
+    </w:p>
+    <w:p>
+      <w:pPr>
+        <w:pStyle w:val="ListBullet"/>
+      </w:pPr>
+      <w:r>
+        <w:rPr>
+          <w:rFonts w:ascii="Arial" w:hAnsi="Arial" w:eastAsia="Microsoft YaHei"/>
+        </w:rPr>
+        <w:t>当前方案更适合回答“剪枝是否有理论收益”和“整体是否真的变快”，而不是给出精确硬件级 FLOPs。</w:t>
+      </w:r>
+    </w:p>
+    <w:p>
+      <w:r>
+        <w:rPr>
+          <w:rFonts w:ascii="Arial" w:hAnsi="Arial" w:eastAsia="Microsoft YaHei"/>
+          <w:b/>
+          <w:sz w:val="24"/>
+        </w:rPr>
+        <w:t>8. 约束与局限</w:t>
+      </w:r>
+    </w:p>
+    <w:p>
+      <w:pPr>
+        <w:pStyle w:val="ListBullet"/>
+      </w:pPr>
+      <w:r>
+        <w:rPr>
+          <w:rFonts w:ascii="Arial" w:hAnsi="Arial" w:eastAsia="Microsoft YaHei"/>
+        </w:rPr>
+        <w:t>复杂度结果是 token 级理论估算，不是 fvcore 级完整 tracing。</w:t>
+      </w:r>
+    </w:p>
+    <w:p>
+      <w:pPr>
+        <w:pStyle w:val="ListBullet"/>
+      </w:pPr>
+      <w:r>
+        <w:rPr>
+          <w:rFonts w:ascii="Arial" w:hAnsi="Arial" w:eastAsia="Microsoft YaHei"/>
+        </w:rPr>
+        <w:t>日志会在每次推理时打印一次，因此 iters=20 会看到重复输出，这是正常现象。</w:t>
+      </w:r>
+    </w:p>
+    <w:p>
+      <w:pPr>
+        <w:pStyle w:val="ListBullet"/>
+      </w:pPr>
+      <w:r>
+        <w:rPr>
+          <w:rFonts w:ascii="Arial" w:hAnsi="Arial" w:eastAsia="Microsoft YaHei"/>
+        </w:rPr>
+        <w:t>warning 信息来自张量构造和自定义 op 的类型提示，不影响当前统计结论。</w:t>
+      </w:r>
+    </w:p>
+    <w:p>
+      <w:r>
+        <w:rPr>
+          <w:rFonts w:ascii="Arial" w:hAnsi="Arial" w:eastAsia="Microsoft YaHei"/>
+          <w:b/>
+          <w:sz w:val="24"/>
+        </w:rPr>
+        <w:t>9. Git 状态</w:t>
+      </w:r>
+    </w:p>
+    <w:p>
+      <w:pPr>
+        <w:pStyle w:val="ListBullet"/>
+      </w:pPr>
+      <w:r>
+        <w:rPr>
+          <w:rFonts w:ascii="Arial" w:hAnsi="Arial" w:eastAsia="Microsoft YaHei"/>
+        </w:rPr>
+        <w:t>当前仓库 remote 为 origin，指向 git@github.com:Acton618/wallx.git。</w:t>
+      </w:r>
+    </w:p>
+    <w:p>
+      <w:pPr>
+        <w:pStyle w:val="ListBullet"/>
+      </w:pPr>
+      <w:r>
+        <w:rPr>
+          <w:rFonts w:ascii="Arial" w:hAnsi="Arial" w:eastAsia="Microsoft YaHei"/>
+        </w:rPr>
+        <w:t>本次生成的报告文件名为 wallx_time_flops_handoff_report.docx，位于仓库根目录 wall_x/ 下。</w:t>
+      </w:r>
+    </w:p>
+    <w:p>
+      <w:pPr>
+        <w:pStyle w:val="ListBullet"/>
+      </w:pPr>
+      <w:r>
+        <w:rPr>
+          <w:rFonts w:ascii="Arial" w:hAnsi="Arial" w:eastAsia="Microsoft YaHei"/>
+        </w:rPr>
+        <w:t>后续会将该文件提交到 main 分支并同步到 GitHub。</w:t>
+      </w:r>
+    </w:p>
+    <w:p>
+      <w:r>
+        <w:rPr>
+          <w:rFonts w:ascii="Arial" w:hAnsi="Arial" w:eastAsia="Microsoft YaHei"/>
+          <w:b/>
+          <w:sz w:val="24"/>
+        </w:rPr>
+        <w:t>关键指标表</w:t>
       </w:r>
     </w:p>
     <w:tbl>
@@ -140,68 +566,27 @@
         <w:tblLook w:firstColumn="1" w:firstRow="1" w:lastColumn="0" w:lastRow="0" w:noHBand="0" w:noVBand="1" w:val="04A0"/>
       </w:tblPr>
       <w:tblGrid>
-        <w:gridCol w:w="3312"/>
-        <w:gridCol w:w="3312"/>
-        <w:gridCol w:w="3312"/>
+        <w:gridCol w:w="4320"/>
+        <w:gridCol w:w="4320"/>
       </w:tblGrid>
       <w:tr>
         <w:tc>
           <w:tcPr>
-            <w:tcW w:type="dxa" w:w="3312"/>
-            <w:shd w:fill="D9EAF7"/>
-            <w:vAlign w:val="center"/>
+            <w:tcW w:type="dxa" w:w="4320"/>
           </w:tcPr>
           <w:p>
-            <w:pPr>
-              <w:jc w:val="center"/>
-            </w:pPr>
             <w:r>
-              <w:rPr>
-                <w:rFonts w:ascii="Arial" w:hAnsi="Arial" w:eastAsia="Microsoft YaHei"/>
-                <w:b/>
-                <w:sz w:val="21"/>
-              </w:rPr>
-              <w:t>时间节点</w:t>
+              <w:t>指标</w:t>
             </w:r>
           </w:p>
         </w:tc>
         <w:tc>
           <w:tcPr>
-            <w:tcW w:type="dxa" w:w="3312"/>
-            <w:shd w:fill="D9EAF7"/>
-            <w:vAlign w:val="center"/>
+            <w:tcW w:type="dxa" w:w="4320"/>
           </w:tcPr>
           <w:p>
-            <w:pPr>
-              <w:jc w:val="center"/>
-            </w:pPr>
             <w:r>
-              <w:rPr>
-                <w:rFonts w:ascii="Arial" w:hAnsi="Arial" w:eastAsia="Microsoft YaHei"/>
-                <w:b/>
-                <w:sz w:val="21"/>
-              </w:rPr>
-              <w:t>含义</w:t>
-            </w:r>
-          </w:p>
-        </w:tc>
-        <w:tc>
-          <w:tcPr>
-            <w:tcW w:type="dxa" w:w="3312"/>
-            <w:shd w:fill="D9EAF7"/>
-            <w:vAlign w:val="center"/>
-          </w:tcPr>
-          <w:p>
-            <w:pPr>
-              <w:jc w:val="center"/>
-            </w:pPr>
-            <w:r>
-              <w:rPr>
-                <w:rFonts w:ascii="Arial" w:hAnsi="Arial" w:eastAsia="Microsoft YaHei"/>
-                <w:b/>
-                <w:sz w:val="21"/>
-              </w:rPr>
-              <w:t>关注原因</w:t>
+              <w:t>数值</w:t>
             </w:r>
           </w:p>
         </w:tc>
@@ -209,49 +594,21 @@
       <w:tr>
         <w:tc>
           <w:tcPr>
-            <w:tcW w:type="dxa" w:w="3312"/>
-            <w:vAlign w:val="center"/>
+            <w:tcW w:type="dxa" w:w="4320"/>
           </w:tcPr>
           <w:p>
             <w:r>
-              <w:rPr>
-                <w:rFonts w:ascii="Arial" w:hAnsi="Arial" w:eastAsia="Microsoft YaHei"/>
-                <w:b w:val="0"/>
-                <w:sz w:val="21"/>
-              </w:rPr>
-              <w:t>total_time</w:t>
+              <w:t>vision_tokens_before</w:t>
             </w:r>
           </w:p>
         </w:tc>
         <w:tc>
           <w:tcPr>
-            <w:tcW w:type="dxa" w:w="3312"/>
-            <w:vAlign w:val="center"/>
+            <w:tcW w:type="dxa" w:w="4320"/>
           </w:tcPr>
           <w:p>
             <w:r>
-              <w:rPr>
-                <w:rFonts w:ascii="Arial" w:hAnsi="Arial" w:eastAsia="Microsoft YaHei"/>
-                <w:b w:val="0"/>
-                <w:sz w:val="21"/>
-              </w:rPr>
-              <w:t>一次动作预测总耗时</w:t>
-            </w:r>
-          </w:p>
-        </w:tc>
-        <w:tc>
-          <w:tcPr>
-            <w:tcW w:type="dxa" w:w="3312"/>
-            <w:vAlign w:val="center"/>
-          </w:tcPr>
-          <w:p>
-            <w:r>
-              <w:rPr>
-                <w:rFonts w:ascii="Arial" w:hAnsi="Arial" w:eastAsia="Microsoft YaHei"/>
-                <w:b w:val="0"/>
-                <w:sz w:val="21"/>
-              </w:rPr>
-              <w:t>最终汇报最核心的实际速度指标</w:t>
+              <w:t>81</w:t>
             </w:r>
           </w:p>
         </w:tc>
@@ -259,49 +616,21 @@
       <w:tr>
         <w:tc>
           <w:tcPr>
-            <w:tcW w:type="dxa" w:w="3312"/>
-            <w:vAlign w:val="center"/>
+            <w:tcW w:type="dxa" w:w="4320"/>
           </w:tcPr>
           <w:p>
             <w:r>
-              <w:rPr>
-                <w:rFonts w:ascii="Arial" w:hAnsi="Arial" w:eastAsia="Microsoft YaHei"/>
-                <w:b w:val="0"/>
-                <w:sz w:val="21"/>
-              </w:rPr>
-              <w:t>vision_image_forward</w:t>
+              <w:t>vision_tokens_after</w:t>
             </w:r>
           </w:p>
         </w:tc>
         <w:tc>
           <w:tcPr>
-            <w:tcW w:type="dxa" w:w="3312"/>
-            <w:vAlign w:val="center"/>
+            <w:tcW w:type="dxa" w:w="4320"/>
           </w:tcPr>
           <w:p>
             <w:r>
-              <w:rPr>
-                <w:rFonts w:ascii="Arial" w:hAnsi="Arial" w:eastAsia="Microsoft YaHei"/>
-                <w:b w:val="0"/>
-                <w:sz w:val="21"/>
-              </w:rPr>
-              <w:t>图像进入视觉塔 self.visual(...) 的耗时</w:t>
-            </w:r>
-          </w:p>
-        </w:tc>
-        <w:tc>
-          <w:tcPr>
-            <w:tcW w:type="dxa" w:w="3312"/>
-            <w:vAlign w:val="center"/>
-          </w:tcPr>
-          <w:p>
-            <w:r>
-              <w:rPr>
-                <w:rFonts w:ascii="Arial" w:hAnsi="Arial" w:eastAsia="Microsoft YaHei"/>
-                <w:b w:val="0"/>
-                <w:sz w:val="21"/>
-              </w:rPr>
-              <w:t>VisPruner 若插入视觉 token 处理附近，这里能观察剪枝本身的开销</w:t>
+              <w:t>41</w:t>
             </w:r>
           </w:p>
         </w:tc>
@@ -309,49 +638,21 @@
       <w:tr>
         <w:tc>
           <w:tcPr>
-            <w:tcW w:type="dxa" w:w="3312"/>
-            <w:vAlign w:val="center"/>
+            <w:tcW w:type="dxa" w:w="4320"/>
           </w:tcPr>
           <w:p>
             <w:r>
-              <w:rPr>
-                <w:rFonts w:ascii="Arial" w:hAnsi="Arial" w:eastAsia="Microsoft YaHei"/>
-                <w:b w:val="0"/>
-                <w:sz w:val="21"/>
-              </w:rPr>
-              <w:t>vision_video_forward</w:t>
+              <w:t>text_tokens</w:t>
             </w:r>
           </w:p>
         </w:tc>
         <w:tc>
           <w:tcPr>
-            <w:tcW w:type="dxa" w:w="3312"/>
-            <w:vAlign w:val="center"/>
+            <w:tcW w:type="dxa" w:w="4320"/>
           </w:tcPr>
           <w:p>
             <w:r>
-              <w:rPr>
-                <w:rFonts w:ascii="Arial" w:hAnsi="Arial" w:eastAsia="Microsoft YaHei"/>
-                <w:b w:val="0"/>
-                <w:sz w:val="21"/>
-              </w:rPr>
-              <w:t>视频进入视觉塔的耗时</w:t>
-            </w:r>
-          </w:p>
-        </w:tc>
-        <w:tc>
-          <w:tcPr>
-            <w:tcW w:type="dxa" w:w="3312"/>
-            <w:vAlign w:val="center"/>
-          </w:tcPr>
-          <w:p>
-            <w:r>
-              <w:rPr>
-                <w:rFonts w:ascii="Arial" w:hAnsi="Arial" w:eastAsia="Microsoft YaHei"/>
-                <w:b w:val="0"/>
-                <w:sz w:val="21"/>
-              </w:rPr>
-              <w:t>有视频输入时用于评估视频视觉编码耗时</w:t>
+              <w:t>53</w:t>
             </w:r>
           </w:p>
         </w:tc>
@@ -359,49 +660,21 @@
       <w:tr>
         <w:tc>
           <w:tcPr>
-            <w:tcW w:type="dxa" w:w="3312"/>
-            <w:vAlign w:val="center"/>
+            <w:tcW w:type="dxa" w:w="4320"/>
           </w:tcPr>
           <w:p>
             <w:r>
-              <w:rPr>
-                <w:rFonts w:ascii="Arial" w:hAnsi="Arial" w:eastAsia="Microsoft YaHei"/>
-                <w:b w:val="0"/>
-                <w:sz w:val="21"/>
-              </w:rPr>
-              <w:t>embed_processing</w:t>
+              <w:t>action_tokens</w:t>
             </w:r>
           </w:p>
         </w:tc>
         <w:tc>
           <w:tcPr>
-            <w:tcW w:type="dxa" w:w="3312"/>
-            <w:vAlign w:val="center"/>
+            <w:tcW w:type="dxa" w:w="4320"/>
           </w:tcPr>
           <w:p>
             <w:r>
-              <w:rPr>
-                <w:rFonts w:ascii="Arial" w:hAnsi="Arial" w:eastAsia="Microsoft YaHei"/>
-                <w:b w:val="0"/>
-                <w:sz w:val="21"/>
-              </w:rPr>
-              <w:t>文本/视觉/proprioception embedding 和输入准备</w:t>
-            </w:r>
-          </w:p>
-        </w:tc>
-        <w:tc>
-          <w:tcPr>
-            <w:tcW w:type="dxa" w:w="3312"/>
-            <w:vAlign w:val="center"/>
-          </w:tcPr>
-          <w:p>
-            <w:r>
-              <w:rPr>
-                <w:rFonts w:ascii="Arial" w:hAnsi="Arial" w:eastAsia="Microsoft YaHei"/>
-                <w:b w:val="0"/>
-                <w:sz w:val="21"/>
-              </w:rPr>
-              <w:t>用于判断输入准备是否成为瓶颈</w:t>
+              <w:t>32</w:t>
             </w:r>
           </w:p>
         </w:tc>
@@ -409,49 +682,21 @@
       <w:tr>
         <w:tc>
           <w:tcPr>
-            <w:tcW w:type="dxa" w:w="3312"/>
-            <w:vAlign w:val="center"/>
+            <w:tcW w:type="dxa" w:w="4320"/>
           </w:tcPr>
           <w:p>
             <w:r>
-              <w:rPr>
-                <w:rFonts w:ascii="Arial" w:hAnsi="Arial" w:eastAsia="Microsoft YaHei"/>
-                <w:b w:val="0"/>
-                <w:sz w:val="21"/>
-              </w:rPr>
-              <w:t>position_encoding</w:t>
+              <w:t>seq_len_before</w:t>
             </w:r>
           </w:p>
         </w:tc>
         <w:tc>
           <w:tcPr>
-            <w:tcW w:type="dxa" w:w="3312"/>
-            <w:vAlign w:val="center"/>
+            <w:tcW w:type="dxa" w:w="4320"/>
           </w:tcPr>
           <w:p>
             <w:r>
-              <w:rPr>
-                <w:rFonts w:ascii="Arial" w:hAnsi="Arial" w:eastAsia="Microsoft YaHei"/>
-                <w:b w:val="0"/>
-                <w:sz w:val="21"/>
-              </w:rPr>
-              <w:t>RoPE 位置编码和 MoE token 分组索引准备</w:t>
-            </w:r>
-          </w:p>
-        </w:tc>
-        <w:tc>
-          <w:tcPr>
-            <w:tcW w:type="dxa" w:w="3312"/>
-            <w:vAlign w:val="center"/>
-          </w:tcPr>
-          <w:p>
-            <w:r>
-              <w:rPr>
-                <w:rFonts w:ascii="Arial" w:hAnsi="Arial" w:eastAsia="Microsoft YaHei"/>
-                <w:b w:val="0"/>
-                <w:sz w:val="21"/>
-              </w:rPr>
-              <w:t>通常较小，但需要分离出来避免污染主耗时</w:t>
+              <w:t>166</w:t>
             </w:r>
           </w:p>
         </w:tc>
@@ -459,49 +704,21 @@
       <w:tr>
         <w:tc>
           <w:tcPr>
-            <w:tcW w:type="dxa" w:w="3312"/>
-            <w:vAlign w:val="center"/>
+            <w:tcW w:type="dxa" w:w="4320"/>
           </w:tcPr>
           <w:p>
             <w:r>
-              <w:rPr>
-                <w:rFonts w:ascii="Arial" w:hAnsi="Arial" w:eastAsia="Microsoft YaHei"/>
-                <w:b w:val="0"/>
-                <w:sz w:val="21"/>
-              </w:rPr>
-              <w:t>action_initialization</w:t>
+              <w:t>seq_len_after</w:t>
             </w:r>
           </w:p>
         </w:tc>
         <w:tc>
           <w:tcPr>
-            <w:tcW w:type="dxa" w:w="3312"/>
-            <w:vAlign w:val="center"/>
+            <w:tcW w:type="dxa" w:w="4320"/>
           </w:tcPr>
           <w:p>
             <w:r>
-              <w:rPr>
-                <w:rFonts w:ascii="Arial" w:hAnsi="Arial" w:eastAsia="Microsoft YaHei"/>
-                <w:b w:val="0"/>
-                <w:sz w:val="21"/>
-              </w:rPr>
-              <w:t>flow/diffusion action 初始噪声和 action embedding 初始化</w:t>
-            </w:r>
-          </w:p>
-        </w:tc>
-        <w:tc>
-          <w:tcPr>
-            <w:tcW w:type="dxa" w:w="3312"/>
-            <w:vAlign w:val="center"/>
-          </w:tcPr>
-          <w:p>
-            <w:r>
-              <w:rPr>
-                <w:rFonts w:ascii="Arial" w:hAnsi="Arial" w:eastAsia="Microsoft YaHei"/>
-                <w:b w:val="0"/>
-                <w:sz w:val="21"/>
-              </w:rPr>
-              <w:t>动作预测特有开销</w:t>
+              <w:t>126</w:t>
             </w:r>
           </w:p>
         </w:tc>
@@ -509,49 +726,21 @@
       <w:tr>
         <w:tc>
           <w:tcPr>
-            <w:tcW w:type="dxa" w:w="3312"/>
-            <w:vAlign w:val="center"/>
+            <w:tcW w:type="dxa" w:w="4320"/>
           </w:tcPr>
           <w:p>
             <w:r>
-              <w:rPr>
-                <w:rFonts w:ascii="Arial" w:hAnsi="Arial" w:eastAsia="Microsoft YaHei"/>
-                <w:b w:val="0"/>
-                <w:sz w:val="21"/>
-              </w:rPr>
-              <w:t>prefetch_forward</w:t>
+              <w:t>attention_ratio</w:t>
             </w:r>
           </w:p>
         </w:tc>
         <w:tc>
           <w:tcPr>
-            <w:tcW w:type="dxa" w:w="3312"/>
-            <w:vAlign w:val="center"/>
+            <w:tcW w:type="dxa" w:w="4320"/>
           </w:tcPr>
           <w:p>
             <w:r>
-              <w:rPr>
-                <w:rFonts w:ascii="Arial" w:hAnsi="Arial" w:eastAsia="Microsoft YaHei"/>
-                <w:b w:val="0"/>
-                <w:sz w:val="21"/>
-              </w:rPr>
-              <w:t>主 Transformer 第一次完整前向/prefill</w:t>
-            </w:r>
-          </w:p>
-        </w:tc>
-        <w:tc>
-          <w:tcPr>
-            <w:tcW w:type="dxa" w:w="3312"/>
-            <w:vAlign w:val="center"/>
-          </w:tcPr>
-          <w:p>
-            <w:r>
-              <w:rPr>
-                <w:rFonts w:ascii="Arial" w:hAnsi="Arial" w:eastAsia="Microsoft YaHei"/>
-                <w:b w:val="0"/>
-                <w:sz w:val="21"/>
-              </w:rPr>
-              <w:t>视觉 token 减少后理论上应明显受益</w:t>
+              <w:t>0.576136</w:t>
             </w:r>
           </w:p>
         </w:tc>
@@ -559,49 +748,21 @@
       <w:tr>
         <w:tc>
           <w:tcPr>
-            <w:tcW w:type="dxa" w:w="3312"/>
-            <w:vAlign w:val="center"/>
+            <w:tcW w:type="dxa" w:w="4320"/>
           </w:tcPr>
           <w:p>
             <w:r>
-              <w:rPr>
-                <w:rFonts w:ascii="Arial" w:hAnsi="Arial" w:eastAsia="Microsoft YaHei"/>
-                <w:b w:val="0"/>
-                <w:sz w:val="21"/>
-              </w:rPr>
-              <w:t>cache_preprocessing</w:t>
+              <w:t>estimated_attention_reduction</w:t>
             </w:r>
           </w:p>
         </w:tc>
         <w:tc>
           <w:tcPr>
-            <w:tcW w:type="dxa" w:w="3312"/>
-            <w:vAlign w:val="center"/>
+            <w:tcW w:type="dxa" w:w="4320"/>
           </w:tcPr>
           <w:p>
             <w:r>
-              <w:rPr>
-                <w:rFonts w:ascii="Arial" w:hAnsi="Arial" w:eastAsia="Microsoft YaHei"/>
-                <w:b w:val="0"/>
-                <w:sz w:val="21"/>
-              </w:rPr>
-              <w:t>KV-cache 裁剪和 postfix attention mask 准备</w:t>
-            </w:r>
-          </w:p>
-        </w:tc>
-        <w:tc>
-          <w:tcPr>
-            <w:tcW w:type="dxa" w:w="3312"/>
-            <w:vAlign w:val="center"/>
-          </w:tcPr>
-          <w:p>
-            <w:r>
-              <w:rPr>
-                <w:rFonts w:ascii="Arial" w:hAnsi="Arial" w:eastAsia="Microsoft YaHei"/>
-                <w:b w:val="0"/>
-                <w:sz w:val="21"/>
-              </w:rPr>
-              <w:t>用于观察 cache 相关额外开销</w:t>
+              <w:t>42.39%</w:t>
             </w:r>
           </w:p>
         </w:tc>
@@ -609,49 +770,21 @@
       <w:tr>
         <w:tc>
           <w:tcPr>
-            <w:tcW w:type="dxa" w:w="3312"/>
-            <w:vAlign w:val="center"/>
+            <w:tcW w:type="dxa" w:w="4320"/>
           </w:tcPr>
           <w:p>
             <w:r>
-              <w:rPr>
-                <w:rFonts w:ascii="Arial" w:hAnsi="Arial" w:eastAsia="Microsoft YaHei"/>
-                <w:b w:val="0"/>
-                <w:sz w:val="21"/>
-              </w:rPr>
-              <w:t>ode_integration</w:t>
+              <w:t>estimated_train_flops_reduction</w:t>
             </w:r>
           </w:p>
         </w:tc>
         <w:tc>
           <w:tcPr>
-            <w:tcW w:type="dxa" w:w="3312"/>
-            <w:vAlign w:val="center"/>
+            <w:tcW w:type="dxa" w:w="4320"/>
           </w:tcPr>
           <w:p>
             <w:r>
-              <w:rPr>
-                <w:rFonts w:ascii="Arial" w:hAnsi="Arial" w:eastAsia="Microsoft YaHei"/>
-                <w:b w:val="0"/>
-                <w:sz w:val="21"/>
-              </w:rPr>
-              <w:t>flow/diffusion 多步迭代阶段</w:t>
-            </w:r>
-          </w:p>
-        </w:tc>
-        <w:tc>
-          <w:tcPr>
-            <w:tcW w:type="dxa" w:w="3312"/>
-            <w:vAlign w:val="center"/>
-          </w:tcPr>
-          <w:p>
-            <w:r>
-              <w:rPr>
-                <w:rFonts w:ascii="Arial" w:hAnsi="Arial" w:eastAsia="Microsoft YaHei"/>
-                <w:b w:val="0"/>
-                <w:sz w:val="21"/>
-              </w:rPr>
-              <w:t>当前实测最大耗时来源，内部会反复调用 Transformer</w:t>
+              <w:t>10.09%</w:t>
             </w:r>
           </w:p>
         </w:tc>
@@ -659,550 +792,21 @@
       <w:tr>
         <w:tc>
           <w:tcPr>
-            <w:tcW w:type="dxa" w:w="3312"/>
-            <w:vAlign w:val="center"/>
+            <w:tcW w:type="dxa" w:w="4320"/>
           </w:tcPr>
           <w:p>
             <w:r>
-              <w:rPr>
-                <w:rFonts w:ascii="Arial" w:hAnsi="Arial" w:eastAsia="Microsoft YaHei"/>
-                <w:b w:val="0"/>
-                <w:sz w:val="21"/>
-              </w:rPr>
-              <w:t>postprocessing</w:t>
+              <w:t>average total_time</w:t>
             </w:r>
           </w:p>
         </w:tc>
         <w:tc>
           <w:tcPr>
-            <w:tcW w:type="dxa" w:w="3312"/>
-            <w:vAlign w:val="center"/>
+            <w:tcW w:type="dxa" w:w="4320"/>
           </w:tcPr>
           <w:p>
             <w:r>
-              <w:rPr>
-                <w:rFonts w:ascii="Arial" w:hAnsi="Arial" w:eastAsia="Microsoft YaHei"/>
-                <w:b w:val="0"/>
-                <w:sz w:val="21"/>
-              </w:rPr>
-              <w:t>动作反归一化和输出整理</w:t>
-            </w:r>
-          </w:p>
-        </w:tc>
-        <w:tc>
-          <w:tcPr>
-            <w:tcW w:type="dxa" w:w="3312"/>
-            <w:vAlign w:val="center"/>
-          </w:tcPr>
-          <w:p>
-            <w:r>
-              <w:rPr>
-                <w:rFonts w:ascii="Arial" w:hAnsi="Arial" w:eastAsia="Microsoft YaHei"/>
-                <w:b w:val="0"/>
-                <w:sz w:val="21"/>
-              </w:rPr>
-              <w:t>通常很小，作为完整链路的一部分记录</w:t>
-            </w:r>
-          </w:p>
-        </w:tc>
-      </w:tr>
-    </w:tbl>
-    <w:p>
-      <w:pPr>
-        <w:pStyle w:val="Heading1"/>
-      </w:pPr>
-      <w:r>
-        <w:rPr>
-          <w:rFonts w:ascii="Arial" w:hAnsi="Arial" w:eastAsia="Microsoft YaHei"/>
-          <w:b/>
-          <w:sz w:val="28"/>
-        </w:rPr>
-        <w:t>3. 复杂度是什么，为什么要测</w:t>
-      </w:r>
-    </w:p>
-    <w:p>
-      <w:r>
-        <w:rPr>
-          <w:rFonts w:ascii="Arial" w:hAnsi="Arial" w:eastAsia="Microsoft YaHei"/>
-          <w:b w:val="0"/>
-          <w:sz w:val="21"/>
-        </w:rPr>
-        <w:t>复杂度这里主要指 FLOPs（Floating Point Operations，浮点运算次数），通常以 GFLOPs 为单位，即 10^9 次浮点运算。它衡量的是模型一次 forward 理论上需要多少计算。</w:t>
-      </w:r>
-    </w:p>
-    <w:p>
-      <w:r>
-        <w:rPr>
-          <w:rFonts w:ascii="Arial" w:hAnsi="Arial" w:eastAsia="Microsoft YaHei"/>
-          <w:b w:val="0"/>
-          <w:sz w:val="21"/>
-        </w:rPr>
-        <w:t>测 FLOPs 的原因是：VisPruner 会减少视觉 token 数量，而 Transformer attention 的计算量通常随序列长度近似平方增长。视觉 token 从 256 减到 128 时，部分 attention 计算并不是简单减少一半，而可能出现更明显的理论计算下降。</w:t>
-      </w:r>
-    </w:p>
-    <w:p>
-      <w:pPr>
-        <w:pStyle w:val="ListBullet"/>
-      </w:pPr>
-      <w:r>
-        <w:rPr>
-          <w:rFonts w:ascii="Arial" w:hAnsi="Arial" w:eastAsia="Microsoft YaHei"/>
-          <w:b w:val="0"/>
-          <w:sz w:val="21"/>
-        </w:rPr>
-        <w:t>时间测量回答：真实运行有没有变快。</w:t>
-      </w:r>
-    </w:p>
-    <w:p>
-      <w:pPr>
-        <w:pStyle w:val="ListBullet"/>
-      </w:pPr>
-      <w:r>
-        <w:rPr>
-          <w:rFonts w:ascii="Arial" w:hAnsi="Arial" w:eastAsia="Microsoft YaHei"/>
-          <w:b w:val="0"/>
-          <w:sz w:val="21"/>
-        </w:rPr>
-        <w:t>FLOPs 测量回答：理论计算量有没有下降。</w:t>
-      </w:r>
-    </w:p>
-    <w:p>
-      <w:pPr>
-        <w:pStyle w:val="ListBullet"/>
-      </w:pPr>
-      <w:r>
-        <w:rPr>
-          <w:rFonts w:ascii="Arial" w:hAnsi="Arial" w:eastAsia="Microsoft YaHei"/>
-          <w:b w:val="0"/>
-          <w:sz w:val="21"/>
-        </w:rPr>
-        <w:t>两者需要同时看，因为 FLOPs 下降不一定等比例转化为时间下降，实际耗时还受显存访问、CUDA kernel、KV-cache、自定义算子和剪枝模块本身开销影响。</w:t>
-      </w:r>
-    </w:p>
-    <w:p>
-      <w:pPr>
-        <w:pStyle w:val="Heading1"/>
-      </w:pPr>
-      <w:r>
-        <w:rPr>
-          <w:rFonts w:ascii="Arial" w:hAnsi="Arial" w:eastAsia="Microsoft YaHei"/>
-          <w:b/>
-          <w:sz w:val="28"/>
-        </w:rPr>
-        <w:t>4. 本次具体做了什么</w:t>
-      </w:r>
-    </w:p>
-    <w:p>
-      <w:pPr>
-        <w:pStyle w:val="ListNumber"/>
-      </w:pPr>
-      <w:r>
-        <w:rPr>
-          <w:rFonts w:ascii="Arial" w:hAnsi="Arial" w:eastAsia="Microsoft YaHei"/>
-          <w:b w:val="0"/>
-          <w:sz w:val="21"/>
-        </w:rPr>
-        <w:t>在模型文件中加入 _InferencePerfTimer：CUDA 环境使用 torch.cuda.Event 计时，非 CUDA 环境 fallback 到 time.perf_counter。</w:t>
-      </w:r>
-    </w:p>
-    <w:p>
-      <w:pPr>
-        <w:pStyle w:val="ListNumber"/>
-      </w:pPr>
-      <w:r>
-        <w:rPr>
-          <w:rFonts w:ascii="Arial" w:hAnsi="Arial" w:eastAsia="Microsoft YaHei"/>
-          <w:b w:val="0"/>
-          <w:sz w:val="21"/>
-        </w:rPr>
-        <w:t>在 generate_flow_action 动作预测路径中加入 opt-in 计时参数 profile_timing 和 print_timing，默认 False，不影响正常运行。</w:t>
-      </w:r>
-    </w:p>
-    <w:p>
-      <w:pPr>
-        <w:pStyle w:val="ListNumber"/>
-      </w:pPr>
-      <w:r>
-        <w:rPr>
-          <w:rFonts w:ascii="Arial" w:hAnsi="Arial" w:eastAsia="Microsoft YaHei"/>
-          <w:b w:val="0"/>
-          <w:sz w:val="21"/>
-        </w:rPr>
-        <w:t>对视觉塔、prefetch、ODE integration 等关键阶段加入分段计时，并在输出中返回 timing_results_ms 和 timing_results。</w:t>
-      </w:r>
-    </w:p>
-    <w:p>
-      <w:pPr>
-        <w:pStyle w:val="ListNumber"/>
-      </w:pPr>
-      <w:r>
-        <w:rPr>
-          <w:rFonts w:ascii="Arial" w:hAnsi="Arial" w:eastAsia="Microsoft YaHei"/>
-          <w:b w:val="0"/>
-          <w:sz w:val="21"/>
-        </w:rPr>
-        <w:t>加入 profile_flops(...) 方法，显式调用时使用 fvcore.nn.FlopCountAnalysis 尝试统计 GFLOPs。</w:t>
-      </w:r>
-    </w:p>
-    <w:p>
-      <w:pPr>
-        <w:pStyle w:val="ListNumber"/>
-      </w:pPr>
-      <w:r>
-        <w:rPr>
-          <w:rFonts w:ascii="Arial" w:hAnsi="Arial" w:eastAsia="Microsoft YaHei"/>
-          <w:b w:val="0"/>
-          <w:sz w:val="21"/>
-        </w:rPr>
-        <w:t>在 serving/policy/wall_x_policy.py 中加入环境变量开关 WALLX_PROFILE_TIMING。默认不测；启动服务时设置 WALLX_PROFILE_TIMING=1 才打印时间。</w:t>
-      </w:r>
-    </w:p>
-    <w:p>
-      <w:pPr>
-        <w:pStyle w:val="ListNumber"/>
-      </w:pPr>
-      <w:r>
-        <w:rPr>
-          <w:rFonts w:ascii="Arial" w:hAnsi="Arial" w:eastAsia="Microsoft YaHei"/>
-          <w:b w:val="0"/>
-          <w:sz w:val="21"/>
-        </w:rPr>
-        <w:t>在新增/修改位置加入 PERF PROFILING ADDED 注释，方便后续同学定位改动。</w:t>
-      </w:r>
-    </w:p>
-    <w:p>
-      <w:pPr>
-        <w:pStyle w:val="Heading1"/>
-      </w:pPr>
-      <w:r>
-        <w:rPr>
-          <w:rFonts w:ascii="Arial" w:hAnsi="Arial" w:eastAsia="Microsoft YaHei"/>
-          <w:b/>
-          <w:sz w:val="28"/>
-        </w:rPr>
-        <w:t>5. 改动文件和代码位置</w:t>
-      </w:r>
-    </w:p>
-    <w:tbl>
-      <w:tblPr>
-        <w:tblStyle w:val="TableGrid"/>
-        <w:tblW w:type="auto" w:w="0"/>
-        <w:jc w:val="center"/>
-        <w:tblLook w:firstColumn="1" w:firstRow="1" w:lastColumn="0" w:lastRow="0" w:noHBand="0" w:noVBand="1" w:val="04A0"/>
-      </w:tblPr>
-      <w:tblGrid>
-        <w:gridCol w:w="3312"/>
-        <w:gridCol w:w="3312"/>
-        <w:gridCol w:w="3312"/>
-      </w:tblGrid>
-      <w:tr>
-        <w:tc>
-          <w:tcPr>
-            <w:tcW w:type="dxa" w:w="3312"/>
-            <w:shd w:fill="D9EAF7"/>
-            <w:vAlign w:val="center"/>
-          </w:tcPr>
-          <w:p>
-            <w:pPr>
-              <w:jc w:val="center"/>
-            </w:pPr>
-            <w:r>
-              <w:rPr>
-                <w:rFonts w:ascii="Arial" w:hAnsi="Arial" w:eastAsia="Microsoft YaHei"/>
-                <w:b/>
-                <w:sz w:val="21"/>
-              </w:rPr>
-              <w:t>文件</w:t>
-            </w:r>
-          </w:p>
-        </w:tc>
-        <w:tc>
-          <w:tcPr>
-            <w:tcW w:type="dxa" w:w="3312"/>
-            <w:shd w:fill="D9EAF7"/>
-            <w:vAlign w:val="center"/>
-          </w:tcPr>
-          <w:p>
-            <w:pPr>
-              <w:jc w:val="center"/>
-            </w:pPr>
-            <w:r>
-              <w:rPr>
-                <w:rFonts w:ascii="Arial" w:hAnsi="Arial" w:eastAsia="Microsoft YaHei"/>
-                <w:b/>
-                <w:sz w:val="21"/>
-              </w:rPr>
-              <w:t>主要改动</w:t>
-            </w:r>
-          </w:p>
-        </w:tc>
-        <w:tc>
-          <w:tcPr>
-            <w:tcW w:type="dxa" w:w="3312"/>
-            <w:shd w:fill="D9EAF7"/>
-            <w:vAlign w:val="center"/>
-          </w:tcPr>
-          <w:p>
-            <w:pPr>
-              <w:jc w:val="center"/>
-            </w:pPr>
-            <w:r>
-              <w:rPr>
-                <w:rFonts w:ascii="Arial" w:hAnsi="Arial" w:eastAsia="Microsoft YaHei"/>
-                <w:b/>
-                <w:sz w:val="21"/>
-              </w:rPr>
-              <w:t>说明</w:t>
-            </w:r>
-          </w:p>
-        </w:tc>
-      </w:tr>
-      <w:tr>
-        <w:tc>
-          <w:tcPr>
-            <w:tcW w:type="dxa" w:w="3312"/>
-            <w:vAlign w:val="center"/>
-          </w:tcPr>
-          <w:p>
-            <w:r>
-              <w:rPr>
-                <w:rFonts w:ascii="Arial" w:hAnsi="Arial" w:eastAsia="Microsoft YaHei"/>
-                <w:b w:val="0"/>
-                <w:sz w:val="21"/>
-              </w:rPr>
-              <w:t>model/qwen2_5_based/modeling_qwen2_5_vl_act.py</w:t>
-            </w:r>
-          </w:p>
-        </w:tc>
-        <w:tc>
-          <w:tcPr>
-            <w:tcW w:type="dxa" w:w="3312"/>
-            <w:vAlign w:val="center"/>
-          </w:tcPr>
-          <w:p>
-            <w:r>
-              <w:rPr>
-                <w:rFonts w:ascii="Arial" w:hAnsi="Arial" w:eastAsia="Microsoft YaHei"/>
-                <w:b w:val="0"/>
-                <w:sz w:val="21"/>
-              </w:rPr>
-              <w:t>_InferencePerfTimer</w:t>
-            </w:r>
-          </w:p>
-        </w:tc>
-        <w:tc>
-          <w:tcPr>
-            <w:tcW w:type="dxa" w:w="3312"/>
-            <w:vAlign w:val="center"/>
-          </w:tcPr>
-          <w:p>
-            <w:r>
-              <w:rPr>
-                <w:rFonts w:ascii="Arial" w:hAnsi="Arial" w:eastAsia="Microsoft YaHei"/>
-                <w:b w:val="0"/>
-                <w:sz w:val="21"/>
-              </w:rPr>
-              <w:t>新增 GPU 安全计时器，使用 CUDA Event 计时</w:t>
-            </w:r>
-          </w:p>
-        </w:tc>
-      </w:tr>
-      <w:tr>
-        <w:tc>
-          <w:tcPr>
-            <w:tcW w:type="dxa" w:w="3312"/>
-            <w:vAlign w:val="center"/>
-          </w:tcPr>
-          <w:p>
-            <w:r>
-              <w:rPr>
-                <w:rFonts w:ascii="Arial" w:hAnsi="Arial" w:eastAsia="Microsoft YaHei"/>
-                <w:b w:val="0"/>
-                <w:sz w:val="21"/>
-              </w:rPr>
-              <w:t>model/qwen2_5_based/modeling_qwen2_5_vl_act.py</w:t>
-            </w:r>
-          </w:p>
-        </w:tc>
-        <w:tc>
-          <w:tcPr>
-            <w:tcW w:type="dxa" w:w="3312"/>
-            <w:vAlign w:val="center"/>
-          </w:tcPr>
-          <w:p>
-            <w:r>
-              <w:rPr>
-                <w:rFonts w:ascii="Arial" w:hAnsi="Arial" w:eastAsia="Microsoft YaHei"/>
-                <w:b w:val="0"/>
-                <w:sz w:val="21"/>
-              </w:rPr>
-              <w:t>generate_flow_action(..., profile_timing=False, print_timing=False)</w:t>
-            </w:r>
-          </w:p>
-        </w:tc>
-        <w:tc>
-          <w:tcPr>
-            <w:tcW w:type="dxa" w:w="3312"/>
-            <w:vAlign w:val="center"/>
-          </w:tcPr>
-          <w:p>
-            <w:r>
-              <w:rPr>
-                <w:rFonts w:ascii="Arial" w:hAnsi="Arial" w:eastAsia="Microsoft YaHei"/>
-                <w:b w:val="0"/>
-                <w:sz w:val="21"/>
-              </w:rPr>
-              <w:t>在动作预测主路径中加入默认关闭的时间测量开关</w:t>
-            </w:r>
-          </w:p>
-        </w:tc>
-      </w:tr>
-      <w:tr>
-        <w:tc>
-          <w:tcPr>
-            <w:tcW w:type="dxa" w:w="3312"/>
-            <w:vAlign w:val="center"/>
-          </w:tcPr>
-          <w:p>
-            <w:r>
-              <w:rPr>
-                <w:rFonts w:ascii="Arial" w:hAnsi="Arial" w:eastAsia="Microsoft YaHei"/>
-                <w:b w:val="0"/>
-                <w:sz w:val="21"/>
-              </w:rPr>
-              <w:t>model/qwen2_5_based/modeling_qwen2_5_vl_act.py</w:t>
-            </w:r>
-          </w:p>
-        </w:tc>
-        <w:tc>
-          <w:tcPr>
-            <w:tcW w:type="dxa" w:w="3312"/>
-            <w:vAlign w:val="center"/>
-          </w:tcPr>
-          <w:p>
-            <w:r>
-              <w:rPr>
-                <w:rFonts w:ascii="Arial" w:hAnsi="Arial" w:eastAsia="Microsoft YaHei"/>
-                <w:b w:val="0"/>
-                <w:sz w:val="21"/>
-              </w:rPr>
-              <w:t>timing_results_ms / timing_results</w:t>
-            </w:r>
-          </w:p>
-        </w:tc>
-        <w:tc>
-          <w:tcPr>
-            <w:tcW w:type="dxa" w:w="3312"/>
-            <w:vAlign w:val="center"/>
-          </w:tcPr>
-          <w:p>
-            <w:r>
-              <w:rPr>
-                <w:rFonts w:ascii="Arial" w:hAnsi="Arial" w:eastAsia="Microsoft YaHei"/>
-                <w:b w:val="0"/>
-                <w:sz w:val="21"/>
-              </w:rPr>
-              <w:t>输出毫秒和秒两个版本的分段计时结果</w:t>
-            </w:r>
-          </w:p>
-        </w:tc>
-      </w:tr>
-      <w:tr>
-        <w:tc>
-          <w:tcPr>
-            <w:tcW w:type="dxa" w:w="3312"/>
-            <w:vAlign w:val="center"/>
-          </w:tcPr>
-          <w:p>
-            <w:r>
-              <w:rPr>
-                <w:rFonts w:ascii="Arial" w:hAnsi="Arial" w:eastAsia="Microsoft YaHei"/>
-                <w:b w:val="0"/>
-                <w:sz w:val="21"/>
-              </w:rPr>
-              <w:t>model/qwen2_5_based/modeling_qwen2_5_vl_act.py</w:t>
-            </w:r>
-          </w:p>
-        </w:tc>
-        <w:tc>
-          <w:tcPr>
-            <w:tcW w:type="dxa" w:w="3312"/>
-            <w:vAlign w:val="center"/>
-          </w:tcPr>
-          <w:p>
-            <w:r>
-              <w:rPr>
-                <w:rFonts w:ascii="Arial" w:hAnsi="Arial" w:eastAsia="Microsoft YaHei"/>
-                <w:b w:val="0"/>
-                <w:sz w:val="21"/>
-              </w:rPr>
-              <w:t>profile_flops(...)</w:t>
-            </w:r>
-          </w:p>
-        </w:tc>
-        <w:tc>
-          <w:tcPr>
-            <w:tcW w:type="dxa" w:w="3312"/>
-            <w:vAlign w:val="center"/>
-          </w:tcPr>
-          <w:p>
-            <w:r>
-              <w:rPr>
-                <w:rFonts w:ascii="Arial" w:hAnsi="Arial" w:eastAsia="Microsoft YaHei"/>
-                <w:b w:val="0"/>
-                <w:sz w:val="21"/>
-              </w:rPr>
-              <w:t>显式调用时使用 fvcore 尝试统计 FLOPs/GFLOPs</w:t>
-            </w:r>
-          </w:p>
-        </w:tc>
-      </w:tr>
-      <w:tr>
-        <w:tc>
-          <w:tcPr>
-            <w:tcW w:type="dxa" w:w="3312"/>
-            <w:vAlign w:val="center"/>
-          </w:tcPr>
-          <w:p>
-            <w:r>
-              <w:rPr>
-                <w:rFonts w:ascii="Arial" w:hAnsi="Arial" w:eastAsia="Microsoft YaHei"/>
-                <w:b w:val="0"/>
-                <w:sz w:val="21"/>
-              </w:rPr>
-              <w:t>serving/policy/wall_x_policy.py</w:t>
-            </w:r>
-          </w:p>
-        </w:tc>
-        <w:tc>
-          <w:tcPr>
-            <w:tcW w:type="dxa" w:w="3312"/>
-            <w:vAlign w:val="center"/>
-          </w:tcPr>
-          <w:p>
-            <w:r>
-              <w:rPr>
-                <w:rFonts w:ascii="Arial" w:hAnsi="Arial" w:eastAsia="Microsoft YaHei"/>
-                <w:b w:val="0"/>
-                <w:sz w:val="21"/>
-              </w:rPr>
-              <w:t>WALLX_PROFILE_TIMING</w:t>
-            </w:r>
-          </w:p>
-        </w:tc>
-        <w:tc>
-          <w:tcPr>
-            <w:tcW w:type="dxa" w:w="3312"/>
-            <w:vAlign w:val="center"/>
-          </w:tcPr>
-          <w:p>
-            <w:r>
-              <w:rPr>
-                <w:rFonts w:ascii="Arial" w:hAnsi="Arial" w:eastAsia="Microsoft YaHei"/>
-                <w:b w:val="0"/>
-                <w:sz w:val="21"/>
-              </w:rPr>
-              <w:t>通过环境变量控制 serving 推理是否打开计时打印</w:t>
+              <w:t>339.891 ms</w:t>
             </w:r>
           </w:p>
         </w:tc>
@@ -1211,1150 +815,17 @@
     <w:p>
       <w:r>
         <w:rPr>
-          <w:rFonts w:ascii="Arial" w:hAnsi="Arial" w:eastAsia="Microsoft YaHei"/>
-          <w:b w:val="0"/>
-          <w:sz w:val="21"/>
+          <w:b/>
         </w:rPr>
-        <w:t>正常运行不会自动测时间或 FLOPs。只有显式传 profile_timing=True，或 serving 启动时设置 WALLX_PROFILE_TIMING=1，才会启用时间测量。FLOPs 只有手动调用 model.profile_flops(...) 时才会执行。</w:t>
+        <w:t>备注：</w:t>
       </w:r>
-    </w:p>
-    <w:p>
-      <w:pPr>
-        <w:pStyle w:val="Heading1"/>
-      </w:pPr>
       <w:r>
-        <w:rPr>
-          <w:rFonts w:ascii="Arial" w:hAnsi="Arial" w:eastAsia="Microsoft YaHei"/>
-          <w:b/>
-          <w:sz w:val="28"/>
-        </w:rPr>
-        <w:t>6. Git 和 GitHub 提交信息</w:t>
-      </w:r>
-    </w:p>
-    <w:tbl>
-      <w:tblPr>
-        <w:tblStyle w:val="TableGrid"/>
-        <w:tblW w:type="auto" w:w="0"/>
-        <w:jc w:val="center"/>
-        <w:tblLook w:firstColumn="1" w:firstRow="1" w:lastColumn="0" w:lastRow="0" w:noHBand="0" w:noVBand="1" w:val="04A0"/>
-      </w:tblPr>
-      <w:tblGrid>
-        <w:gridCol w:w="4968"/>
-        <w:gridCol w:w="4968"/>
-      </w:tblGrid>
-      <w:tr>
-        <w:tc>
-          <w:tcPr>
-            <w:tcW w:type="dxa" w:w="4968"/>
-            <w:shd w:fill="D9EAF7"/>
-            <w:vAlign w:val="center"/>
-          </w:tcPr>
-          <w:p>
-            <w:pPr>
-              <w:jc w:val="center"/>
-            </w:pPr>
-            <w:r>
-              <w:rPr>
-                <w:rFonts w:ascii="Arial" w:hAnsi="Arial" w:eastAsia="Microsoft YaHei"/>
-                <w:b/>
-                <w:sz w:val="21"/>
-              </w:rPr>
-              <w:t>项目</w:t>
-            </w:r>
-          </w:p>
-        </w:tc>
-        <w:tc>
-          <w:tcPr>
-            <w:tcW w:type="dxa" w:w="4968"/>
-            <w:shd w:fill="D9EAF7"/>
-            <w:vAlign w:val="center"/>
-          </w:tcPr>
-          <w:p>
-            <w:pPr>
-              <w:jc w:val="center"/>
-            </w:pPr>
-            <w:r>
-              <w:rPr>
-                <w:rFonts w:ascii="Arial" w:hAnsi="Arial" w:eastAsia="Microsoft YaHei"/>
-                <w:b/>
-                <w:sz w:val="21"/>
-              </w:rPr>
-              <w:t>内容</w:t>
-            </w:r>
-          </w:p>
-        </w:tc>
-      </w:tr>
-      <w:tr>
-        <w:tc>
-          <w:tcPr>
-            <w:tcW w:type="dxa" w:w="4968"/>
-            <w:vAlign w:val="center"/>
-          </w:tcPr>
-          <w:p>
-            <w:r>
-              <w:rPr>
-                <w:rFonts w:ascii="Arial" w:hAnsi="Arial" w:eastAsia="Microsoft YaHei"/>
-                <w:b w:val="0"/>
-                <w:sz w:val="21"/>
-              </w:rPr>
-              <w:t>GitHub remote</w:t>
-            </w:r>
-          </w:p>
-        </w:tc>
-        <w:tc>
-          <w:tcPr>
-            <w:tcW w:type="dxa" w:w="4968"/>
-            <w:vAlign w:val="center"/>
-          </w:tcPr>
-          <w:p>
-            <w:r>
-              <w:rPr>
-                <w:rFonts w:ascii="Arial" w:hAnsi="Arial" w:eastAsia="Microsoft YaHei"/>
-                <w:b w:val="0"/>
-                <w:sz w:val="21"/>
-              </w:rPr>
-              <w:t>git@github.com:Acton618/wallx.git</w:t>
-            </w:r>
-          </w:p>
-        </w:tc>
-      </w:tr>
-      <w:tr>
-        <w:tc>
-          <w:tcPr>
-            <w:tcW w:type="dxa" w:w="4968"/>
-            <w:vAlign w:val="center"/>
-          </w:tcPr>
-          <w:p>
-            <w:r>
-              <w:rPr>
-                <w:rFonts w:ascii="Arial" w:hAnsi="Arial" w:eastAsia="Microsoft YaHei"/>
-                <w:b w:val="0"/>
-                <w:sz w:val="21"/>
-              </w:rPr>
-              <w:t>分支</w:t>
-            </w:r>
-          </w:p>
-        </w:tc>
-        <w:tc>
-          <w:tcPr>
-            <w:tcW w:type="dxa" w:w="4968"/>
-            <w:vAlign w:val="center"/>
-          </w:tcPr>
-          <w:p>
-            <w:r>
-              <w:rPr>
-                <w:rFonts w:ascii="Arial" w:hAnsi="Arial" w:eastAsia="Microsoft YaHei"/>
-                <w:b w:val="0"/>
-                <w:sz w:val="21"/>
-              </w:rPr>
-              <w:t>main</w:t>
-            </w:r>
-          </w:p>
-        </w:tc>
-      </w:tr>
-      <w:tr>
-        <w:tc>
-          <w:tcPr>
-            <w:tcW w:type="dxa" w:w="4968"/>
-            <w:vAlign w:val="center"/>
-          </w:tcPr>
-          <w:p>
-            <w:r>
-              <w:rPr>
-                <w:rFonts w:ascii="Arial" w:hAnsi="Arial" w:eastAsia="Microsoft YaHei"/>
-                <w:b w:val="0"/>
-                <w:sz w:val="21"/>
-              </w:rPr>
-              <w:t>提交 1</w:t>
-            </w:r>
-          </w:p>
-        </w:tc>
-        <w:tc>
-          <w:tcPr>
-            <w:tcW w:type="dxa" w:w="4968"/>
-            <w:vAlign w:val="center"/>
-          </w:tcPr>
-          <w:p>
-            <w:r>
-              <w:rPr>
-                <w:rFonts w:ascii="Arial" w:hAnsi="Arial" w:eastAsia="Microsoft YaHei"/>
-                <w:b w:val="0"/>
-                <w:sz w:val="21"/>
-              </w:rPr>
-              <w:t>b1479a9 Add inference profiling hooks</w:t>
-            </w:r>
-          </w:p>
-        </w:tc>
-      </w:tr>
-      <w:tr>
-        <w:tc>
-          <w:tcPr>
-            <w:tcW w:type="dxa" w:w="4968"/>
-            <w:vAlign w:val="center"/>
-          </w:tcPr>
-          <w:p>
-            <w:r>
-              <w:rPr>
-                <w:rFonts w:ascii="Arial" w:hAnsi="Arial" w:eastAsia="Microsoft YaHei"/>
-                <w:b w:val="0"/>
-                <w:sz w:val="21"/>
-              </w:rPr>
-              <w:t>提交 2</w:t>
-            </w:r>
-          </w:p>
-        </w:tc>
-        <w:tc>
-          <w:tcPr>
-            <w:tcW w:type="dxa" w:w="4968"/>
-            <w:vAlign w:val="center"/>
-          </w:tcPr>
-          <w:p>
-            <w:r>
-              <w:rPr>
-                <w:rFonts w:ascii="Arial" w:hAnsi="Arial" w:eastAsia="Microsoft YaHei"/>
-                <w:b w:val="0"/>
-                <w:sz w:val="21"/>
-              </w:rPr>
-              <w:t>f44f327 Add timing env toggle for serving</w:t>
-            </w:r>
-          </w:p>
-        </w:tc>
-      </w:tr>
-      <w:tr>
-        <w:tc>
-          <w:tcPr>
-            <w:tcW w:type="dxa" w:w="4968"/>
-            <w:vAlign w:val="center"/>
-          </w:tcPr>
-          <w:p>
-            <w:r>
-              <w:rPr>
-                <w:rFonts w:ascii="Arial" w:hAnsi="Arial" w:eastAsia="Microsoft YaHei"/>
-                <w:b w:val="0"/>
-                <w:sz w:val="21"/>
-              </w:rPr>
-              <w:t>推送状态</w:t>
-            </w:r>
-          </w:p>
-        </w:tc>
-        <w:tc>
-          <w:tcPr>
-            <w:tcW w:type="dxa" w:w="4968"/>
-            <w:vAlign w:val="center"/>
-          </w:tcPr>
-          <w:p>
-            <w:r>
-              <w:rPr>
-                <w:rFonts w:ascii="Arial" w:hAnsi="Arial" w:eastAsia="Microsoft YaHei"/>
-                <w:b w:val="0"/>
-                <w:sz w:val="21"/>
-              </w:rPr>
-              <w:t>已推送到 origin/main</w:t>
-            </w:r>
-          </w:p>
-        </w:tc>
-      </w:tr>
-    </w:tbl>
-    <w:p>
-      <w:pPr>
-        <w:pStyle w:val="Heading1"/>
-      </w:pPr>
-      <w:r>
-        <w:rPr>
-          <w:rFonts w:ascii="Arial" w:hAnsi="Arial" w:eastAsia="Microsoft YaHei"/>
-          <w:b/>
-          <w:sz w:val="28"/>
-        </w:rPr>
-        <w:t>7. 终端测试方式</w:t>
-      </w:r>
-    </w:p>
-    <w:p>
-      <w:r>
-        <w:rPr>
-          <w:rFonts w:ascii="Arial" w:hAnsi="Arial" w:eastAsia="Microsoft YaHei"/>
-          <w:b w:val="0"/>
-          <w:sz w:val="21"/>
-        </w:rPr>
-        <w:t>正式 serving 方式：</w:t>
-      </w:r>
-    </w:p>
-    <w:p>
-      <w:r>
-        <w:rPr>
-          <w:rFonts w:ascii="Arial" w:hAnsi="Arial" w:eastAsia="Microsoft YaHei"/>
-          <w:b w:val="0"/>
-          <w:sz w:val="21"/>
-        </w:rPr>
-        <w:t>WALLX_PROFILE_TIMING=1 python -m wall_x.serving.launch_serving \</w:t>
-        <w:br/>
-        <w:t xml:space="preserve">  --model-config.model-path /path/to/model \</w:t>
-        <w:br/>
-        <w:t xml:space="preserve">  --model-config.action-tokenizer-path /path/to/action_tokenizer \</w:t>
-        <w:br/>
-        <w:t xml:space="preserve">  --model-config.train-config-path /path/to/train_config.yml \</w:t>
-        <w:br/>
-        <w:t xml:space="preserve">  --model-config.predict-mode diffusion \</w:t>
-        <w:br/>
-        <w:t xml:space="preserve">  --model-config.device cuda</w:t>
-      </w:r>
-    </w:p>
-    <w:p>
-      <w:r>
-        <w:rPr>
-          <w:rFonts w:ascii="Arial" w:hAnsi="Arial" w:eastAsia="Microsoft YaHei"/>
-          <w:b w:val="0"/>
-          <w:sz w:val="21"/>
-        </w:rPr>
-        <w:t>本次为避免 train_config 和 serving 依赖问题，使用了临时测试脚本 /tmp/wallx_profile_once.py。该脚本不属于仓库提交内容，仅用于当前机器上快速验证时间节点和 FLOPs 接口。</w:t>
-      </w:r>
-    </w:p>
-    <w:p>
-      <w:r>
-        <w:rPr>
-          <w:rFonts w:ascii="Arial" w:hAnsi="Arial" w:eastAsia="Microsoft YaHei"/>
-          <w:b w:val="0"/>
-          <w:sz w:val="21"/>
-        </w:rPr>
-        <w:t>时间节点测试命令：python /tmp/wallx_profile_once.py</w:t>
-      </w:r>
-    </w:p>
-    <w:p>
-      <w:r>
-        <w:rPr>
-          <w:rFonts w:ascii="Arial" w:hAnsi="Arial" w:eastAsia="Microsoft YaHei"/>
-          <w:b w:val="0"/>
-          <w:sz w:val="21"/>
-        </w:rPr>
-        <w:t>复杂度测试命令：python /tmp/wallx_profile_once.py --flops</w:t>
-      </w:r>
-    </w:p>
-    <w:p>
-      <w:pPr>
-        <w:pStyle w:val="Heading1"/>
-      </w:pPr>
-      <w:r>
-        <w:rPr>
-          <w:rFonts w:ascii="Arial" w:hAnsi="Arial" w:eastAsia="Microsoft YaHei"/>
-          <w:b/>
-          <w:sz w:val="28"/>
-        </w:rPr>
-        <w:t>8. 本次实测结果</w:t>
-      </w:r>
-    </w:p>
-    <w:p>
-      <w:r>
-        <w:rPr>
-          <w:rFonts w:ascii="Arial" w:hAnsi="Arial" w:eastAsia="Microsoft YaHei"/>
-          <w:b w:val="0"/>
-          <w:sz w:val="21"/>
-        </w:rPr>
-        <w:t>测试环境与输入：</w:t>
-      </w:r>
-    </w:p>
-    <w:p>
-      <w:pPr>
-        <w:pStyle w:val="ListBullet"/>
-      </w:pPr>
-      <w:r>
-        <w:rPr>
-          <w:rFonts w:ascii="Arial" w:hAnsi="Arial" w:eastAsia="Microsoft YaHei"/>
-          <w:b w:val="0"/>
-          <w:sz w:val="21"/>
-        </w:rPr>
-        <w:t>模型路径：/root/autodl-tmp/wall_x/pretrained/wall-oss-fast</w:t>
-      </w:r>
-    </w:p>
-    <w:p>
-      <w:pPr>
-        <w:pStyle w:val="ListBullet"/>
-      </w:pPr>
-      <w:r>
-        <w:rPr>
-          <w:rFonts w:ascii="Arial" w:hAnsi="Arial" w:eastAsia="Microsoft YaHei"/>
-          <w:b w:val="0"/>
-          <w:sz w:val="21"/>
-        </w:rPr>
-        <w:t>设备：CUDA GPU</w:t>
-      </w:r>
-    </w:p>
-    <w:p>
-      <w:pPr>
-        <w:pStyle w:val="ListBullet"/>
-      </w:pPr>
-      <w:r>
-        <w:rPr>
-          <w:rFonts w:ascii="Arial" w:hAnsi="Arial" w:eastAsia="Microsoft YaHei"/>
-          <w:b w:val="0"/>
-          <w:sz w:val="21"/>
-        </w:rPr>
-        <w:t>测试脚本：/tmp/wallx_profile_once.py</w:t>
-      </w:r>
-    </w:p>
-    <w:p>
-      <w:pPr>
-        <w:pStyle w:val="ListBullet"/>
-      </w:pPr>
-      <w:r>
-        <w:rPr>
-          <w:rFonts w:ascii="Arial" w:hAnsi="Arial" w:eastAsia="Microsoft YaHei"/>
-          <w:b w:val="0"/>
-          <w:sz w:val="21"/>
-        </w:rPr>
-        <w:t>输入：一张 256x256 零值假图 + 20 维零值 proprioception + prompt="pick up the object"</w:t>
-      </w:r>
-    </w:p>
-    <w:p>
-      <w:pPr>
-        <w:pStyle w:val="ListBullet"/>
-      </w:pPr>
-      <w:r>
-        <w:rPr>
-          <w:rFonts w:ascii="Arial" w:hAnsi="Arial" w:eastAsia="Microsoft YaHei"/>
-          <w:b w:val="0"/>
-          <w:sz w:val="21"/>
-        </w:rPr>
-        <w:t>模式：diffusion / flow action，warmup=2，iters=5</w:t>
-      </w:r>
-    </w:p>
-    <w:tbl>
-      <w:tblPr>
-        <w:tblStyle w:val="TableGrid"/>
-        <w:tblW w:type="auto" w:w="0"/>
-        <w:jc w:val="center"/>
-        <w:tblLook w:firstColumn="1" w:firstRow="1" w:lastColumn="0" w:lastRow="0" w:noHBand="0" w:noVBand="1" w:val="04A0"/>
-      </w:tblPr>
-      <w:tblGrid>
-        <w:gridCol w:w="4968"/>
-        <w:gridCol w:w="4968"/>
-      </w:tblGrid>
-      <w:tr>
-        <w:tc>
-          <w:tcPr>
-            <w:tcW w:type="dxa" w:w="4968"/>
-            <w:shd w:fill="D9EAF7"/>
-            <w:vAlign w:val="center"/>
-          </w:tcPr>
-          <w:p>
-            <w:pPr>
-              <w:jc w:val="center"/>
-            </w:pPr>
-            <w:r>
-              <w:rPr>
-                <w:rFonts w:ascii="Arial" w:hAnsi="Arial" w:eastAsia="Microsoft YaHei"/>
-                <w:b/>
-                <w:sz w:val="21"/>
-              </w:rPr>
-              <w:t>指标</w:t>
-            </w:r>
-          </w:p>
-        </w:tc>
-        <w:tc>
-          <w:tcPr>
-            <w:tcW w:type="dxa" w:w="4968"/>
-            <w:shd w:fill="D9EAF7"/>
-            <w:vAlign w:val="center"/>
-          </w:tcPr>
-          <w:p>
-            <w:pPr>
-              <w:jc w:val="center"/>
-            </w:pPr>
-            <w:r>
-              <w:rPr>
-                <w:rFonts w:ascii="Arial" w:hAnsi="Arial" w:eastAsia="Microsoft YaHei"/>
-                <w:b/>
-                <w:sz w:val="21"/>
-              </w:rPr>
-              <w:t>耗时</w:t>
-            </w:r>
-          </w:p>
-        </w:tc>
-      </w:tr>
-      <w:tr>
-        <w:tc>
-          <w:tcPr>
-            <w:tcW w:type="dxa" w:w="4968"/>
-            <w:vAlign w:val="center"/>
-          </w:tcPr>
-          <w:p>
-            <w:r>
-              <w:rPr>
-                <w:rFonts w:ascii="Arial" w:hAnsi="Arial" w:eastAsia="Microsoft YaHei"/>
-                <w:b w:val="0"/>
-                <w:sz w:val="21"/>
-              </w:rPr>
-              <w:t>vision_image_forward</w:t>
-            </w:r>
-          </w:p>
-        </w:tc>
-        <w:tc>
-          <w:tcPr>
-            <w:tcW w:type="dxa" w:w="4968"/>
-            <w:vAlign w:val="center"/>
-          </w:tcPr>
-          <w:p>
-            <w:r>
-              <w:rPr>
-                <w:rFonts w:ascii="Arial" w:hAnsi="Arial" w:eastAsia="Microsoft YaHei"/>
-                <w:b w:val="0"/>
-                <w:sz w:val="21"/>
-              </w:rPr>
-              <w:t>27.302 ms</w:t>
-            </w:r>
-          </w:p>
-        </w:tc>
-      </w:tr>
-      <w:tr>
-        <w:tc>
-          <w:tcPr>
-            <w:tcW w:type="dxa" w:w="4968"/>
-            <w:vAlign w:val="center"/>
-          </w:tcPr>
-          <w:p>
-            <w:r>
-              <w:rPr>
-                <w:rFonts w:ascii="Arial" w:hAnsi="Arial" w:eastAsia="Microsoft YaHei"/>
-                <w:b w:val="0"/>
-                <w:sz w:val="21"/>
-              </w:rPr>
-              <w:t>embed_processing</w:t>
-            </w:r>
-          </w:p>
-        </w:tc>
-        <w:tc>
-          <w:tcPr>
-            <w:tcW w:type="dxa" w:w="4968"/>
-            <w:vAlign w:val="center"/>
-          </w:tcPr>
-          <w:p>
-            <w:r>
-              <w:rPr>
-                <w:rFonts w:ascii="Arial" w:hAnsi="Arial" w:eastAsia="Microsoft YaHei"/>
-                <w:b w:val="0"/>
-                <w:sz w:val="21"/>
-              </w:rPr>
-              <w:t>27.725 ms</w:t>
-            </w:r>
-          </w:p>
-        </w:tc>
-      </w:tr>
-      <w:tr>
-        <w:tc>
-          <w:tcPr>
-            <w:tcW w:type="dxa" w:w="4968"/>
-            <w:vAlign w:val="center"/>
-          </w:tcPr>
-          <w:p>
-            <w:r>
-              <w:rPr>
-                <w:rFonts w:ascii="Arial" w:hAnsi="Arial" w:eastAsia="Microsoft YaHei"/>
-                <w:b w:val="0"/>
-                <w:sz w:val="21"/>
-              </w:rPr>
-              <w:t>position_encoding</w:t>
-            </w:r>
-          </w:p>
-        </w:tc>
-        <w:tc>
-          <w:tcPr>
-            <w:tcW w:type="dxa" w:w="4968"/>
-            <w:vAlign w:val="center"/>
-          </w:tcPr>
-          <w:p>
-            <w:r>
-              <w:rPr>
-                <w:rFonts w:ascii="Arial" w:hAnsi="Arial" w:eastAsia="Microsoft YaHei"/>
-                <w:b w:val="0"/>
-                <w:sz w:val="21"/>
-              </w:rPr>
-              <w:t>0.648 ms</w:t>
-            </w:r>
-          </w:p>
-        </w:tc>
-      </w:tr>
-      <w:tr>
-        <w:tc>
-          <w:tcPr>
-            <w:tcW w:type="dxa" w:w="4968"/>
-            <w:vAlign w:val="center"/>
-          </w:tcPr>
-          <w:p>
-            <w:r>
-              <w:rPr>
-                <w:rFonts w:ascii="Arial" w:hAnsi="Arial" w:eastAsia="Microsoft YaHei"/>
-                <w:b w:val="0"/>
-                <w:sz w:val="21"/>
-              </w:rPr>
-              <w:t>action_initialization</w:t>
-            </w:r>
-          </w:p>
-        </w:tc>
-        <w:tc>
-          <w:tcPr>
-            <w:tcW w:type="dxa" w:w="4968"/>
-            <w:vAlign w:val="center"/>
-          </w:tcPr>
-          <w:p>
-            <w:r>
-              <w:rPr>
-                <w:rFonts w:ascii="Arial" w:hAnsi="Arial" w:eastAsia="Microsoft YaHei"/>
-                <w:b w:val="0"/>
-                <w:sz w:val="21"/>
-              </w:rPr>
-              <w:t>0.443 ms</w:t>
-            </w:r>
-          </w:p>
-        </w:tc>
-      </w:tr>
-      <w:tr>
-        <w:tc>
-          <w:tcPr>
-            <w:tcW w:type="dxa" w:w="4968"/>
-            <w:vAlign w:val="center"/>
-          </w:tcPr>
-          <w:p>
-            <w:r>
-              <w:rPr>
-                <w:rFonts w:ascii="Arial" w:hAnsi="Arial" w:eastAsia="Microsoft YaHei"/>
-                <w:b w:val="0"/>
-                <w:sz w:val="21"/>
-              </w:rPr>
-              <w:t>prefetch_forward</w:t>
-            </w:r>
-          </w:p>
-        </w:tc>
-        <w:tc>
-          <w:tcPr>
-            <w:tcW w:type="dxa" w:w="4968"/>
-            <w:vAlign w:val="center"/>
-          </w:tcPr>
-          <w:p>
-            <w:r>
-              <w:rPr>
-                <w:rFonts w:ascii="Arial" w:hAnsi="Arial" w:eastAsia="Microsoft YaHei"/>
-                <w:b w:val="0"/>
-                <w:sz w:val="21"/>
-              </w:rPr>
-              <w:t>31.167 ms</w:t>
-            </w:r>
-          </w:p>
-        </w:tc>
-      </w:tr>
-      <w:tr>
-        <w:tc>
-          <w:tcPr>
-            <w:tcW w:type="dxa" w:w="4968"/>
-            <w:vAlign w:val="center"/>
-          </w:tcPr>
-          <w:p>
-            <w:r>
-              <w:rPr>
-                <w:rFonts w:ascii="Arial" w:hAnsi="Arial" w:eastAsia="Microsoft YaHei"/>
-                <w:b w:val="0"/>
-                <w:sz w:val="21"/>
-              </w:rPr>
-              <w:t>cache_preprocessing</w:t>
-            </w:r>
-          </w:p>
-        </w:tc>
-        <w:tc>
-          <w:tcPr>
-            <w:tcW w:type="dxa" w:w="4968"/>
-            <w:vAlign w:val="center"/>
-          </w:tcPr>
-          <w:p>
-            <w:r>
-              <w:rPr>
-                <w:rFonts w:ascii="Arial" w:hAnsi="Arial" w:eastAsia="Microsoft YaHei"/>
-                <w:b w:val="0"/>
-                <w:sz w:val="21"/>
-              </w:rPr>
-              <w:t>1.224 ms</w:t>
-            </w:r>
-          </w:p>
-        </w:tc>
-      </w:tr>
-      <w:tr>
-        <w:tc>
-          <w:tcPr>
-            <w:tcW w:type="dxa" w:w="4968"/>
-            <w:vAlign w:val="center"/>
-          </w:tcPr>
-          <w:p>
-            <w:r>
-              <w:rPr>
-                <w:rFonts w:ascii="Arial" w:hAnsi="Arial" w:eastAsia="Microsoft YaHei"/>
-                <w:b w:val="0"/>
-                <w:sz w:val="21"/>
-              </w:rPr>
-              <w:t>ode_integration</w:t>
-            </w:r>
-          </w:p>
-        </w:tc>
-        <w:tc>
-          <w:tcPr>
-            <w:tcW w:type="dxa" w:w="4968"/>
-            <w:vAlign w:val="center"/>
-          </w:tcPr>
-          <w:p>
-            <w:r>
-              <w:rPr>
-                <w:rFonts w:ascii="Arial" w:hAnsi="Arial" w:eastAsia="Microsoft YaHei"/>
-                <w:b w:val="0"/>
-                <w:sz w:val="21"/>
-              </w:rPr>
-              <w:t>300.177 ms</w:t>
-            </w:r>
-          </w:p>
-        </w:tc>
-      </w:tr>
-      <w:tr>
-        <w:tc>
-          <w:tcPr>
-            <w:tcW w:type="dxa" w:w="4968"/>
-            <w:vAlign w:val="center"/>
-          </w:tcPr>
-          <w:p>
-            <w:r>
-              <w:rPr>
-                <w:rFonts w:ascii="Arial" w:hAnsi="Arial" w:eastAsia="Microsoft YaHei"/>
-                <w:b w:val="0"/>
-                <w:sz w:val="21"/>
-              </w:rPr>
-              <w:t>postprocessing</w:t>
-            </w:r>
-          </w:p>
-        </w:tc>
-        <w:tc>
-          <w:tcPr>
-            <w:tcW w:type="dxa" w:w="4968"/>
-            <w:vAlign w:val="center"/>
-          </w:tcPr>
-          <w:p>
-            <w:r>
-              <w:rPr>
-                <w:rFonts w:ascii="Arial" w:hAnsi="Arial" w:eastAsia="Microsoft YaHei"/>
-                <w:b w:val="0"/>
-                <w:sz w:val="21"/>
-              </w:rPr>
-              <w:t>0.010 ms</w:t>
-            </w:r>
-          </w:p>
-        </w:tc>
-      </w:tr>
-      <w:tr>
-        <w:tc>
-          <w:tcPr>
-            <w:tcW w:type="dxa" w:w="4968"/>
-            <w:vAlign w:val="center"/>
-          </w:tcPr>
-          <w:p>
-            <w:r>
-              <w:rPr>
-                <w:rFonts w:ascii="Arial" w:hAnsi="Arial" w:eastAsia="Microsoft YaHei"/>
-                <w:b w:val="0"/>
-                <w:sz w:val="21"/>
-              </w:rPr>
-              <w:t>total_time（最后一次）</w:t>
-            </w:r>
-          </w:p>
-        </w:tc>
-        <w:tc>
-          <w:tcPr>
-            <w:tcW w:type="dxa" w:w="4968"/>
-            <w:vAlign w:val="center"/>
-          </w:tcPr>
-          <w:p>
-            <w:r>
-              <w:rPr>
-                <w:rFonts w:ascii="Arial" w:hAnsi="Arial" w:eastAsia="Microsoft YaHei"/>
-                <w:b w:val="0"/>
-                <w:sz w:val="21"/>
-              </w:rPr>
-              <w:t>361.608 ms</w:t>
-            </w:r>
-          </w:p>
-        </w:tc>
-      </w:tr>
-      <w:tr>
-        <w:tc>
-          <w:tcPr>
-            <w:tcW w:type="dxa" w:w="4968"/>
-            <w:vAlign w:val="center"/>
-          </w:tcPr>
-          <w:p>
-            <w:r>
-              <w:rPr>
-                <w:rFonts w:ascii="Arial" w:hAnsi="Arial" w:eastAsia="Microsoft YaHei"/>
-                <w:b w:val="0"/>
-                <w:sz w:val="21"/>
-              </w:rPr>
-              <w:t>Average total_time over 5 runs</w:t>
-            </w:r>
-          </w:p>
-        </w:tc>
-        <w:tc>
-          <w:tcPr>
-            <w:tcW w:type="dxa" w:w="4968"/>
-            <w:vAlign w:val="center"/>
-          </w:tcPr>
-          <w:p>
-            <w:r>
-              <w:rPr>
-                <w:rFonts w:ascii="Arial" w:hAnsi="Arial" w:eastAsia="Microsoft YaHei"/>
-                <w:b w:val="0"/>
-                <w:sz w:val="21"/>
-              </w:rPr>
-              <w:t>345.852 ms</w:t>
-            </w:r>
-          </w:p>
-        </w:tc>
-      </w:tr>
-    </w:tbl>
-    <w:p>
-      <w:r>
-        <w:rPr>
-          <w:rFonts w:ascii="Arial" w:hAnsi="Arial" w:eastAsia="Microsoft YaHei"/>
-          <w:b w:val="0"/>
-          <w:sz w:val="21"/>
-        </w:rPr>
-        <w:t>FLOPs 测试结果：</w:t>
-      </w:r>
-    </w:p>
-    <w:tbl>
-      <w:tblPr>
-        <w:tblStyle w:val="TableGrid"/>
-        <w:tblW w:type="auto" w:w="0"/>
-        <w:jc w:val="center"/>
-        <w:tblLook w:firstColumn="1" w:firstRow="1" w:lastColumn="0" w:lastRow="0" w:noHBand="0" w:noVBand="1" w:val="04A0"/>
-      </w:tblPr>
-      <w:tblGrid>
-        <w:gridCol w:w="4968"/>
-        <w:gridCol w:w="4968"/>
-      </w:tblGrid>
-      <w:tr>
-        <w:tc>
-          <w:tcPr>
-            <w:tcW w:type="dxa" w:w="4968"/>
-            <w:shd w:fill="D9EAF7"/>
-            <w:vAlign w:val="center"/>
-          </w:tcPr>
-          <w:p>
-            <w:pPr>
-              <w:jc w:val="center"/>
-            </w:pPr>
-            <w:r>
-              <w:rPr>
-                <w:rFonts w:ascii="Arial" w:hAnsi="Arial" w:eastAsia="Microsoft YaHei"/>
-                <w:b/>
-                <w:sz w:val="21"/>
-              </w:rPr>
-              <w:t>项目</w:t>
-            </w:r>
-          </w:p>
-        </w:tc>
-        <w:tc>
-          <w:tcPr>
-            <w:tcW w:type="dxa" w:w="4968"/>
-            <w:shd w:fill="D9EAF7"/>
-            <w:vAlign w:val="center"/>
-          </w:tcPr>
-          <w:p>
-            <w:pPr>
-              <w:jc w:val="center"/>
-            </w:pPr>
-            <w:r>
-              <w:rPr>
-                <w:rFonts w:ascii="Arial" w:hAnsi="Arial" w:eastAsia="Microsoft YaHei"/>
-                <w:b/>
-                <w:sz w:val="21"/>
-              </w:rPr>
-              <w:t>结果</w:t>
-            </w:r>
-          </w:p>
-        </w:tc>
-      </w:tr>
-      <w:tr>
-        <w:tc>
-          <w:tcPr>
-            <w:tcW w:type="dxa" w:w="4968"/>
-            <w:vAlign w:val="center"/>
-          </w:tcPr>
-          <w:p>
-            <w:r>
-              <w:rPr>
-                <w:rFonts w:ascii="Arial" w:hAnsi="Arial" w:eastAsia="Microsoft YaHei"/>
-                <w:b w:val="0"/>
-                <w:sz w:val="21"/>
-              </w:rPr>
-              <w:t>fvcore 安装前</w:t>
-            </w:r>
-          </w:p>
-        </w:tc>
-        <w:tc>
-          <w:tcPr>
-            <w:tcW w:type="dxa" w:w="4968"/>
-            <w:vAlign w:val="center"/>
-          </w:tcPr>
-          <w:p>
-            <w:r>
-              <w:rPr>
-                <w:rFonts w:ascii="Arial" w:hAnsi="Arial" w:eastAsia="Microsoft YaHei"/>
-                <w:b w:val="0"/>
-                <w:sz w:val="21"/>
-              </w:rPr>
-              <w:t>失败：No module named 'fvcore'</w:t>
-            </w:r>
-          </w:p>
-        </w:tc>
-      </w:tr>
-      <w:tr>
-        <w:tc>
-          <w:tcPr>
-            <w:tcW w:type="dxa" w:w="4968"/>
-            <w:vAlign w:val="center"/>
-          </w:tcPr>
-          <w:p>
-            <w:r>
-              <w:rPr>
-                <w:rFonts w:ascii="Arial" w:hAnsi="Arial" w:eastAsia="Microsoft YaHei"/>
-                <w:b w:val="0"/>
-                <w:sz w:val="21"/>
-              </w:rPr>
-              <w:t>安装 fvcore 后</w:t>
-            </w:r>
-          </w:p>
-        </w:tc>
-        <w:tc>
-          <w:tcPr>
-            <w:tcW w:type="dxa" w:w="4968"/>
-            <w:vAlign w:val="center"/>
-          </w:tcPr>
-          <w:p>
-            <w:r>
-              <w:rPr>
-                <w:rFonts w:ascii="Arial" w:hAnsi="Arial" w:eastAsia="Microsoft YaHei"/>
-                <w:b w:val="0"/>
-                <w:sz w:val="21"/>
-              </w:rPr>
-              <w:t>完整 diffusion 路径仍失败：FLOPs calculation failed: 'NoneType' object has no attribute 'layers'</w:t>
-            </w:r>
-          </w:p>
-        </w:tc>
-      </w:tr>
-      <w:tr>
-        <w:tc>
-          <w:tcPr>
-            <w:tcW w:type="dxa" w:w="4968"/>
-            <w:vAlign w:val="center"/>
-          </w:tcPr>
-          <w:p>
-            <w:r>
-              <w:rPr>
-                <w:rFonts w:ascii="Arial" w:hAnsi="Arial" w:eastAsia="Microsoft YaHei"/>
-                <w:b w:val="0"/>
-                <w:sz w:val="21"/>
-              </w:rPr>
-              <w:t>当前 flops/gflops 输出</w:t>
-            </w:r>
-          </w:p>
-        </w:tc>
-        <w:tc>
-          <w:tcPr>
-            <w:tcW w:type="dxa" w:w="4968"/>
-            <w:vAlign w:val="center"/>
-          </w:tcPr>
-          <w:p>
-            <w:r>
-              <w:rPr>
-                <w:rFonts w:ascii="Arial" w:hAnsi="Arial" w:eastAsia="Microsoft YaHei"/>
-                <w:b w:val="0"/>
-                <w:sz w:val="21"/>
-              </w:rPr>
-              <w:t>None / None</w:t>
-            </w:r>
-          </w:p>
-        </w:tc>
-      </w:tr>
-    </w:tbl>
-    <w:p>
-      <w:pPr>
-        <w:pStyle w:val="Heading1"/>
-      </w:pPr>
-      <w:r>
-        <w:rPr>
-          <w:rFonts w:ascii="Arial" w:hAnsi="Arial" w:eastAsia="Microsoft YaHei"/>
-          <w:b/>
-          <w:sz w:val="28"/>
-        </w:rPr>
-        <w:t>9. 对结果的分析</w:t>
-      </w:r>
-    </w:p>
-    <w:p>
-      <w:pPr>
-        <w:pStyle w:val="ListBullet"/>
-      </w:pPr>
-      <w:r>
-        <w:rPr>
-          <w:rFonts w:ascii="Arial" w:hAnsi="Arial" w:eastAsia="Microsoft YaHei"/>
-          <w:b w:val="0"/>
-          <w:sz w:val="21"/>
-        </w:rPr>
-        <w:t>时间节点测量已经跑通，说明 CUDA Event 计时链路有效，可以用于后续剪枝前后对比。</w:t>
-      </w:r>
-    </w:p>
-    <w:p>
-      <w:pPr>
-        <w:pStyle w:val="ListBullet"/>
-      </w:pPr>
-      <w:r>
-        <w:rPr>
-          <w:rFonts w:ascii="Arial" w:hAnsi="Arial" w:eastAsia="Microsoft YaHei"/>
-          <w:b w:val="0"/>
-          <w:sz w:val="21"/>
-        </w:rPr>
-        <w:t>当前 5 次平均 total_time 约 345.852 ms，主要耗时来自 ode_integration（最后一次约 300.177 ms），这说明 flow/diffusion 多步迭代是当前动作预测路径的主要瓶颈。</w:t>
-      </w:r>
-    </w:p>
-    <w:p>
-      <w:pPr>
-        <w:pStyle w:val="ListBullet"/>
-      </w:pPr>
-      <w:r>
-        <w:rPr>
-          <w:rFonts w:ascii="Arial" w:hAnsi="Arial" w:eastAsia="Microsoft YaHei"/>
-          <w:b w:val="0"/>
-          <w:sz w:val="21"/>
-        </w:rPr>
-        <w:t>vision_image_forward 约 27.302 ms，prefetch_forward 约 31.167 ms。这两个阶段与视觉 token 数量和 Transformer prefill 关系更直接，是 VisPruner 后续评估时需要重点观察的指标。</w:t>
-      </w:r>
-    </w:p>
-    <w:p>
-      <w:pPr>
-        <w:pStyle w:val="ListBullet"/>
-      </w:pPr>
-      <w:r>
-        <w:rPr>
-          <w:rFonts w:ascii="Arial" w:hAnsi="Arial" w:eastAsia="Microsoft YaHei"/>
-          <w:b w:val="0"/>
-          <w:sz w:val="21"/>
-        </w:rPr>
-        <w:t>完整模型 FLOPs 没有直接统计成功，原因不是时间测量失败，而是 fvcore 对该复杂推理路径支持有限。当前路径包含 KV-cache、custom ops、MoE/action head、ODE 多步调用等，tracing 时在 prefix_kv_cache.layers 处遇到 NoneType。</w:t>
-      </w:r>
-    </w:p>
-    <w:p>
-      <w:pPr>
-        <w:pStyle w:val="ListBullet"/>
-      </w:pPr>
-      <w:r>
-        <w:rPr>
-          <w:rFonts w:ascii="Arial" w:hAnsi="Arial" w:eastAsia="Microsoft YaHei"/>
-          <w:b w:val="0"/>
-          <w:sz w:val="21"/>
-        </w:rPr>
-        <w:t>这说明完整 diffusion 推理路径不适合直接用 fvcore 一次性统计。后续建议拆分为 visual encoder、prefetch transformer、postfix transformer 等子模块统计，或者使用理论公式估算 attention/MLP FLOPs。</w:t>
-      </w:r>
-    </w:p>
-    <w:p>
-      <w:pPr>
-        <w:pStyle w:val="Heading1"/>
-      </w:pPr>
-      <w:r>
-        <w:rPr>
-          <w:rFonts w:ascii="Arial" w:hAnsi="Arial" w:eastAsia="Microsoft YaHei"/>
-          <w:b/>
-          <w:sz w:val="28"/>
-        </w:rPr>
-        <w:t>10. 后续建议</w:t>
-      </w:r>
-    </w:p>
-    <w:p>
-      <w:pPr>
-        <w:pStyle w:val="ListNumber"/>
-      </w:pPr>
-      <w:r>
-        <w:rPr>
-          <w:rFonts w:ascii="Arial" w:hAnsi="Arial" w:eastAsia="Microsoft YaHei"/>
-          <w:b w:val="0"/>
-          <w:sz w:val="21"/>
-        </w:rPr>
-        <w:t>将 VisPruner 接入后，用完全相同的输入、warmup 和 iters，再跑一次时间节点，重点比较 total_time、vision_image_forward、prefetch_forward、ode_integration。</w:t>
-      </w:r>
-    </w:p>
-    <w:p>
-      <w:pPr>
-        <w:pStyle w:val="ListNumber"/>
-      </w:pPr>
-      <w:r>
-        <w:rPr>
-          <w:rFonts w:ascii="Arial" w:hAnsi="Arial" w:eastAsia="Microsoft YaHei"/>
-          <w:b w:val="0"/>
-          <w:sz w:val="21"/>
-        </w:rPr>
-        <w:t>正式报告建议使用更多迭代次数，例如 warmup=10、iters=100，取平均值和标准差。</w:t>
-      </w:r>
-    </w:p>
-    <w:p>
-      <w:pPr>
-        <w:pStyle w:val="ListNumber"/>
-      </w:pPr>
-      <w:r>
-        <w:rPr>
-          <w:rFonts w:ascii="Arial" w:hAnsi="Arial" w:eastAsia="Microsoft YaHei"/>
-          <w:b w:val="0"/>
-          <w:sz w:val="21"/>
-        </w:rPr>
-        <w:t>FLOPs 建议不要直接统计完整 generate_flow_action，而是分模块统计或公式估算。视觉 token 剪枝重点关注 Transformer attention 中与序列长度平方相关的部分。</w:t>
-      </w:r>
-    </w:p>
-    <w:p>
-      <w:pPr>
-        <w:pStyle w:val="ListNumber"/>
-      </w:pPr>
-      <w:r>
-        <w:rPr>
-          <w:rFonts w:ascii="Arial" w:hAnsi="Arial" w:eastAsia="Microsoft YaHei"/>
-          <w:b w:val="0"/>
-          <w:sz w:val="21"/>
-        </w:rPr>
-        <w:t>如果需要服务端实测，使用 WALLX_PROFILE_TIMING=1 启动 serving；正常部署时不设置该环境变量，性能测量默认关闭。</w:t>
-      </w:r>
-    </w:p>
-    <w:p>
-      <w:pPr>
-        <w:pStyle w:val="Heading1"/>
-      </w:pPr>
-      <w:r>
-        <w:rPr>
-          <w:rFonts w:ascii="Arial" w:hAnsi="Arial" w:eastAsia="Microsoft YaHei"/>
-          <w:b/>
-          <w:sz w:val="28"/>
-        </w:rPr>
-        <w:t>11. 当前结论</w:t>
-      </w:r>
-    </w:p>
-    <w:p>
-      <w:r>
-        <w:rPr>
-          <w:rFonts w:ascii="Arial" w:hAnsi="Arial" w:eastAsia="Microsoft YaHei"/>
-          <w:b w:val="0"/>
-          <w:sz w:val="21"/>
-        </w:rPr>
-        <w:t>本次第 ⑤ 点已经完成“如何添加时间节点和复杂度测量”的代码落地和初步验证。时间节点测量已成功产出可用数据；复杂度接口已经接入 fvcore，但完整 diffusion 推理路径由于 KV-cache/custom ops 等原因未能直接统计，需要后续采用分模块统计或理论公式估算。</w:t>
-      </w:r>
-    </w:p>
-    <w:p>
-      <w:r>
-        <w:rPr>
-          <w:rFonts w:ascii="Arial" w:hAnsi="Arial" w:eastAsia="Microsoft YaHei"/>
-          <w:b w:val="0"/>
-          <w:sz w:val="21"/>
-        </w:rPr>
-        <w:t>这套改动默认不影响正常训练和推理。只有显式打开 profile_timing 或设置 WALLX_PROFILE_TIMING=1 时才会进行时间测量；只有手动调用 profile_flops(...) 时才会尝试 FLOPs 分析。</w:t>
+        <w:t>本报告采用的复杂度统计是基于 token 长度的理论估算，时间统计来自 CUDA Event 的实际推理计时。</w:t>
       </w:r>
     </w:p>
     <w:sectPr>
       <w:pgSz w:w="12240" w:h="15840"/>
-      <w:pgMar w:top="1008" w:right="1152" w:bottom="1008" w:left="1152" w:header="720" w:footer="720" w:gutter="0"/>
+      <w:pgMar w:top="1440" w:right="1800" w:bottom="1440" w:left="1800" w:header="720" w:footer="720" w:gutter="0"/>
       <w:cols w:space="720"/>
       <w:docGrid w:linePitch="360"/>
     </w:sectPr>

</xml_diff>

<commit_message>
Improve profiling handoff report
</commit_message>
<xml_diff>
--- a/wall_x/wallx_time_flops_handoff_report.docx
+++ b/wall_x/wallx_time_flops_handoff_report.docx
@@ -4,11 +4,13 @@
   <w:body>
     <w:p>
       <w:pPr>
+        <w:spacing w:line="360" w:lineRule="auto"/>
+        <w:ind w:firstLine="0"/>
         <w:jc w:val="center"/>
       </w:pPr>
       <w:r>
         <w:rPr>
-          <w:rFonts w:ascii="Arial" w:hAnsi="Arial" w:eastAsia="Microsoft YaHei"/>
+          <w:rFonts w:ascii="Times New Roman" w:hAnsi="Times New Roman" w:eastAsia="SimSun"/>
           <w:b/>
           <w:sz w:val="32"/>
         </w:rPr>
@@ -17,545 +19,274 @@
     </w:p>
     <w:p>
       <w:pPr>
+        <w:spacing w:line="360" w:lineRule="auto"/>
+        <w:ind w:firstLine="0"/>
         <w:jc w:val="center"/>
       </w:pPr>
       <w:r>
         <w:rPr>
-          <w:rFonts w:ascii="Arial" w:hAnsi="Arial" w:eastAsia="Microsoft YaHei"/>
+          <w:rFonts w:ascii="Times New Roman" w:hAnsi="Times New Roman" w:eastAsia="SimSun"/>
+          <w:b/>
           <w:sz w:val="22"/>
         </w:rPr>
         <w:t>面向机器人的轻量化 VLA 算法与高效部署研究</w:t>
       </w:r>
     </w:p>
     <w:p>
+      <w:pPr>
+        <w:spacing w:line="360" w:lineRule="auto" w:before="0" w:after="120"/>
+        <w:ind w:firstLine="420"/>
+      </w:pPr>
       <w:r>
         <w:rPr>
-          <w:b/>
+          <w:rFonts w:ascii="Times New Roman" w:hAnsi="Times New Roman" w:eastAsia="SimSun"/>
+          <w:b w:val="0"/>
+          <w:sz w:val="21"/>
         </w:rPr>
-        <w:t>生成日期：</w:t>
-      </w:r>
-      <w:r>
-        <w:t>2026-05-23</w:t>
-      </w:r>
-      <w:r>
-        <w:t xml:space="preserve">    </w:t>
-      </w:r>
-      <w:r>
-        <w:rPr>
-          <w:b/>
-        </w:rPr>
-        <w:t>对象：</w:t>
-      </w:r>
-      <w:r>
-        <w:t>vispruner 移植后的 wall_x 动作预测模型</w:t>
-      </w:r>
-      <w:r>
-        <w:t xml:space="preserve">    </w:t>
-      </w:r>
-      <w:r>
-        <w:rPr>
-          <w:b/>
-        </w:rPr>
-        <w:t>状态：</w:t>
-      </w:r>
-      <w:r>
-        <w:t>已完成时间统计与复杂度统计的可复现实验</w:t>
-      </w:r>
-    </w:p>
-    <w:p>
-      <w:r>
-        <w:rPr>
-          <w:rFonts w:ascii="Arial" w:hAnsi="Arial" w:eastAsia="Microsoft YaHei"/>
-          <w:b/>
-          <w:sz w:val="24"/>
-        </w:rPr>
-        <w:t>1. 任务目标</w:t>
+        <w:t>生成日期：2026 年 5 月 23 日。对象：vispruner 移植后的 wall_x 视觉语言动作预测模型。文档目的：说明为什么要统计时间节点和复杂度、当前采用了什么方案、如何运行验证、已经得到什么结果，以及这些结果应该如何解读。</w:t>
       </w:r>
     </w:p>
     <w:p>
       <w:pPr>
-        <w:pStyle w:val="ListBullet"/>
+        <w:spacing w:line="360" w:lineRule="auto" w:before="0" w:after="120"/>
+        <w:ind w:firstLine="0"/>
       </w:pPr>
       <w:r>
         <w:rPr>
-          <w:rFonts w:ascii="Arial" w:hAnsi="Arial" w:eastAsia="Microsoft YaHei"/>
+          <w:rFonts w:ascii="Times New Roman" w:hAnsi="Times New Roman" w:eastAsia="SimSun"/>
+          <w:b/>
+          <w:sz w:val="24"/>
         </w:rPr>
-        <w:t>确认如何在模型中添加时间节点，用于统计完整推理链路的真实耗时。</w:t>
+        <w:t>一、先说明我们在做什么</w:t>
       </w:r>
     </w:p>
     <w:p>
       <w:pPr>
-        <w:pStyle w:val="ListBullet"/>
+        <w:spacing w:line="360" w:lineRule="auto" w:before="0" w:after="120"/>
+        <w:ind w:firstLine="420"/>
       </w:pPr>
       <w:r>
         <w:rPr>
-          <w:rFonts w:ascii="Arial" w:hAnsi="Arial" w:eastAsia="Microsoft YaHei"/>
+          <w:rFonts w:ascii="Times New Roman" w:hAnsi="Times New Roman" w:eastAsia="SimSun"/>
+          <w:b w:val="0"/>
+          <w:sz w:val="21"/>
         </w:rPr>
-        <w:t>确认如何统计 vispruner 剪枝前后复杂度变化，用于量化理论计算量下降。</w:t>
+        <w:t>本项目研究的是面向机器人的 VLA（Vision-Language-Action）模型。简单理解，模型输入图像、语言指令和机器人状态，输出机器人下一段动作。vispruner 的作用是减少进入后续 Transformer 的视觉 token 数量，也就是把图像信息压缩成更少的视觉 token，从而希望减少计算量并提升推理速度。</w:t>
       </w:r>
     </w:p>
     <w:p>
       <w:pPr>
-        <w:pStyle w:val="ListBullet"/>
+        <w:spacing w:line="360" w:lineRule="auto" w:before="0" w:after="120"/>
+        <w:ind w:firstLine="420"/>
       </w:pPr>
       <w:r>
         <w:rPr>
-          <w:rFonts w:ascii="Arial" w:hAnsi="Arial" w:eastAsia="Microsoft YaHei"/>
+          <w:rFonts w:ascii="Times New Roman" w:hAnsi="Times New Roman" w:eastAsia="SimSun"/>
+          <w:b w:val="0"/>
+          <w:sz w:val="21"/>
         </w:rPr>
-        <w:t>避免把完整动作预测链路强行交给 fvcore tracing，改用更稳定的 token 级估算方案。</w:t>
-      </w:r>
-    </w:p>
-    <w:p>
-      <w:r>
-        <w:rPr>
-          <w:rFonts w:ascii="Arial" w:hAnsi="Arial" w:eastAsia="Microsoft YaHei"/>
-          <w:b/>
-          <w:sz w:val="24"/>
-        </w:rPr>
-        <w:t>2. 为什么要测</w:t>
+        <w:t>因此当前任务不是重新训练模型，也不是改变模型输出逻辑，而是在现有推理流程中增加两类观测指标：第一类是实际推理时间，用来回答“模型真的跑得更快了吗”；第二类是理论复杂度，用来回答“视觉 token 减少后，理论计算量是否下降，以及下降多少”。</w:t>
       </w:r>
     </w:p>
     <w:p>
       <w:pPr>
-        <w:pStyle w:val="ListBullet"/>
+        <w:spacing w:line="360" w:lineRule="auto" w:before="0" w:after="120"/>
+        <w:ind w:firstLine="420"/>
       </w:pPr>
       <w:r>
         <w:rPr>
-          <w:rFonts w:ascii="Arial" w:hAnsi="Arial" w:eastAsia="Microsoft YaHei"/>
+          <w:rFonts w:ascii="Times New Roman" w:hAnsi="Times New Roman" w:eastAsia="SimSun"/>
+          <w:b w:val="0"/>
+          <w:sz w:val="21"/>
         </w:rPr>
-        <w:t>时间节点回答的是“实际有没有变快”，依赖 CUDA Event 的真实推理计时。</w:t>
+        <w:t>这两类指标需要同时存在。时间统计来自真实程序运行，受 GPU、显存、算子实现和 ODE integration 等因素影响；复杂度统计来自公式估算，重点反映剪枝前后 token 数变化带来的理论收益。</w:t>
       </w:r>
     </w:p>
     <w:p>
       <w:pPr>
-        <w:pStyle w:val="ListBullet"/>
+        <w:spacing w:line="360" w:lineRule="auto" w:before="0" w:after="120"/>
+        <w:ind w:firstLine="0"/>
       </w:pPr>
       <w:r>
         <w:rPr>
-          <w:rFonts w:ascii="Arial" w:hAnsi="Arial" w:eastAsia="Microsoft YaHei"/>
+          <w:rFonts w:ascii="Times New Roman" w:hAnsi="Times New Roman" w:eastAsia="SimSun"/>
+          <w:b/>
+          <w:sz w:val="24"/>
         </w:rPr>
-        <w:t>复杂度回答的是“理论上有没有变轻”，重点是视觉 token 减少后 attention 计算是否下降。</w:t>
+        <w:t>二、为什么不能只看运行时间</w:t>
       </w:r>
     </w:p>
     <w:p>
       <w:pPr>
-        <w:pStyle w:val="ListBullet"/>
+        <w:spacing w:line="360" w:lineRule="auto" w:before="0" w:after="120"/>
+        <w:ind w:firstLine="420"/>
       </w:pPr>
       <w:r>
         <w:rPr>
-          <w:rFonts w:ascii="Arial" w:hAnsi="Arial" w:eastAsia="Microsoft YaHei"/>
+          <w:rFonts w:ascii="Times New Roman" w:hAnsi="Times New Roman" w:eastAsia="SimSun"/>
+          <w:b w:val="0"/>
+          <w:sz w:val="21"/>
         </w:rPr>
-        <w:t>两者是互补关系：时间看工程效果，复杂度看算法代价。</w:t>
-      </w:r>
-    </w:p>
-    <w:p>
-      <w:r>
-        <w:rPr>
-          <w:rFonts w:ascii="Arial" w:hAnsi="Arial" w:eastAsia="Microsoft YaHei"/>
-          <w:b/>
-          <w:sz w:val="24"/>
-        </w:rPr>
-        <w:t>3. 最终方案</w:t>
+        <w:t>只看运行时间会有一个问题：GPU 推理速度受到很多工程因素影响，例如 CUDA kernel 调度、显存带宽、cache、batch 大小、自定义算子、ODE 多步循环等。即使视觉 token 明显减少，最终耗时也未必按同样比例下降。</w:t>
       </w:r>
     </w:p>
     <w:p>
       <w:pPr>
-        <w:pStyle w:val="ListBullet"/>
+        <w:spacing w:line="360" w:lineRule="auto" w:before="0" w:after="120"/>
+        <w:ind w:firstLine="420"/>
       </w:pPr>
       <w:r>
         <w:rPr>
-          <w:rFonts w:ascii="Arial" w:hAnsi="Arial" w:eastAsia="Microsoft YaHei"/>
+          <w:rFonts w:ascii="Times New Roman" w:hAnsi="Times New Roman" w:eastAsia="SimSun"/>
+          <w:b w:val="0"/>
+          <w:sz w:val="21"/>
         </w:rPr>
-        <w:t>时间统计：使用 torch.cuda.Event，在推理入口前后记录总耗时，并保留 warm-up 机制。</w:t>
+        <w:t>复杂度统计的价值在于把“理论计算代价”单独拿出来看。对于 Transformer 的 attention 部分，序列长度越长，attention 矩阵越大，计算量通常近似随序列长度平方增长。因此，当视觉 token 被剪掉后，总序列长度变短，attention 理论复杂度会明显下降。</w:t>
       </w:r>
     </w:p>
     <w:p>
       <w:pPr>
-        <w:pStyle w:val="ListBullet"/>
+        <w:spacing w:line="360" w:lineRule="auto" w:before="0" w:after="120"/>
+        <w:ind w:firstLine="0"/>
       </w:pPr>
       <w:r>
         <w:rPr>
-          <w:rFonts w:ascii="Arial" w:hAnsi="Arial" w:eastAsia="Microsoft YaHei"/>
+          <w:rFonts w:ascii="Times New Roman" w:hAnsi="Times New Roman" w:eastAsia="SimSun"/>
+          <w:b/>
+          <w:sz w:val="24"/>
         </w:rPr>
-        <w:t>复杂度统计：基于 token 数量计算 seq_len_before / seq_len_after，再用 attention ~ L^2 估算下降比例。</w:t>
+        <w:t>三、采用的核心公式</w:t>
       </w:r>
     </w:p>
     <w:p>
       <w:pPr>
-        <w:pStyle w:val="ListBullet"/>
+        <w:spacing w:line="360" w:lineRule="auto" w:before="0" w:after="120"/>
+        <w:ind w:firstLine="420"/>
       </w:pPr>
       <w:r>
         <w:rPr>
-          <w:rFonts w:ascii="Arial" w:hAnsi="Arial" w:eastAsia="Microsoft YaHei"/>
+          <w:rFonts w:ascii="Times New Roman" w:hAnsi="Times New Roman" w:eastAsia="SimSun"/>
+          <w:b w:val="0"/>
+          <w:sz w:val="21"/>
         </w:rPr>
-        <w:t>FLOPs 统计：复用 model/model_utils.py 中的 num_floating_point_operations(...) 作为粗粒度辅助估算。</w:t>
+        <w:t>本次复杂度统计不是使用 fvcore 对完整 generate_flow_action / diffusion 链路做 tracing，而是基于 token 数量做稳定估算。原因是当前完整动作预测路径包含视觉编码、embedding 拼接、MoE token 分组、KV-cache、prefix/postfix 拆分、自定义 fusions ops、ODE integration 多步循环和 action head，动态控制流较多，fvcore 对这类路径不稳定。</w:t>
       </w:r>
     </w:p>
     <w:p>
       <w:pPr>
-        <w:pStyle w:val="ListBullet"/>
+        <w:spacing w:line="360" w:lineRule="auto" w:before="0" w:after="120"/>
+        <w:ind w:firstLine="420"/>
       </w:pPr>
       <w:r>
         <w:rPr>
-          <w:rFonts w:ascii="Arial" w:hAnsi="Arial" w:eastAsia="Microsoft YaHei"/>
+          <w:rFonts w:ascii="Times New Roman" w:hAnsi="Times New Roman" w:eastAsia="SimSun"/>
+          <w:b w:val="0"/>
+          <w:sz w:val="21"/>
         </w:rPr>
-        <w:t>不再对完整 generate_flow_action / diffusion 链路强行做 fvcore tracing。</w:t>
-      </w:r>
-    </w:p>
-    <w:p>
-      <w:r>
-        <w:rPr>
-          <w:rFonts w:ascii="Arial" w:hAnsi="Arial" w:eastAsia="Microsoft YaHei"/>
-          <w:b/>
-          <w:sz w:val="24"/>
-        </w:rPr>
-        <w:t>4. 代码改动</w:t>
+        <w:t>当前使用的核心公式如下。这里的 seq_len 表示进入 Transformer 的总序列长度，由文本 token、视觉 token 和 action token 共同组成。</w:t>
       </w:r>
     </w:p>
     <w:p>
       <w:pPr>
-        <w:pStyle w:val="ListBullet"/>
+        <w:spacing w:line="360" w:lineRule="auto" w:before="0" w:after="120"/>
+        <w:ind w:firstLine="0"/>
+        <w:jc w:val="center"/>
+      </w:pPr>
+      <m:oMathPara>
+        <m:oMath>
+          <m:r>
+            <m:rPr/>
+            <m:t>seq_len_before = text_tokens + vision_tokens_before + action_tokens</m:t>
+          </m:r>
+        </m:oMath>
+      </m:oMathPara>
+    </w:p>
+    <w:p>
+      <w:pPr>
+        <w:spacing w:line="360" w:lineRule="auto" w:before="0" w:after="120"/>
+        <w:ind w:firstLine="0"/>
+        <w:jc w:val="center"/>
+      </w:pPr>
+      <m:oMathPara>
+        <m:oMath>
+          <m:r>
+            <m:rPr/>
+            <m:t>seq_len_after = text_tokens + vision_tokens_after + action_tokens</m:t>
+          </m:r>
+        </m:oMath>
+      </m:oMathPara>
+    </w:p>
+    <w:p>
+      <w:pPr>
+        <w:spacing w:line="360" w:lineRule="auto" w:before="0" w:after="120"/>
+        <w:ind w:firstLine="0"/>
+        <w:jc w:val="center"/>
+      </w:pPr>
+      <m:oMathPara>
+        <m:oMath>
+          <m:r>
+            <m:rPr/>
+            <m:t>Attention complexity ≈ seq_len²</m:t>
+          </m:r>
+        </m:oMath>
+      </m:oMathPara>
+    </w:p>
+    <w:p>
+      <w:pPr>
+        <w:spacing w:line="360" w:lineRule="auto" w:before="0" w:after="120"/>
+        <w:ind w:firstLine="0"/>
+        <w:jc w:val="center"/>
+      </w:pPr>
+      <m:oMathPara>
+        <m:oMath>
+          <m:r>
+            <m:rPr/>
+            <m:t>attention_ratio = seq_len_after² / seq_len_before²</m:t>
+          </m:r>
+        </m:oMath>
+      </m:oMathPara>
+    </w:p>
+    <w:p>
+      <w:pPr>
+        <w:spacing w:line="360" w:lineRule="auto" w:before="0" w:after="120"/>
+        <w:ind w:firstLine="0"/>
+        <w:jc w:val="center"/>
+      </w:pPr>
+      <m:oMathPara>
+        <m:oMath>
+          <m:r>
+            <m:rPr/>
+            <m:t>estimated_attention_reduction = (1 − attention_ratio) × 100%</m:t>
+          </m:r>
+        </m:oMath>
+      </m:oMathPara>
+    </w:p>
+    <w:p>
+      <w:pPr>
+        <w:spacing w:line="360" w:lineRule="auto" w:before="0" w:after="120"/>
+        <w:ind w:firstLine="420"/>
       </w:pPr>
       <w:r>
         <w:rPr>
-          <w:rFonts w:ascii="Arial" w:hAnsi="Arial" w:eastAsia="Microsoft YaHei"/>
+          <w:rFonts w:ascii="Times New Roman" w:hAnsi="Times New Roman" w:eastAsia="SimSun"/>
+          <w:b w:val="0"/>
+          <w:sz w:val="21"/>
         </w:rPr>
-        <w:t>model/qwen2_5_based/modeling_qwen2_5_vl_act.py：新增/保留 _InferencePerfTimer、_log_complexity_track、profile_timing、profile_complexity 等逻辑。</w:t>
+        <w:t>这些公式的含义是：先分别计算剪枝前和剪枝后的总序列长度，再根据 attention 的平方复杂度估算两者比例，最后得到理论 attention 计算量下降百分比。</w:t>
       </w:r>
     </w:p>
     <w:p>
       <w:pPr>
-        <w:pStyle w:val="ListBullet"/>
+        <w:spacing w:line="360" w:lineRule="auto" w:before="0" w:after="120"/>
+        <w:ind w:firstLine="0"/>
       </w:pPr>
       <w:r>
         <w:rPr>
-          <w:rFonts w:ascii="Arial" w:hAnsi="Arial" w:eastAsia="Microsoft YaHei"/>
-        </w:rPr>
-        <w:t>model/model_utils.py：复用 num_floating_point_operations(...)，用于对剪枝前后序列长度做辅助 FLOPs 估算。</w:t>
-      </w:r>
-    </w:p>
-    <w:p>
-      <w:pPr>
-        <w:pStyle w:val="ListBullet"/>
-      </w:pPr>
-      <w:r>
-        <w:rPr>
-          <w:rFonts w:ascii="Arial" w:hAnsi="Arial" w:eastAsia="Microsoft YaHei"/>
-        </w:rPr>
-        <w:t>serving/policy/wall_x_policy.py：通过环境变量 WALLX_PROFILE_TIMING 控制是否输出实际推理计时。</w:t>
-      </w:r>
-    </w:p>
-    <w:p>
-      <w:pPr>
-        <w:pStyle w:val="ListBullet"/>
-      </w:pPr>
-      <w:r>
-        <w:rPr>
-          <w:rFonts w:ascii="Arial" w:hAnsi="Arial" w:eastAsia="Microsoft YaHei"/>
-        </w:rPr>
-        <w:t>调试脚本 /tmp/wallx_profile_once.py：用于单次离线验证 warmup、iters、vision_keep_ratio 和结果打印。</w:t>
-      </w:r>
-    </w:p>
-    <w:p>
-      <w:r>
-        <w:rPr>
-          <w:rFonts w:ascii="Arial" w:hAnsi="Arial" w:eastAsia="Microsoft YaHei"/>
+          <w:rFonts w:ascii="Times New Roman" w:hAnsi="Times New Roman" w:eastAsia="SimSun"/>
           <w:b/>
           <w:sz w:val="24"/>
         </w:rPr>
-        <w:t>5. 运行方式</w:t>
-      </w:r>
-    </w:p>
-    <w:p>
-      <w:pPr>
-        <w:pStyle w:val="ListBullet"/>
-      </w:pPr>
-      <w:r>
-        <w:rPr>
-          <w:rFonts w:ascii="Arial" w:hAnsi="Arial" w:eastAsia="Microsoft YaHei"/>
-        </w:rPr>
-        <w:t>在 wallx 环境下运行：source /root/miniconda3/etc/profile.d/conda.sh &amp;&amp; conda activate wallx。</w:t>
-      </w:r>
-    </w:p>
-    <w:p>
-      <w:pPr>
-        <w:pStyle w:val="ListBullet"/>
-      </w:pPr>
-      <w:r>
-        <w:rPr>
-          <w:rFonts w:ascii="Arial" w:hAnsi="Arial" w:eastAsia="Microsoft YaHei"/>
-        </w:rPr>
-        <w:t>设置 PYTHONPATH=/root/autodl-tmp/wall_x:$PYTHONPATH。</w:t>
-      </w:r>
-    </w:p>
-    <w:p>
-      <w:pPr>
-        <w:pStyle w:val="ListBullet"/>
-      </w:pPr>
-      <w:r>
-        <w:rPr>
-          <w:rFonts w:ascii="Arial" w:hAnsi="Arial" w:eastAsia="Microsoft YaHei"/>
-        </w:rPr>
-        <w:t>执行：python /tmp/wallx_profile_once.py --warmup 5 --iters 20 --vision_keep_ratio 0.5。</w:t>
-      </w:r>
-    </w:p>
-    <w:p>
-      <w:r>
-        <w:rPr>
-          <w:rFonts w:ascii="Arial" w:hAnsi="Arial" w:eastAsia="Microsoft YaHei"/>
-          <w:b/>
-          <w:sz w:val="24"/>
-        </w:rPr>
-        <w:t>6. 实际结果</w:t>
-      </w:r>
-    </w:p>
-    <w:p>
-      <w:pPr>
-        <w:pStyle w:val="ListBullet"/>
-      </w:pPr>
-      <w:r>
-        <w:rPr>
-          <w:rFonts w:ascii="Arial" w:hAnsi="Arial" w:eastAsia="Microsoft YaHei"/>
-        </w:rPr>
-        <w:t>视觉 token：81 -&gt; 41。</w:t>
-      </w:r>
-    </w:p>
-    <w:p>
-      <w:pPr>
-        <w:pStyle w:val="ListBullet"/>
-      </w:pPr>
-      <w:r>
-        <w:rPr>
-          <w:rFonts w:ascii="Arial" w:hAnsi="Arial" w:eastAsia="Microsoft YaHei"/>
-        </w:rPr>
-        <w:t>文本 token：53。</w:t>
-      </w:r>
-    </w:p>
-    <w:p>
-      <w:pPr>
-        <w:pStyle w:val="ListBullet"/>
-      </w:pPr>
-      <w:r>
-        <w:rPr>
-          <w:rFonts w:ascii="Arial" w:hAnsi="Arial" w:eastAsia="Microsoft YaHei"/>
-        </w:rPr>
-        <w:t>action token：32。</w:t>
-      </w:r>
-    </w:p>
-    <w:p>
-      <w:pPr>
-        <w:pStyle w:val="ListBullet"/>
-      </w:pPr>
-      <w:r>
-        <w:rPr>
-          <w:rFonts w:ascii="Arial" w:hAnsi="Arial" w:eastAsia="Microsoft YaHei"/>
-        </w:rPr>
-        <w:t>总序列长度：166 -&gt; 126。</w:t>
-      </w:r>
-    </w:p>
-    <w:p>
-      <w:pPr>
-        <w:pStyle w:val="ListBullet"/>
-      </w:pPr>
-      <w:r>
-        <w:rPr>
-          <w:rFonts w:ascii="Arial" w:hAnsi="Arial" w:eastAsia="Microsoft YaHei"/>
-        </w:rPr>
-        <w:t>attention_ratio = 0.576136，理论 attention 降低 42.39%。</w:t>
-      </w:r>
-    </w:p>
-    <w:p>
-      <w:pPr>
-        <w:pStyle w:val="ListBullet"/>
-      </w:pPr>
-      <w:r>
-        <w:rPr>
-          <w:rFonts w:ascii="Arial" w:hAnsi="Arial" w:eastAsia="Microsoft YaHei"/>
-        </w:rPr>
-        <w:t>estimated_train_flops_before = 1509725809920.0。</w:t>
-      </w:r>
-    </w:p>
-    <w:p>
-      <w:pPr>
-        <w:pStyle w:val="ListBullet"/>
-      </w:pPr>
-      <w:r>
-        <w:rPr>
-          <w:rFonts w:ascii="Arial" w:hAnsi="Arial" w:eastAsia="Microsoft YaHei"/>
-        </w:rPr>
-        <w:t>estimated_train_flops_after = 1357458597120.0。</w:t>
-      </w:r>
-    </w:p>
-    <w:p>
-      <w:pPr>
-        <w:pStyle w:val="ListBullet"/>
-      </w:pPr>
-      <w:r>
-        <w:rPr>
-          <w:rFonts w:ascii="Arial" w:hAnsi="Arial" w:eastAsia="Microsoft YaHei"/>
-        </w:rPr>
-        <w:t>estimated_train_flops_reduction = 10.09%。</w:t>
-      </w:r>
-    </w:p>
-    <w:p>
-      <w:pPr>
-        <w:pStyle w:val="ListBullet"/>
-      </w:pPr>
-      <w:r>
-        <w:rPr>
-          <w:rFonts w:ascii="Arial" w:hAnsi="Arial" w:eastAsia="Microsoft YaHei"/>
-        </w:rPr>
-        <w:t>完整推理平均时间 = 339.891 ms。最后一次推理 total_time = 335.468 ms。</w:t>
-      </w:r>
-    </w:p>
-    <w:p>
-      <w:r>
-        <w:rPr>
-          <w:rFonts w:ascii="Arial" w:hAnsi="Arial" w:eastAsia="Microsoft YaHei"/>
-          <w:b/>
-          <w:sz w:val="24"/>
-        </w:rPr>
-        <w:t>7. 结果分析</w:t>
-      </w:r>
-    </w:p>
-    <w:p>
-      <w:pPr>
-        <w:pStyle w:val="ListBullet"/>
-      </w:pPr>
-      <w:r>
-        <w:rPr>
-          <w:rFonts w:ascii="Arial" w:hAnsi="Arial" w:eastAsia="Microsoft YaHei"/>
-        </w:rPr>
-        <w:t>复杂度下降主要来自视觉 token 减少后，Transformer attention 的平方级代价下降。</w:t>
-      </w:r>
-    </w:p>
-    <w:p>
-      <w:pPr>
-        <w:pStyle w:val="ListBullet"/>
-      </w:pPr>
-      <w:r>
-        <w:rPr>
-          <w:rFonts w:ascii="Arial" w:hAnsi="Arial" w:eastAsia="Microsoft YaHei"/>
-        </w:rPr>
-        <w:t>FLOPs 下降幅度小于 attention 降幅，是因为全模型还包含视觉编码、MLP、action head、ODE integration 等非 attention 成分。</w:t>
-      </w:r>
-    </w:p>
-    <w:p>
-      <w:pPr>
-        <w:pStyle w:val="ListBullet"/>
-      </w:pPr>
-      <w:r>
-        <w:rPr>
-          <w:rFonts w:ascii="Arial" w:hAnsi="Arial" w:eastAsia="Microsoft YaHei"/>
-        </w:rPr>
-        <w:t>实际时间并不会按理论复杂度同比下降，因为完整链路中 ODE integration 仍占很大比例。</w:t>
-      </w:r>
-    </w:p>
-    <w:p>
-      <w:pPr>
-        <w:pStyle w:val="ListBullet"/>
-      </w:pPr>
-      <w:r>
-        <w:rPr>
-          <w:rFonts w:ascii="Arial" w:hAnsi="Arial" w:eastAsia="Microsoft YaHei"/>
-        </w:rPr>
-        <w:t>当前方案更适合回答“剪枝是否有理论收益”和“整体是否真的变快”，而不是给出精确硬件级 FLOPs。</w:t>
-      </w:r>
-    </w:p>
-    <w:p>
-      <w:r>
-        <w:rPr>
-          <w:rFonts w:ascii="Arial" w:hAnsi="Arial" w:eastAsia="Microsoft YaHei"/>
-          <w:b/>
-          <w:sz w:val="24"/>
-        </w:rPr>
-        <w:t>8. 约束与局限</w:t>
-      </w:r>
-    </w:p>
-    <w:p>
-      <w:pPr>
-        <w:pStyle w:val="ListBullet"/>
-      </w:pPr>
-      <w:r>
-        <w:rPr>
-          <w:rFonts w:ascii="Arial" w:hAnsi="Arial" w:eastAsia="Microsoft YaHei"/>
-        </w:rPr>
-        <w:t>复杂度结果是 token 级理论估算，不是 fvcore 级完整 tracing。</w:t>
-      </w:r>
-    </w:p>
-    <w:p>
-      <w:pPr>
-        <w:pStyle w:val="ListBullet"/>
-      </w:pPr>
-      <w:r>
-        <w:rPr>
-          <w:rFonts w:ascii="Arial" w:hAnsi="Arial" w:eastAsia="Microsoft YaHei"/>
-        </w:rPr>
-        <w:t>日志会在每次推理时打印一次，因此 iters=20 会看到重复输出，这是正常现象。</w:t>
-      </w:r>
-    </w:p>
-    <w:p>
-      <w:pPr>
-        <w:pStyle w:val="ListBullet"/>
-      </w:pPr>
-      <w:r>
-        <w:rPr>
-          <w:rFonts w:ascii="Arial" w:hAnsi="Arial" w:eastAsia="Microsoft YaHei"/>
-        </w:rPr>
-        <w:t>warning 信息来自张量构造和自定义 op 的类型提示，不影响当前统计结论。</w:t>
-      </w:r>
-    </w:p>
-    <w:p>
-      <w:r>
-        <w:rPr>
-          <w:rFonts w:ascii="Arial" w:hAnsi="Arial" w:eastAsia="Microsoft YaHei"/>
-          <w:b/>
-          <w:sz w:val="24"/>
-        </w:rPr>
-        <w:t>9. Git 状态</w:t>
-      </w:r>
-    </w:p>
-    <w:p>
-      <w:pPr>
-        <w:pStyle w:val="ListBullet"/>
-      </w:pPr>
-      <w:r>
-        <w:rPr>
-          <w:rFonts w:ascii="Arial" w:hAnsi="Arial" w:eastAsia="Microsoft YaHei"/>
-        </w:rPr>
-        <w:t>当前仓库 remote 为 origin，指向 git@github.com:Acton618/wallx.git。</w:t>
-      </w:r>
-    </w:p>
-    <w:p>
-      <w:pPr>
-        <w:pStyle w:val="ListBullet"/>
-      </w:pPr>
-      <w:r>
-        <w:rPr>
-          <w:rFonts w:ascii="Arial" w:hAnsi="Arial" w:eastAsia="Microsoft YaHei"/>
-        </w:rPr>
-        <w:t>本次生成的报告文件名为 wallx_time_flops_handoff_report.docx，位于仓库根目录 wall_x/ 下。</w:t>
-      </w:r>
-    </w:p>
-    <w:p>
-      <w:pPr>
-        <w:pStyle w:val="ListBullet"/>
-      </w:pPr>
-      <w:r>
-        <w:rPr>
-          <w:rFonts w:ascii="Arial" w:hAnsi="Arial" w:eastAsia="Microsoft YaHei"/>
-        </w:rPr>
-        <w:t>后续会将该文件提交到 main 分支并同步到 GitHub。</w:t>
-      </w:r>
-    </w:p>
-    <w:p>
-      <w:r>
-        <w:rPr>
-          <w:rFonts w:ascii="Arial" w:hAnsi="Arial" w:eastAsia="Microsoft YaHei"/>
-          <w:b/>
-          <w:sz w:val="24"/>
-        </w:rPr>
-        <w:t>关键指标表</w:t>
+        <w:t>四、代码中做了什么</w:t>
       </w:r>
     </w:p>
     <w:tbl>
@@ -566,27 +297,77 @@
         <w:tblLook w:firstColumn="1" w:firstRow="1" w:lastColumn="0" w:lastRow="0" w:noHBand="0" w:noVBand="1" w:val="04A0"/>
       </w:tblPr>
       <w:tblGrid>
-        <w:gridCol w:w="4320"/>
-        <w:gridCol w:w="4320"/>
+        <w:gridCol w:w="3216"/>
+        <w:gridCol w:w="3216"/>
+        <w:gridCol w:w="3216"/>
       </w:tblGrid>
       <w:tr>
         <w:tc>
           <w:tcPr>
-            <w:tcW w:type="dxa" w:w="4320"/>
+            <w:tcW w:type="dxa" w:w="3216"/>
+            <w:vAlign w:val="center"/>
+            <w:shd w:fill="D9EAF7"/>
           </w:tcPr>
           <w:p>
+            <w:pPr>
+              <w:spacing w:line="360" w:lineRule="auto" w:before="0" w:after="0"/>
+              <w:ind w:firstLine="0"/>
+              <w:jc w:val="center"/>
+            </w:pPr>
+            <w:r/>
             <w:r>
-              <w:t>指标</w:t>
+              <w:rPr>
+                <w:rFonts w:ascii="Times New Roman" w:hAnsi="Times New Roman" w:eastAsia="SimSun"/>
+                <w:b/>
+                <w:sz w:val="21"/>
+              </w:rPr>
+              <w:t>文件</w:t>
             </w:r>
           </w:p>
         </w:tc>
         <w:tc>
           <w:tcPr>
-            <w:tcW w:type="dxa" w:w="4320"/>
+            <w:tcW w:type="dxa" w:w="3216"/>
+            <w:vAlign w:val="center"/>
+            <w:shd w:fill="D9EAF7"/>
           </w:tcPr>
           <w:p>
+            <w:pPr>
+              <w:spacing w:line="360" w:lineRule="auto" w:before="0" w:after="0"/>
+              <w:ind w:firstLine="0"/>
+              <w:jc w:val="center"/>
+            </w:pPr>
+            <w:r/>
             <w:r>
-              <w:t>数值</w:t>
+              <w:rPr>
+                <w:rFonts w:ascii="Times New Roman" w:hAnsi="Times New Roman" w:eastAsia="SimSun"/>
+                <w:b/>
+                <w:sz w:val="21"/>
+              </w:rPr>
+              <w:t>位置或开关</w:t>
+            </w:r>
+          </w:p>
+        </w:tc>
+        <w:tc>
+          <w:tcPr>
+            <w:tcW w:type="dxa" w:w="3216"/>
+            <w:vAlign w:val="center"/>
+            <w:shd w:fill="D9EAF7"/>
+          </w:tcPr>
+          <w:p>
+            <w:pPr>
+              <w:spacing w:line="360" w:lineRule="auto" w:before="0" w:after="0"/>
+              <w:ind w:firstLine="0"/>
+              <w:jc w:val="center"/>
+            </w:pPr>
+            <w:r/>
+            <w:r>
+              <w:rPr>
+                <w:rFonts w:ascii="Times New Roman" w:hAnsi="Times New Roman" w:eastAsia="SimSun"/>
+                <w:b/>
+                <w:sz w:val="21"/>
+              </w:rPr>
+              <w:t>作用说明</w:t>
             </w:r>
           </w:p>
         </w:tc>
@@ -594,21 +375,67 @@
       <w:tr>
         <w:tc>
           <w:tcPr>
-            <w:tcW w:type="dxa" w:w="4320"/>
+            <w:tcW w:type="dxa" w:w="3216"/>
+            <w:vAlign w:val="center"/>
           </w:tcPr>
           <w:p>
+            <w:pPr>
+              <w:spacing w:line="360" w:lineRule="auto" w:before="0" w:after="0"/>
+              <w:ind w:firstLine="0"/>
+              <w:jc w:val="center"/>
+            </w:pPr>
+            <w:r/>
             <w:r>
-              <w:t>vision_tokens_before</w:t>
+              <w:rPr>
+                <w:rFonts w:ascii="Times New Roman" w:hAnsi="Times New Roman" w:eastAsia="SimSun"/>
+                <w:b w:val="0"/>
+                <w:sz w:val="21"/>
+              </w:rPr>
+              <w:t>model/qwen2_5_based/modeling_qwen2_5_vl_act.py</w:t>
             </w:r>
           </w:p>
         </w:tc>
         <w:tc>
           <w:tcPr>
-            <w:tcW w:type="dxa" w:w="4320"/>
+            <w:tcW w:type="dxa" w:w="3216"/>
+            <w:vAlign w:val="center"/>
           </w:tcPr>
           <w:p>
+            <w:pPr>
+              <w:spacing w:line="360" w:lineRule="auto" w:before="0" w:after="0"/>
+              <w:ind w:firstLine="0"/>
+              <w:jc w:val="center"/>
+            </w:pPr>
+            <w:r/>
             <w:r>
-              <w:t>81</w:t>
+              <w:rPr>
+                <w:rFonts w:ascii="Times New Roman" w:hAnsi="Times New Roman" w:eastAsia="SimSun"/>
+                <w:b w:val="0"/>
+                <w:sz w:val="21"/>
+              </w:rPr>
+              <w:t>_InferencePerfTimer</w:t>
+            </w:r>
+          </w:p>
+        </w:tc>
+        <w:tc>
+          <w:tcPr>
+            <w:tcW w:type="dxa" w:w="3216"/>
+            <w:vAlign w:val="center"/>
+          </w:tcPr>
+          <w:p>
+            <w:pPr>
+              <w:spacing w:line="360" w:lineRule="auto" w:before="0" w:after="0"/>
+              <w:ind w:firstLine="0"/>
+              <w:jc w:val="left"/>
+            </w:pPr>
+            <w:r/>
+            <w:r>
+              <w:rPr>
+                <w:rFonts w:ascii="Times New Roman" w:hAnsi="Times New Roman" w:eastAsia="SimSun"/>
+                <w:b w:val="0"/>
+                <w:sz w:val="21"/>
+              </w:rPr>
+              <w:t>使用 CUDA Event 记录 GPU 推理耗时，并在 CPU 场景下保留 perf_counter 兜底。该计时默认关闭，只有显式打开 profile_timing 才会输出。</w:t>
             </w:r>
           </w:p>
         </w:tc>
@@ -616,21 +443,67 @@
       <w:tr>
         <w:tc>
           <w:tcPr>
-            <w:tcW w:type="dxa" w:w="4320"/>
+            <w:tcW w:type="dxa" w:w="3216"/>
+            <w:vAlign w:val="center"/>
           </w:tcPr>
           <w:p>
+            <w:pPr>
+              <w:spacing w:line="360" w:lineRule="auto" w:before="0" w:after="0"/>
+              <w:ind w:firstLine="0"/>
+              <w:jc w:val="center"/>
+            </w:pPr>
+            <w:r/>
             <w:r>
-              <w:t>vision_tokens_after</w:t>
+              <w:rPr>
+                <w:rFonts w:ascii="Times New Roman" w:hAnsi="Times New Roman" w:eastAsia="SimSun"/>
+                <w:b w:val="0"/>
+                <w:sz w:val="21"/>
+              </w:rPr>
+              <w:t>model/qwen2_5_based/modeling_qwen2_5_vl_act.py</w:t>
             </w:r>
           </w:p>
         </w:tc>
         <w:tc>
           <w:tcPr>
-            <w:tcW w:type="dxa" w:w="4320"/>
+            <w:tcW w:type="dxa" w:w="3216"/>
+            <w:vAlign w:val="center"/>
           </w:tcPr>
           <w:p>
+            <w:pPr>
+              <w:spacing w:line="360" w:lineRule="auto" w:before="0" w:after="0"/>
+              <w:ind w:firstLine="0"/>
+              <w:jc w:val="center"/>
+            </w:pPr>
+            <w:r/>
             <w:r>
-              <w:t>41</w:t>
+              <w:rPr>
+                <w:rFonts w:ascii="Times New Roman" w:hAnsi="Times New Roman" w:eastAsia="SimSun"/>
+                <w:b w:val="0"/>
+                <w:sz w:val="21"/>
+              </w:rPr>
+              <w:t>_log_complexity_track(...)</w:t>
+            </w:r>
+          </w:p>
+        </w:tc>
+        <w:tc>
+          <w:tcPr>
+            <w:tcW w:type="dxa" w:w="3216"/>
+            <w:vAlign w:val="center"/>
+          </w:tcPr>
+          <w:p>
+            <w:pPr>
+              <w:spacing w:line="360" w:lineRule="auto" w:before="0" w:after="0"/>
+              <w:ind w:firstLine="0"/>
+              <w:jc w:val="left"/>
+            </w:pPr>
+            <w:r/>
+            <w:r>
+              <w:rPr>
+                <w:rFonts w:ascii="Times New Roman" w:hAnsi="Times New Roman" w:eastAsia="SimSun"/>
+                <w:b w:val="0"/>
+                <w:sz w:val="21"/>
+              </w:rPr>
+              <w:t>从 input_ids、attention_mask 和 token id 中统计 vision_tokens_before、text_tokens、action_tokens，并根据 vision_keep_ratio 或 vision_tokens_after 得到剪枝后的视觉 token 数。</w:t>
             </w:r>
           </w:p>
         </w:tc>
@@ -638,21 +511,67 @@
       <w:tr>
         <w:tc>
           <w:tcPr>
-            <w:tcW w:type="dxa" w:w="4320"/>
+            <w:tcW w:type="dxa" w:w="3216"/>
+            <w:vAlign w:val="center"/>
           </w:tcPr>
           <w:p>
+            <w:pPr>
+              <w:spacing w:line="360" w:lineRule="auto" w:before="0" w:after="0"/>
+              <w:ind w:firstLine="0"/>
+              <w:jc w:val="center"/>
+            </w:pPr>
+            <w:r/>
             <w:r>
-              <w:t>text_tokens</w:t>
+              <w:rPr>
+                <w:rFonts w:ascii="Times New Roman" w:hAnsi="Times New Roman" w:eastAsia="SimSun"/>
+                <w:b w:val="0"/>
+                <w:sz w:val="21"/>
+              </w:rPr>
+              <w:t>model/qwen2_5_based/modeling_qwen2_5_vl_act.py</w:t>
             </w:r>
           </w:p>
         </w:tc>
         <w:tc>
           <w:tcPr>
-            <w:tcW w:type="dxa" w:w="4320"/>
+            <w:tcW w:type="dxa" w:w="3216"/>
+            <w:vAlign w:val="center"/>
           </w:tcPr>
           <w:p>
+            <w:pPr>
+              <w:spacing w:line="360" w:lineRule="auto" w:before="0" w:after="0"/>
+              <w:ind w:firstLine="0"/>
+              <w:jc w:val="center"/>
+            </w:pPr>
+            <w:r/>
             <w:r>
-              <w:t>53</w:t>
+              <w:rPr>
+                <w:rFonts w:ascii="Times New Roman" w:hAnsi="Times New Roman" w:eastAsia="SimSun"/>
+                <w:b w:val="0"/>
+                <w:sz w:val="21"/>
+              </w:rPr>
+              <w:t>generate_flow_action(..., profile_timing, profile_complexity)</w:t>
+            </w:r>
+          </w:p>
+        </w:tc>
+        <w:tc>
+          <w:tcPr>
+            <w:tcW w:type="dxa" w:w="3216"/>
+            <w:vAlign w:val="center"/>
+          </w:tcPr>
+          <w:p>
+            <w:pPr>
+              <w:spacing w:line="360" w:lineRule="auto" w:before="0" w:after="0"/>
+              <w:ind w:firstLine="0"/>
+              <w:jc w:val="left"/>
+            </w:pPr>
+            <w:r/>
+            <w:r>
+              <w:rPr>
+                <w:rFonts w:ascii="Times New Roman" w:hAnsi="Times New Roman" w:eastAsia="SimSun"/>
+                <w:b w:val="0"/>
+                <w:sz w:val="21"/>
+              </w:rPr>
+              <w:t>在动作预测路径中挂接时间统计和复杂度统计，但不改变模型输出 tensor。</w:t>
             </w:r>
           </w:p>
         </w:tc>
@@ -660,21 +579,67 @@
       <w:tr>
         <w:tc>
           <w:tcPr>
-            <w:tcW w:type="dxa" w:w="4320"/>
+            <w:tcW w:type="dxa" w:w="3216"/>
+            <w:vAlign w:val="center"/>
           </w:tcPr>
           <w:p>
+            <w:pPr>
+              <w:spacing w:line="360" w:lineRule="auto" w:before="0" w:after="0"/>
+              <w:ind w:firstLine="0"/>
+              <w:jc w:val="center"/>
+            </w:pPr>
+            <w:r/>
             <w:r>
-              <w:t>action_tokens</w:t>
+              <w:rPr>
+                <w:rFonts w:ascii="Times New Roman" w:hAnsi="Times New Roman" w:eastAsia="SimSun"/>
+                <w:b w:val="0"/>
+                <w:sz w:val="21"/>
+              </w:rPr>
+              <w:t>model/model_utils.py</w:t>
             </w:r>
           </w:p>
         </w:tc>
         <w:tc>
           <w:tcPr>
-            <w:tcW w:type="dxa" w:w="4320"/>
+            <w:tcW w:type="dxa" w:w="3216"/>
+            <w:vAlign w:val="center"/>
           </w:tcPr>
           <w:p>
+            <w:pPr>
+              <w:spacing w:line="360" w:lineRule="auto" w:before="0" w:after="0"/>
+              <w:ind w:firstLine="0"/>
+              <w:jc w:val="center"/>
+            </w:pPr>
+            <w:r/>
             <w:r>
-              <w:t>32</w:t>
+              <w:rPr>
+                <w:rFonts w:ascii="Times New Roman" w:hAnsi="Times New Roman" w:eastAsia="SimSun"/>
+                <w:b w:val="0"/>
+                <w:sz w:val="21"/>
+              </w:rPr>
+              <w:t>num_floating_point_operations(...)</w:t>
+            </w:r>
+          </w:p>
+        </w:tc>
+        <w:tc>
+          <w:tcPr>
+            <w:tcW w:type="dxa" w:w="3216"/>
+            <w:vAlign w:val="center"/>
+          </w:tcPr>
+          <w:p>
+            <w:pPr>
+              <w:spacing w:line="360" w:lineRule="auto" w:before="0" w:after="0"/>
+              <w:ind w:firstLine="0"/>
+              <w:jc w:val="left"/>
+            </w:pPr>
+            <w:r/>
+            <w:r>
+              <w:rPr>
+                <w:rFonts w:ascii="Times New Roman" w:hAnsi="Times New Roman" w:eastAsia="SimSun"/>
+                <w:b w:val="0"/>
+                <w:sz w:val="21"/>
+              </w:rPr>
+              <w:t>作为辅助函数复用，用于估算剪枝前后粗粒度 FLOPs 变化；该值是理论估算，不是硬件真实 profiler 输出。</w:t>
             </w:r>
           </w:p>
         </w:tc>
@@ -682,21 +647,264 @@
       <w:tr>
         <w:tc>
           <w:tcPr>
-            <w:tcW w:type="dxa" w:w="4320"/>
+            <w:tcW w:type="dxa" w:w="3216"/>
+            <w:vAlign w:val="center"/>
           </w:tcPr>
           <w:p>
+            <w:pPr>
+              <w:spacing w:line="360" w:lineRule="auto" w:before="0" w:after="0"/>
+              <w:ind w:firstLine="0"/>
+              <w:jc w:val="center"/>
+            </w:pPr>
+            <w:r/>
             <w:r>
-              <w:t>seq_len_before</w:t>
+              <w:rPr>
+                <w:rFonts w:ascii="Times New Roman" w:hAnsi="Times New Roman" w:eastAsia="SimSun"/>
+                <w:b w:val="0"/>
+                <w:sz w:val="21"/>
+              </w:rPr>
+              <w:t>serving/policy/wall_x_policy.py</w:t>
             </w:r>
           </w:p>
         </w:tc>
         <w:tc>
           <w:tcPr>
-            <w:tcW w:type="dxa" w:w="4320"/>
+            <w:tcW w:type="dxa" w:w="3216"/>
+            <w:vAlign w:val="center"/>
           </w:tcPr>
           <w:p>
+            <w:pPr>
+              <w:spacing w:line="360" w:lineRule="auto" w:before="0" w:after="0"/>
+              <w:ind w:firstLine="0"/>
+              <w:jc w:val="center"/>
+            </w:pPr>
+            <w:r/>
             <w:r>
-              <w:t>166</w:t>
+              <w:rPr>
+                <w:rFonts w:ascii="Times New Roman" w:hAnsi="Times New Roman" w:eastAsia="SimSun"/>
+                <w:b w:val="0"/>
+                <w:sz w:val="21"/>
+              </w:rPr>
+              <w:t>WALLX_PROFILE_TIMING</w:t>
+            </w:r>
+          </w:p>
+        </w:tc>
+        <w:tc>
+          <w:tcPr>
+            <w:tcW w:type="dxa" w:w="3216"/>
+            <w:vAlign w:val="center"/>
+          </w:tcPr>
+          <w:p>
+            <w:pPr>
+              <w:spacing w:line="360" w:lineRule="auto" w:before="0" w:after="0"/>
+              <w:ind w:firstLine="0"/>
+              <w:jc w:val="left"/>
+            </w:pPr>
+            <w:r/>
+            <w:r>
+              <w:rPr>
+                <w:rFonts w:ascii="Times New Roman" w:hAnsi="Times New Roman" w:eastAsia="SimSun"/>
+                <w:b w:val="0"/>
+                <w:sz w:val="21"/>
+              </w:rPr>
+              <w:t>服务端推理时可通过环境变量打开时间统计，默认关闭，不影响正常部署。</w:t>
+            </w:r>
+          </w:p>
+        </w:tc>
+      </w:tr>
+    </w:tbl>
+    <w:p/>
+    <w:p>
+      <w:pPr>
+        <w:spacing w:line="360" w:lineRule="auto" w:before="0" w:after="120"/>
+        <w:ind w:firstLine="420"/>
+      </w:pPr>
+      <w:r>
+        <w:rPr>
+          <w:rFonts w:ascii="Times New Roman" w:hAnsi="Times New Roman" w:eastAsia="SimSun"/>
+          <w:b w:val="0"/>
+          <w:sz w:val="21"/>
+        </w:rPr>
+        <w:t>需要强调的是：这些改动的定位是“观测和统计”，不是“修改模型行为”。默认情况下不打开 profiling，模型正常推理不会每次都强制统计。只有测试时设置 profile_timing、profile_complexity 或传入 vision_keep_ratio 等参数，才会打印对应日志。</w:t>
+      </w:r>
+    </w:p>
+    <w:p>
+      <w:pPr>
+        <w:spacing w:line="360" w:lineRule="auto" w:before="0" w:after="120"/>
+        <w:ind w:firstLine="0"/>
+      </w:pPr>
+      <w:r>
+        <w:rPr>
+          <w:rFonts w:ascii="Times New Roman" w:hAnsi="Times New Roman" w:eastAsia="SimSun"/>
+          <w:b/>
+          <w:sz w:val="24"/>
+        </w:rPr>
+        <w:t>五、运行方式</w:t>
+      </w:r>
+    </w:p>
+    <w:p>
+      <w:pPr>
+        <w:spacing w:line="360" w:lineRule="auto" w:before="0" w:after="120"/>
+        <w:ind w:firstLine="420"/>
+      </w:pPr>
+      <w:r>
+        <w:rPr>
+          <w:rFonts w:ascii="Times New Roman" w:hAnsi="Times New Roman" w:eastAsia="SimSun"/>
+          <w:b w:val="0"/>
+          <w:sz w:val="21"/>
+        </w:rPr>
+        <w:t>本次实验是在 wallx 环境中执行的，命令如下。命令中的 warmup=5 表示前 5 次推理只用于预热 GPU，不纳入最终平均耗时；iters=20 表示正式统计 20 次推理平均时间；vision_keep_ratio=0.5 表示模拟保留约 50% 的视觉 token。</w:t>
+      </w:r>
+    </w:p>
+    <w:p>
+      <w:pPr>
+        <w:spacing w:line="360" w:lineRule="auto" w:before="0" w:after="120"/>
+        <w:ind w:firstLine="420"/>
+      </w:pPr>
+      <w:r>
+        <w:rPr>
+          <w:rFonts w:ascii="Times New Roman" w:hAnsi="Times New Roman" w:eastAsia="SimSun"/>
+          <w:b w:val="0"/>
+          <w:sz w:val="21"/>
+        </w:rPr>
+        <w:t>source /root/miniconda3/etc/profile.d/conda.sh</w:t>
+      </w:r>
+    </w:p>
+    <w:p>
+      <w:pPr>
+        <w:spacing w:line="360" w:lineRule="auto" w:before="0" w:after="120"/>
+        <w:ind w:firstLine="420"/>
+      </w:pPr>
+      <w:r>
+        <w:rPr>
+          <w:rFonts w:ascii="Times New Roman" w:hAnsi="Times New Roman" w:eastAsia="SimSun"/>
+          <w:b w:val="0"/>
+          <w:sz w:val="21"/>
+        </w:rPr>
+        <w:t>conda activate wallx</w:t>
+      </w:r>
+    </w:p>
+    <w:p>
+      <w:pPr>
+        <w:spacing w:line="360" w:lineRule="auto" w:before="0" w:after="120"/>
+        <w:ind w:firstLine="420"/>
+      </w:pPr>
+      <w:r>
+        <w:rPr>
+          <w:rFonts w:ascii="Times New Roman" w:hAnsi="Times New Roman" w:eastAsia="SimSun"/>
+          <w:b w:val="0"/>
+          <w:sz w:val="21"/>
+        </w:rPr>
+        <w:t>export PYTHONPATH=/root/autodl-tmp/wall_x:$PYTHONPATH</w:t>
+      </w:r>
+    </w:p>
+    <w:p>
+      <w:pPr>
+        <w:spacing w:line="360" w:lineRule="auto" w:before="0" w:after="120"/>
+        <w:ind w:firstLine="420"/>
+      </w:pPr>
+      <w:r>
+        <w:rPr>
+          <w:rFonts w:ascii="Times New Roman" w:hAnsi="Times New Roman" w:eastAsia="SimSun"/>
+          <w:b w:val="0"/>
+          <w:sz w:val="21"/>
+        </w:rPr>
+        <w:t>python /tmp/wallx_profile_once.py --warmup 5 --iters 20 --vision_keep_ratio 0.5</w:t>
+      </w:r>
+    </w:p>
+    <w:p>
+      <w:pPr>
+        <w:spacing w:line="360" w:lineRule="auto" w:before="0" w:after="120"/>
+        <w:ind w:firstLine="0"/>
+      </w:pPr>
+      <w:r>
+        <w:rPr>
+          <w:rFonts w:ascii="Times New Roman" w:hAnsi="Times New Roman" w:eastAsia="SimSun"/>
+          <w:b/>
+          <w:sz w:val="24"/>
+        </w:rPr>
+        <w:t>六、复杂度输出结果</w:t>
+      </w:r>
+    </w:p>
+    <w:tbl>
+      <w:tblPr>
+        <w:tblStyle w:val="TableGrid"/>
+        <w:tblW w:type="auto" w:w="0"/>
+        <w:jc w:val="center"/>
+        <w:tblLook w:firstColumn="1" w:firstRow="1" w:lastColumn="0" w:lastRow="0" w:noHBand="0" w:noVBand="1" w:val="04A0"/>
+      </w:tblPr>
+      <w:tblGrid>
+        <w:gridCol w:w="3216"/>
+        <w:gridCol w:w="3216"/>
+        <w:gridCol w:w="3216"/>
+      </w:tblGrid>
+      <w:tr>
+        <w:tc>
+          <w:tcPr>
+            <w:tcW w:type="dxa" w:w="3216"/>
+            <w:vAlign w:val="center"/>
+            <w:shd w:fill="D9EAF7"/>
+          </w:tcPr>
+          <w:p>
+            <w:pPr>
+              <w:spacing w:line="360" w:lineRule="auto" w:before="0" w:after="0"/>
+              <w:ind w:firstLine="0"/>
+              <w:jc w:val="center"/>
+            </w:pPr>
+            <w:r/>
+            <w:r>
+              <w:rPr>
+                <w:rFonts w:ascii="Times New Roman" w:hAnsi="Times New Roman" w:eastAsia="SimSun"/>
+                <w:b/>
+                <w:sz w:val="21"/>
+              </w:rPr>
+              <w:t>指标</w:t>
+            </w:r>
+          </w:p>
+        </w:tc>
+        <w:tc>
+          <w:tcPr>
+            <w:tcW w:type="dxa" w:w="3216"/>
+            <w:vAlign w:val="center"/>
+            <w:shd w:fill="D9EAF7"/>
+          </w:tcPr>
+          <w:p>
+            <w:pPr>
+              <w:spacing w:line="360" w:lineRule="auto" w:before="0" w:after="0"/>
+              <w:ind w:firstLine="0"/>
+              <w:jc w:val="center"/>
+            </w:pPr>
+            <w:r/>
+            <w:r>
+              <w:rPr>
+                <w:rFonts w:ascii="Times New Roman" w:hAnsi="Times New Roman" w:eastAsia="SimSun"/>
+                <w:b/>
+                <w:sz w:val="21"/>
+              </w:rPr>
+              <w:t>数值</w:t>
+            </w:r>
+          </w:p>
+        </w:tc>
+        <w:tc>
+          <w:tcPr>
+            <w:tcW w:type="dxa" w:w="3216"/>
+            <w:vAlign w:val="center"/>
+            <w:shd w:fill="D9EAF7"/>
+          </w:tcPr>
+          <w:p>
+            <w:pPr>
+              <w:spacing w:line="360" w:lineRule="auto" w:before="0" w:after="0"/>
+              <w:ind w:firstLine="0"/>
+              <w:jc w:val="center"/>
+            </w:pPr>
+            <w:r/>
+            <w:r>
+              <w:rPr>
+                <w:rFonts w:ascii="Times New Roman" w:hAnsi="Times New Roman" w:eastAsia="SimSun"/>
+                <w:b/>
+                <w:sz w:val="21"/>
+              </w:rPr>
+              <w:t>解释</w:t>
             </w:r>
           </w:p>
         </w:tc>
@@ -704,21 +912,67 @@
       <w:tr>
         <w:tc>
           <w:tcPr>
-            <w:tcW w:type="dxa" w:w="4320"/>
+            <w:tcW w:type="dxa" w:w="3216"/>
+            <w:vAlign w:val="center"/>
           </w:tcPr>
           <w:p>
+            <w:pPr>
+              <w:spacing w:line="360" w:lineRule="auto" w:before="0" w:after="0"/>
+              <w:ind w:firstLine="0"/>
+              <w:jc w:val="center"/>
+            </w:pPr>
+            <w:r/>
             <w:r>
-              <w:t>seq_len_after</w:t>
+              <w:rPr>
+                <w:rFonts w:ascii="Times New Roman" w:hAnsi="Times New Roman" w:eastAsia="SimSun"/>
+                <w:b w:val="0"/>
+                <w:sz w:val="21"/>
+              </w:rPr>
+              <w:t>vision_tokens_before</w:t>
             </w:r>
           </w:p>
         </w:tc>
         <w:tc>
           <w:tcPr>
-            <w:tcW w:type="dxa" w:w="4320"/>
+            <w:tcW w:type="dxa" w:w="3216"/>
+            <w:vAlign w:val="center"/>
           </w:tcPr>
           <w:p>
+            <w:pPr>
+              <w:spacing w:line="360" w:lineRule="auto" w:before="0" w:after="0"/>
+              <w:ind w:firstLine="0"/>
+              <w:jc w:val="center"/>
+            </w:pPr>
+            <w:r/>
             <w:r>
-              <w:t>126</w:t>
+              <w:rPr>
+                <w:rFonts w:ascii="Times New Roman" w:hAnsi="Times New Roman" w:eastAsia="SimSun"/>
+                <w:b w:val="0"/>
+                <w:sz w:val="21"/>
+              </w:rPr>
+              <w:t>81</w:t>
+            </w:r>
+          </w:p>
+        </w:tc>
+        <w:tc>
+          <w:tcPr>
+            <w:tcW w:type="dxa" w:w="3216"/>
+            <w:vAlign w:val="center"/>
+          </w:tcPr>
+          <w:p>
+            <w:pPr>
+              <w:spacing w:line="360" w:lineRule="auto" w:before="0" w:after="0"/>
+              <w:ind w:firstLine="0"/>
+              <w:jc w:val="left"/>
+            </w:pPr>
+            <w:r/>
+            <w:r>
+              <w:rPr>
+                <w:rFonts w:ascii="Times New Roman" w:hAnsi="Times New Roman" w:eastAsia="SimSun"/>
+                <w:b w:val="0"/>
+                <w:sz w:val="21"/>
+              </w:rPr>
+              <w:t>剪枝前，从输入序列中统计到的视觉 token 数。</w:t>
             </w:r>
           </w:p>
         </w:tc>
@@ -726,21 +980,67 @@
       <w:tr>
         <w:tc>
           <w:tcPr>
-            <w:tcW w:type="dxa" w:w="4320"/>
+            <w:tcW w:type="dxa" w:w="3216"/>
+            <w:vAlign w:val="center"/>
           </w:tcPr>
           <w:p>
+            <w:pPr>
+              <w:spacing w:line="360" w:lineRule="auto" w:before="0" w:after="0"/>
+              <w:ind w:firstLine="0"/>
+              <w:jc w:val="center"/>
+            </w:pPr>
+            <w:r/>
             <w:r>
-              <w:t>attention_ratio</w:t>
+              <w:rPr>
+                <w:rFonts w:ascii="Times New Roman" w:hAnsi="Times New Roman" w:eastAsia="SimSun"/>
+                <w:b w:val="0"/>
+                <w:sz w:val="21"/>
+              </w:rPr>
+              <w:t>vision_tokens_after</w:t>
             </w:r>
           </w:p>
         </w:tc>
         <w:tc>
           <w:tcPr>
-            <w:tcW w:type="dxa" w:w="4320"/>
+            <w:tcW w:type="dxa" w:w="3216"/>
+            <w:vAlign w:val="center"/>
           </w:tcPr>
           <w:p>
+            <w:pPr>
+              <w:spacing w:line="360" w:lineRule="auto" w:before="0" w:after="0"/>
+              <w:ind w:firstLine="0"/>
+              <w:jc w:val="center"/>
+            </w:pPr>
+            <w:r/>
             <w:r>
-              <w:t>0.576136</w:t>
+              <w:rPr>
+                <w:rFonts w:ascii="Times New Roman" w:hAnsi="Times New Roman" w:eastAsia="SimSun"/>
+                <w:b w:val="0"/>
+                <w:sz w:val="21"/>
+              </w:rPr>
+              <w:t>41</w:t>
+            </w:r>
+          </w:p>
+        </w:tc>
+        <w:tc>
+          <w:tcPr>
+            <w:tcW w:type="dxa" w:w="3216"/>
+            <w:vAlign w:val="center"/>
+          </w:tcPr>
+          <w:p>
+            <w:pPr>
+              <w:spacing w:line="360" w:lineRule="auto" w:before="0" w:after="0"/>
+              <w:ind w:firstLine="0"/>
+              <w:jc w:val="left"/>
+            </w:pPr>
+            <w:r/>
+            <w:r>
+              <w:rPr>
+                <w:rFonts w:ascii="Times New Roman" w:hAnsi="Times New Roman" w:eastAsia="SimSun"/>
+                <w:b w:val="0"/>
+                <w:sz w:val="21"/>
+              </w:rPr>
+              <w:t>剪枝后估算的视觉 token 数。本次使用 vision_keep_ratio=0.5，因此 81 个视觉 token 约保留为 41 个。</w:t>
             </w:r>
           </w:p>
         </w:tc>
@@ -748,21 +1048,67 @@
       <w:tr>
         <w:tc>
           <w:tcPr>
-            <w:tcW w:type="dxa" w:w="4320"/>
+            <w:tcW w:type="dxa" w:w="3216"/>
+            <w:vAlign w:val="center"/>
           </w:tcPr>
           <w:p>
+            <w:pPr>
+              <w:spacing w:line="360" w:lineRule="auto" w:before="0" w:after="0"/>
+              <w:ind w:firstLine="0"/>
+              <w:jc w:val="center"/>
+            </w:pPr>
+            <w:r/>
             <w:r>
-              <w:t>estimated_attention_reduction</w:t>
+              <w:rPr>
+                <w:rFonts w:ascii="Times New Roman" w:hAnsi="Times New Roman" w:eastAsia="SimSun"/>
+                <w:b w:val="0"/>
+                <w:sz w:val="21"/>
+              </w:rPr>
+              <w:t>text_tokens</w:t>
             </w:r>
           </w:p>
         </w:tc>
         <w:tc>
           <w:tcPr>
-            <w:tcW w:type="dxa" w:w="4320"/>
+            <w:tcW w:type="dxa" w:w="3216"/>
+            <w:vAlign w:val="center"/>
           </w:tcPr>
           <w:p>
+            <w:pPr>
+              <w:spacing w:line="360" w:lineRule="auto" w:before="0" w:after="0"/>
+              <w:ind w:firstLine="0"/>
+              <w:jc w:val="center"/>
+            </w:pPr>
+            <w:r/>
             <w:r>
-              <w:t>42.39%</w:t>
+              <w:rPr>
+                <w:rFonts w:ascii="Times New Roman" w:hAnsi="Times New Roman" w:eastAsia="SimSun"/>
+                <w:b w:val="0"/>
+                <w:sz w:val="21"/>
+              </w:rPr>
+              <w:t>53</w:t>
+            </w:r>
+          </w:p>
+        </w:tc>
+        <w:tc>
+          <w:tcPr>
+            <w:tcW w:type="dxa" w:w="3216"/>
+            <w:vAlign w:val="center"/>
+          </w:tcPr>
+          <w:p>
+            <w:pPr>
+              <w:spacing w:line="360" w:lineRule="auto" w:before="0" w:after="0"/>
+              <w:ind w:firstLine="0"/>
+              <w:jc w:val="left"/>
+            </w:pPr>
+            <w:r/>
+            <w:r>
+              <w:rPr>
+                <w:rFonts w:ascii="Times New Roman" w:hAnsi="Times New Roman" w:eastAsia="SimSun"/>
+                <w:b w:val="0"/>
+                <w:sz w:val="21"/>
+              </w:rPr>
+              <w:t>文本指令、系统提示等非视觉、非 action 的 token 数。</w:t>
             </w:r>
           </w:p>
         </w:tc>
@@ -770,21 +1116,67 @@
       <w:tr>
         <w:tc>
           <w:tcPr>
-            <w:tcW w:type="dxa" w:w="4320"/>
+            <w:tcW w:type="dxa" w:w="3216"/>
+            <w:vAlign w:val="center"/>
           </w:tcPr>
           <w:p>
+            <w:pPr>
+              <w:spacing w:line="360" w:lineRule="auto" w:before="0" w:after="0"/>
+              <w:ind w:firstLine="0"/>
+              <w:jc w:val="center"/>
+            </w:pPr>
+            <w:r/>
             <w:r>
-              <w:t>estimated_train_flops_reduction</w:t>
+              <w:rPr>
+                <w:rFonts w:ascii="Times New Roman" w:hAnsi="Times New Roman" w:eastAsia="SimSun"/>
+                <w:b w:val="0"/>
+                <w:sz w:val="21"/>
+              </w:rPr>
+              <w:t>action_tokens</w:t>
             </w:r>
           </w:p>
         </w:tc>
         <w:tc>
           <w:tcPr>
-            <w:tcW w:type="dxa" w:w="4320"/>
+            <w:tcW w:type="dxa" w:w="3216"/>
+            <w:vAlign w:val="center"/>
           </w:tcPr>
           <w:p>
+            <w:pPr>
+              <w:spacing w:line="360" w:lineRule="auto" w:before="0" w:after="0"/>
+              <w:ind w:firstLine="0"/>
+              <w:jc w:val="center"/>
+            </w:pPr>
+            <w:r/>
             <w:r>
-              <w:t>10.09%</w:t>
+              <w:rPr>
+                <w:rFonts w:ascii="Times New Roman" w:hAnsi="Times New Roman" w:eastAsia="SimSun"/>
+                <w:b w:val="0"/>
+                <w:sz w:val="21"/>
+              </w:rPr>
+              <w:t>32</w:t>
+            </w:r>
+          </w:p>
+        </w:tc>
+        <w:tc>
+          <w:tcPr>
+            <w:tcW w:type="dxa" w:w="3216"/>
+            <w:vAlign w:val="center"/>
+          </w:tcPr>
+          <w:p>
+            <w:pPr>
+              <w:spacing w:line="360" w:lineRule="auto" w:before="0" w:after="0"/>
+              <w:ind w:firstLine="0"/>
+              <w:jc w:val="left"/>
+            </w:pPr>
+            <w:r/>
+            <w:r>
+              <w:rPr>
+                <w:rFonts w:ascii="Times New Roman" w:hAnsi="Times New Roman" w:eastAsia="SimSun"/>
+                <w:b w:val="0"/>
+                <w:sz w:val="21"/>
+              </w:rPr>
+              <w:t>动作预测相关 token 数，对应 action horizon 中用于动作输出的 token。</w:t>
             </w:r>
           </w:p>
         </w:tc>
@@ -792,40 +1184,1938 @@
       <w:tr>
         <w:tc>
           <w:tcPr>
-            <w:tcW w:type="dxa" w:w="4320"/>
+            <w:tcW w:type="dxa" w:w="3216"/>
+            <w:vAlign w:val="center"/>
           </w:tcPr>
           <w:p>
+            <w:pPr>
+              <w:spacing w:line="360" w:lineRule="auto" w:before="0" w:after="0"/>
+              <w:ind w:firstLine="0"/>
+              <w:jc w:val="center"/>
+            </w:pPr>
+            <w:r/>
             <w:r>
-              <w:t>average total_time</w:t>
+              <w:rPr>
+                <w:rFonts w:ascii="Times New Roman" w:hAnsi="Times New Roman" w:eastAsia="SimSun"/>
+                <w:b w:val="0"/>
+                <w:sz w:val="21"/>
+              </w:rPr>
+              <w:t>seq_len_before</w:t>
             </w:r>
           </w:p>
         </w:tc>
         <w:tc>
           <w:tcPr>
-            <w:tcW w:type="dxa" w:w="4320"/>
+            <w:tcW w:type="dxa" w:w="3216"/>
+            <w:vAlign w:val="center"/>
           </w:tcPr>
           <w:p>
+            <w:pPr>
+              <w:spacing w:line="360" w:lineRule="auto" w:before="0" w:after="0"/>
+              <w:ind w:firstLine="0"/>
+              <w:jc w:val="center"/>
+            </w:pPr>
+            <w:r/>
             <w:r>
-              <w:t>339.891 ms</w:t>
+              <w:rPr>
+                <w:rFonts w:ascii="Times New Roman" w:hAnsi="Times New Roman" w:eastAsia="SimSun"/>
+                <w:b w:val="0"/>
+                <w:sz w:val="21"/>
+              </w:rPr>
+              <w:t>166</w:t>
+            </w:r>
+          </w:p>
+        </w:tc>
+        <w:tc>
+          <w:tcPr>
+            <w:tcW w:type="dxa" w:w="3216"/>
+            <w:vAlign w:val="center"/>
+          </w:tcPr>
+          <w:p>
+            <w:pPr>
+              <w:spacing w:line="360" w:lineRule="auto" w:before="0" w:after="0"/>
+              <w:ind w:firstLine="0"/>
+              <w:jc w:val="left"/>
+            </w:pPr>
+            <w:r/>
+            <w:r>
+              <w:rPr>
+                <w:rFonts w:ascii="Times New Roman" w:hAnsi="Times New Roman" w:eastAsia="SimSun"/>
+                <w:b w:val="0"/>
+                <w:sz w:val="21"/>
+              </w:rPr>
+              <w:t>剪枝前总序列长度，计算为 53 + 81 + 32。</w:t>
+            </w:r>
+          </w:p>
+        </w:tc>
+      </w:tr>
+      <w:tr>
+        <w:tc>
+          <w:tcPr>
+            <w:tcW w:type="dxa" w:w="3216"/>
+            <w:vAlign w:val="center"/>
+          </w:tcPr>
+          <w:p>
+            <w:pPr>
+              <w:spacing w:line="360" w:lineRule="auto" w:before="0" w:after="0"/>
+              <w:ind w:firstLine="0"/>
+              <w:jc w:val="center"/>
+            </w:pPr>
+            <w:r/>
+            <w:r>
+              <w:rPr>
+                <w:rFonts w:ascii="Times New Roman" w:hAnsi="Times New Roman" w:eastAsia="SimSun"/>
+                <w:b w:val="0"/>
+                <w:sz w:val="21"/>
+              </w:rPr>
+              <w:t>seq_len_after</w:t>
+            </w:r>
+          </w:p>
+        </w:tc>
+        <w:tc>
+          <w:tcPr>
+            <w:tcW w:type="dxa" w:w="3216"/>
+            <w:vAlign w:val="center"/>
+          </w:tcPr>
+          <w:p>
+            <w:pPr>
+              <w:spacing w:line="360" w:lineRule="auto" w:before="0" w:after="0"/>
+              <w:ind w:firstLine="0"/>
+              <w:jc w:val="center"/>
+            </w:pPr>
+            <w:r/>
+            <w:r>
+              <w:rPr>
+                <w:rFonts w:ascii="Times New Roman" w:hAnsi="Times New Roman" w:eastAsia="SimSun"/>
+                <w:b w:val="0"/>
+                <w:sz w:val="21"/>
+              </w:rPr>
+              <w:t>126</w:t>
+            </w:r>
+          </w:p>
+        </w:tc>
+        <w:tc>
+          <w:tcPr>
+            <w:tcW w:type="dxa" w:w="3216"/>
+            <w:vAlign w:val="center"/>
+          </w:tcPr>
+          <w:p>
+            <w:pPr>
+              <w:spacing w:line="360" w:lineRule="auto" w:before="0" w:after="0"/>
+              <w:ind w:firstLine="0"/>
+              <w:jc w:val="left"/>
+            </w:pPr>
+            <w:r/>
+            <w:r>
+              <w:rPr>
+                <w:rFonts w:ascii="Times New Roman" w:hAnsi="Times New Roman" w:eastAsia="SimSun"/>
+                <w:b w:val="0"/>
+                <w:sz w:val="21"/>
+              </w:rPr>
+              <w:t>剪枝后总序列长度，计算为 53 + 41 + 32。</w:t>
+            </w:r>
+          </w:p>
+        </w:tc>
+      </w:tr>
+      <w:tr>
+        <w:tc>
+          <w:tcPr>
+            <w:tcW w:type="dxa" w:w="3216"/>
+            <w:vAlign w:val="center"/>
+          </w:tcPr>
+          <w:p>
+            <w:pPr>
+              <w:spacing w:line="360" w:lineRule="auto" w:before="0" w:after="0"/>
+              <w:ind w:firstLine="0"/>
+              <w:jc w:val="center"/>
+            </w:pPr>
+            <w:r/>
+            <w:r>
+              <w:rPr>
+                <w:rFonts w:ascii="Times New Roman" w:hAnsi="Times New Roman" w:eastAsia="SimSun"/>
+                <w:b w:val="0"/>
+                <w:sz w:val="21"/>
+              </w:rPr>
+              <w:t>attention_ratio</w:t>
+            </w:r>
+          </w:p>
+        </w:tc>
+        <w:tc>
+          <w:tcPr>
+            <w:tcW w:type="dxa" w:w="3216"/>
+            <w:vAlign w:val="center"/>
+          </w:tcPr>
+          <w:p>
+            <w:pPr>
+              <w:spacing w:line="360" w:lineRule="auto" w:before="0" w:after="0"/>
+              <w:ind w:firstLine="0"/>
+              <w:jc w:val="center"/>
+            </w:pPr>
+            <w:r/>
+            <w:r>
+              <w:rPr>
+                <w:rFonts w:ascii="Times New Roman" w:hAnsi="Times New Roman" w:eastAsia="SimSun"/>
+                <w:b w:val="0"/>
+                <w:sz w:val="21"/>
+              </w:rPr>
+              <w:t>0.576136</w:t>
+            </w:r>
+          </w:p>
+        </w:tc>
+        <w:tc>
+          <w:tcPr>
+            <w:tcW w:type="dxa" w:w="3216"/>
+            <w:vAlign w:val="center"/>
+          </w:tcPr>
+          <w:p>
+            <w:pPr>
+              <w:spacing w:line="360" w:lineRule="auto" w:before="0" w:after="0"/>
+              <w:ind w:firstLine="0"/>
+              <w:jc w:val="left"/>
+            </w:pPr>
+            <w:r/>
+            <w:r>
+              <w:rPr>
+                <w:rFonts w:ascii="Times New Roman" w:hAnsi="Times New Roman" w:eastAsia="SimSun"/>
+                <w:b w:val="0"/>
+                <w:sz w:val="21"/>
+              </w:rPr>
+              <w:t>剪枝后 attention 理论复杂度与剪枝前的比例。</w:t>
+            </w:r>
+          </w:p>
+        </w:tc>
+      </w:tr>
+      <w:tr>
+        <w:tc>
+          <w:tcPr>
+            <w:tcW w:type="dxa" w:w="3216"/>
+            <w:vAlign w:val="center"/>
+          </w:tcPr>
+          <w:p>
+            <w:pPr>
+              <w:spacing w:line="360" w:lineRule="auto" w:before="0" w:after="0"/>
+              <w:ind w:firstLine="0"/>
+              <w:jc w:val="center"/>
+            </w:pPr>
+            <w:r/>
+            <w:r>
+              <w:rPr>
+                <w:rFonts w:ascii="Times New Roman" w:hAnsi="Times New Roman" w:eastAsia="SimSun"/>
+                <w:b w:val="0"/>
+                <w:sz w:val="21"/>
+              </w:rPr>
+              <w:t>estimated_attention_reduction</w:t>
+            </w:r>
+          </w:p>
+        </w:tc>
+        <w:tc>
+          <w:tcPr>
+            <w:tcW w:type="dxa" w:w="3216"/>
+            <w:vAlign w:val="center"/>
+          </w:tcPr>
+          <w:p>
+            <w:pPr>
+              <w:spacing w:line="360" w:lineRule="auto" w:before="0" w:after="0"/>
+              <w:ind w:firstLine="0"/>
+              <w:jc w:val="center"/>
+            </w:pPr>
+            <w:r/>
+            <w:r>
+              <w:rPr>
+                <w:rFonts w:ascii="Times New Roman" w:hAnsi="Times New Roman" w:eastAsia="SimSun"/>
+                <w:b w:val="0"/>
+                <w:sz w:val="21"/>
+              </w:rPr>
+              <w:t>42.39%</w:t>
+            </w:r>
+          </w:p>
+        </w:tc>
+        <w:tc>
+          <w:tcPr>
+            <w:tcW w:type="dxa" w:w="3216"/>
+            <w:vAlign w:val="center"/>
+          </w:tcPr>
+          <w:p>
+            <w:pPr>
+              <w:spacing w:line="360" w:lineRule="auto" w:before="0" w:after="0"/>
+              <w:ind w:firstLine="0"/>
+              <w:jc w:val="left"/>
+            </w:pPr>
+            <w:r/>
+            <w:r>
+              <w:rPr>
+                <w:rFonts w:ascii="Times New Roman" w:hAnsi="Times New Roman" w:eastAsia="SimSun"/>
+                <w:b w:val="0"/>
+                <w:sz w:val="21"/>
+              </w:rPr>
+              <w:t>按 attention 平方复杂度估算得到的理论 attention 计算量下降比例。</w:t>
+            </w:r>
+          </w:p>
+        </w:tc>
+      </w:tr>
+      <w:tr>
+        <w:tc>
+          <w:tcPr>
+            <w:tcW w:type="dxa" w:w="3216"/>
+            <w:vAlign w:val="center"/>
+          </w:tcPr>
+          <w:p>
+            <w:pPr>
+              <w:spacing w:line="360" w:lineRule="auto" w:before="0" w:after="0"/>
+              <w:ind w:firstLine="0"/>
+              <w:jc w:val="center"/>
+            </w:pPr>
+            <w:r/>
+            <w:r>
+              <w:rPr>
+                <w:rFonts w:ascii="Times New Roman" w:hAnsi="Times New Roman" w:eastAsia="SimSun"/>
+                <w:b w:val="0"/>
+                <w:sz w:val="21"/>
+              </w:rPr>
+              <w:t>estimated_train_flops_before</w:t>
+            </w:r>
+          </w:p>
+        </w:tc>
+        <w:tc>
+          <w:tcPr>
+            <w:tcW w:type="dxa" w:w="3216"/>
+            <w:vAlign w:val="center"/>
+          </w:tcPr>
+          <w:p>
+            <w:pPr>
+              <w:spacing w:line="360" w:lineRule="auto" w:before="0" w:after="0"/>
+              <w:ind w:firstLine="0"/>
+              <w:jc w:val="center"/>
+            </w:pPr>
+            <w:r/>
+            <w:r>
+              <w:rPr>
+                <w:rFonts w:ascii="Times New Roman" w:hAnsi="Times New Roman" w:eastAsia="SimSun"/>
+                <w:b w:val="0"/>
+                <w:sz w:val="21"/>
+              </w:rPr>
+              <w:t>1,509,725,809,920</w:t>
+            </w:r>
+          </w:p>
+        </w:tc>
+        <w:tc>
+          <w:tcPr>
+            <w:tcW w:type="dxa" w:w="3216"/>
+            <w:vAlign w:val="center"/>
+          </w:tcPr>
+          <w:p>
+            <w:pPr>
+              <w:spacing w:line="360" w:lineRule="auto" w:before="0" w:after="0"/>
+              <w:ind w:firstLine="0"/>
+              <w:jc w:val="left"/>
+            </w:pPr>
+            <w:r/>
+            <w:r>
+              <w:rPr>
+                <w:rFonts w:ascii="Times New Roman" w:hAnsi="Times New Roman" w:eastAsia="SimSun"/>
+                <w:b w:val="0"/>
+                <w:sz w:val="21"/>
+              </w:rPr>
+              <w:t>复用 num_floating_point_operations(...) 得到的剪枝前粗粒度训练级 FLOPs 估算。</w:t>
+            </w:r>
+          </w:p>
+        </w:tc>
+      </w:tr>
+      <w:tr>
+        <w:tc>
+          <w:tcPr>
+            <w:tcW w:type="dxa" w:w="3216"/>
+            <w:vAlign w:val="center"/>
+          </w:tcPr>
+          <w:p>
+            <w:pPr>
+              <w:spacing w:line="360" w:lineRule="auto" w:before="0" w:after="0"/>
+              <w:ind w:firstLine="0"/>
+              <w:jc w:val="center"/>
+            </w:pPr>
+            <w:r/>
+            <w:r>
+              <w:rPr>
+                <w:rFonts w:ascii="Times New Roman" w:hAnsi="Times New Roman" w:eastAsia="SimSun"/>
+                <w:b w:val="0"/>
+                <w:sz w:val="21"/>
+              </w:rPr>
+              <w:t>estimated_train_flops_after</w:t>
+            </w:r>
+          </w:p>
+        </w:tc>
+        <w:tc>
+          <w:tcPr>
+            <w:tcW w:type="dxa" w:w="3216"/>
+            <w:vAlign w:val="center"/>
+          </w:tcPr>
+          <w:p>
+            <w:pPr>
+              <w:spacing w:line="360" w:lineRule="auto" w:before="0" w:after="0"/>
+              <w:ind w:firstLine="0"/>
+              <w:jc w:val="center"/>
+            </w:pPr>
+            <w:r/>
+            <w:r>
+              <w:rPr>
+                <w:rFonts w:ascii="Times New Roman" w:hAnsi="Times New Roman" w:eastAsia="SimSun"/>
+                <w:b w:val="0"/>
+                <w:sz w:val="21"/>
+              </w:rPr>
+              <w:t>1,357,458,597,120</w:t>
+            </w:r>
+          </w:p>
+        </w:tc>
+        <w:tc>
+          <w:tcPr>
+            <w:tcW w:type="dxa" w:w="3216"/>
+            <w:vAlign w:val="center"/>
+          </w:tcPr>
+          <w:p>
+            <w:pPr>
+              <w:spacing w:line="360" w:lineRule="auto" w:before="0" w:after="0"/>
+              <w:ind w:firstLine="0"/>
+              <w:jc w:val="left"/>
+            </w:pPr>
+            <w:r/>
+            <w:r>
+              <w:rPr>
+                <w:rFonts w:ascii="Times New Roman" w:hAnsi="Times New Roman" w:eastAsia="SimSun"/>
+                <w:b w:val="0"/>
+                <w:sz w:val="21"/>
+              </w:rPr>
+              <w:t>复用 num_floating_point_operations(...) 得到的剪枝后粗粒度训练级 FLOPs 估算。</w:t>
+            </w:r>
+          </w:p>
+        </w:tc>
+      </w:tr>
+      <w:tr>
+        <w:tc>
+          <w:tcPr>
+            <w:tcW w:type="dxa" w:w="3216"/>
+            <w:vAlign w:val="center"/>
+          </w:tcPr>
+          <w:p>
+            <w:pPr>
+              <w:spacing w:line="360" w:lineRule="auto" w:before="0" w:after="0"/>
+              <w:ind w:firstLine="0"/>
+              <w:jc w:val="center"/>
+            </w:pPr>
+            <w:r/>
+            <w:r>
+              <w:rPr>
+                <w:rFonts w:ascii="Times New Roman" w:hAnsi="Times New Roman" w:eastAsia="SimSun"/>
+                <w:b w:val="0"/>
+                <w:sz w:val="21"/>
+              </w:rPr>
+              <w:t>estimated_train_flops_ratio</w:t>
+            </w:r>
+          </w:p>
+        </w:tc>
+        <w:tc>
+          <w:tcPr>
+            <w:tcW w:type="dxa" w:w="3216"/>
+            <w:vAlign w:val="center"/>
+          </w:tcPr>
+          <w:p>
+            <w:pPr>
+              <w:spacing w:line="360" w:lineRule="auto" w:before="0" w:after="0"/>
+              <w:ind w:firstLine="0"/>
+              <w:jc w:val="center"/>
+            </w:pPr>
+            <w:r/>
+            <w:r>
+              <w:rPr>
+                <w:rFonts w:ascii="Times New Roman" w:hAnsi="Times New Roman" w:eastAsia="SimSun"/>
+                <w:b w:val="0"/>
+                <w:sz w:val="21"/>
+              </w:rPr>
+              <w:t>0.899142</w:t>
+            </w:r>
+          </w:p>
+        </w:tc>
+        <w:tc>
+          <w:tcPr>
+            <w:tcW w:type="dxa" w:w="3216"/>
+            <w:vAlign w:val="center"/>
+          </w:tcPr>
+          <w:p>
+            <w:pPr>
+              <w:spacing w:line="360" w:lineRule="auto" w:before="0" w:after="0"/>
+              <w:ind w:firstLine="0"/>
+              <w:jc w:val="left"/>
+            </w:pPr>
+            <w:r/>
+            <w:r>
+              <w:rPr>
+                <w:rFonts w:ascii="Times New Roman" w:hAnsi="Times New Roman" w:eastAsia="SimSun"/>
+                <w:b w:val="0"/>
+                <w:sz w:val="21"/>
+              </w:rPr>
+              <w:t>剪枝后粗粒度 FLOPs 与剪枝前的比例。</w:t>
+            </w:r>
+          </w:p>
+        </w:tc>
+      </w:tr>
+      <w:tr>
+        <w:tc>
+          <w:tcPr>
+            <w:tcW w:type="dxa" w:w="3216"/>
+            <w:vAlign w:val="center"/>
+          </w:tcPr>
+          <w:p>
+            <w:pPr>
+              <w:spacing w:line="360" w:lineRule="auto" w:before="0" w:after="0"/>
+              <w:ind w:firstLine="0"/>
+              <w:jc w:val="center"/>
+            </w:pPr>
+            <w:r/>
+            <w:r>
+              <w:rPr>
+                <w:rFonts w:ascii="Times New Roman" w:hAnsi="Times New Roman" w:eastAsia="SimSun"/>
+                <w:b w:val="0"/>
+                <w:sz w:val="21"/>
+              </w:rPr>
+              <w:t>estimated_train_flops_reduction</w:t>
+            </w:r>
+          </w:p>
+        </w:tc>
+        <w:tc>
+          <w:tcPr>
+            <w:tcW w:type="dxa" w:w="3216"/>
+            <w:vAlign w:val="center"/>
+          </w:tcPr>
+          <w:p>
+            <w:pPr>
+              <w:spacing w:line="360" w:lineRule="auto" w:before="0" w:after="0"/>
+              <w:ind w:firstLine="0"/>
+              <w:jc w:val="center"/>
+            </w:pPr>
+            <w:r/>
+            <w:r>
+              <w:rPr>
+                <w:rFonts w:ascii="Times New Roman" w:hAnsi="Times New Roman" w:eastAsia="SimSun"/>
+                <w:b w:val="0"/>
+                <w:sz w:val="21"/>
+              </w:rPr>
+              <w:t>10.09%</w:t>
+            </w:r>
+          </w:p>
+        </w:tc>
+        <w:tc>
+          <w:tcPr>
+            <w:tcW w:type="dxa" w:w="3216"/>
+            <w:vAlign w:val="center"/>
+          </w:tcPr>
+          <w:p>
+            <w:pPr>
+              <w:spacing w:line="360" w:lineRule="auto" w:before="0" w:after="0"/>
+              <w:ind w:firstLine="0"/>
+              <w:jc w:val="left"/>
+            </w:pPr>
+            <w:r/>
+            <w:r>
+              <w:rPr>
+                <w:rFonts w:ascii="Times New Roman" w:hAnsi="Times New Roman" w:eastAsia="SimSun"/>
+                <w:b w:val="0"/>
+                <w:sz w:val="21"/>
+              </w:rPr>
+              <w:t>粗粒度 FLOPs 估算下降比例。</w:t>
             </w:r>
           </w:p>
         </w:tc>
       </w:tr>
     </w:tbl>
+    <w:p/>
     <w:p>
+      <w:pPr>
+        <w:spacing w:line="360" w:lineRule="auto" w:before="0" w:after="120"/>
+        <w:ind w:firstLine="420"/>
+      </w:pPr>
       <w:r>
         <w:rPr>
+          <w:rFonts w:ascii="Times New Roman" w:hAnsi="Times New Roman" w:eastAsia="SimSun"/>
+          <w:b w:val="0"/>
+          <w:sz w:val="21"/>
+        </w:rPr>
+        <w:t>将本次实际 token 数代入公式，可以得到下面的推导过程。</w:t>
+      </w:r>
+    </w:p>
+    <w:p>
+      <w:pPr>
+        <w:spacing w:line="360" w:lineRule="auto" w:before="0" w:after="120"/>
+        <w:ind w:firstLine="0"/>
+        <w:jc w:val="center"/>
+      </w:pPr>
+      <m:oMathPara>
+        <m:oMath>
+          <m:r>
+            <m:rPr/>
+            <m:t>seq_len_before = 53 + 81 + 32 = 166</m:t>
+          </m:r>
+        </m:oMath>
+      </m:oMathPara>
+    </w:p>
+    <w:p>
+      <w:pPr>
+        <w:spacing w:line="360" w:lineRule="auto" w:before="0" w:after="120"/>
+        <w:ind w:firstLine="0"/>
+        <w:jc w:val="center"/>
+      </w:pPr>
+      <m:oMathPara>
+        <m:oMath>
+          <m:r>
+            <m:rPr/>
+            <m:t>seq_len_after = 53 + 41 + 32 = 126</m:t>
+          </m:r>
+        </m:oMath>
+      </m:oMathPara>
+    </w:p>
+    <w:p>
+      <w:pPr>
+        <w:spacing w:line="360" w:lineRule="auto" w:before="0" w:after="120"/>
+        <w:ind w:firstLine="0"/>
+        <w:jc w:val="center"/>
+      </w:pPr>
+      <m:oMathPara>
+        <m:oMath>
+          <m:r>
+            <m:rPr/>
+            <m:t>attention_ratio = 126² / 166² = 15876 / 27556 = 0.576136</m:t>
+          </m:r>
+        </m:oMath>
+      </m:oMathPara>
+    </w:p>
+    <w:p>
+      <w:pPr>
+        <w:spacing w:line="360" w:lineRule="auto" w:before="0" w:after="120"/>
+        <w:ind w:firstLine="0"/>
+        <w:jc w:val="center"/>
+      </w:pPr>
+      <m:oMathPara>
+        <m:oMath>
+          <m:r>
+            <m:rPr/>
+            <m:t>estimated_attention_reduction = (1 − 0.576136) × 100% = 42.39%</m:t>
+          </m:r>
+        </m:oMath>
+      </m:oMathPara>
+    </w:p>
+    <w:p>
+      <w:pPr>
+        <w:spacing w:line="360" w:lineRule="auto" w:before="0" w:after="120"/>
+        <w:ind w:firstLine="0"/>
+      </w:pPr>
+      <w:r>
+        <w:rPr>
+          <w:rFonts w:ascii="Times New Roman" w:hAnsi="Times New Roman" w:eastAsia="SimSun"/>
           <w:b/>
+          <w:sz w:val="24"/>
         </w:rPr>
-        <w:t>备注：</w:t>
+        <w:t>七、时间统计输出结果</w:t>
       </w:r>
+    </w:p>
+    <w:p>
+      <w:pPr>
+        <w:spacing w:line="360" w:lineRule="auto" w:before="0" w:after="120"/>
+        <w:ind w:firstLine="420"/>
+      </w:pPr>
       <w:r>
-        <w:t>本报告采用的复杂度统计是基于 token 长度的理论估算，时间统计来自 CUDA Event 的实际推理计时。</w:t>
+        <w:rPr>
+          <w:rFonts w:ascii="Times New Roman" w:hAnsi="Times New Roman" w:eastAsia="SimSun"/>
+          <w:b w:val="0"/>
+          <w:sz w:val="21"/>
+        </w:rPr>
+        <w:t>时间统计使用 CUDA Event 完成，因此它反映的是本次程序在 GPU 上实际跑出来的耗时。下面表格中的“最后一次耗时”来自最后一轮推理日志，“平均耗时”来自 20 次正式推理的平均 total_time。</w:t>
+      </w:r>
+    </w:p>
+    <w:tbl>
+      <w:tblPr>
+        <w:tblStyle w:val="TableGrid"/>
+        <w:tblW w:type="auto" w:w="0"/>
+        <w:jc w:val="center"/>
+        <w:tblLook w:firstColumn="1" w:firstRow="1" w:lastColumn="0" w:lastRow="0" w:noHBand="0" w:noVBand="1" w:val="04A0"/>
+      </w:tblPr>
+      <w:tblGrid>
+        <w:gridCol w:w="3216"/>
+        <w:gridCol w:w="3216"/>
+        <w:gridCol w:w="3216"/>
+      </w:tblGrid>
+      <w:tr>
+        <w:tc>
+          <w:tcPr>
+            <w:tcW w:type="dxa" w:w="3216"/>
+            <w:vAlign w:val="center"/>
+            <w:shd w:fill="D9EAF7"/>
+          </w:tcPr>
+          <w:p>
+            <w:pPr>
+              <w:spacing w:line="360" w:lineRule="auto" w:before="0" w:after="0"/>
+              <w:ind w:firstLine="0"/>
+              <w:jc w:val="center"/>
+            </w:pPr>
+            <w:r/>
+            <w:r>
+              <w:rPr>
+                <w:rFonts w:ascii="Times New Roman" w:hAnsi="Times New Roman" w:eastAsia="SimSun"/>
+                <w:b/>
+                <w:sz w:val="21"/>
+              </w:rPr>
+              <w:t>计时项</w:t>
+            </w:r>
+          </w:p>
+        </w:tc>
+        <w:tc>
+          <w:tcPr>
+            <w:tcW w:type="dxa" w:w="3216"/>
+            <w:vAlign w:val="center"/>
+            <w:shd w:fill="D9EAF7"/>
+          </w:tcPr>
+          <w:p>
+            <w:pPr>
+              <w:spacing w:line="360" w:lineRule="auto" w:before="0" w:after="0"/>
+              <w:ind w:firstLine="0"/>
+              <w:jc w:val="center"/>
+            </w:pPr>
+            <w:r/>
+            <w:r>
+              <w:rPr>
+                <w:rFonts w:ascii="Times New Roman" w:hAnsi="Times New Roman" w:eastAsia="SimSun"/>
+                <w:b/>
+                <w:sz w:val="21"/>
+              </w:rPr>
+              <w:t>最后一次耗时</w:t>
+            </w:r>
+          </w:p>
+        </w:tc>
+        <w:tc>
+          <w:tcPr>
+            <w:tcW w:type="dxa" w:w="3216"/>
+            <w:vAlign w:val="center"/>
+            <w:shd w:fill="D9EAF7"/>
+          </w:tcPr>
+          <w:p>
+            <w:pPr>
+              <w:spacing w:line="360" w:lineRule="auto" w:before="0" w:after="0"/>
+              <w:ind w:firstLine="0"/>
+              <w:jc w:val="center"/>
+            </w:pPr>
+            <w:r/>
+            <w:r>
+              <w:rPr>
+                <w:rFonts w:ascii="Times New Roman" w:hAnsi="Times New Roman" w:eastAsia="SimSun"/>
+                <w:b/>
+                <w:sz w:val="21"/>
+              </w:rPr>
+              <w:t>说明</w:t>
+            </w:r>
+          </w:p>
+        </w:tc>
+      </w:tr>
+      <w:tr>
+        <w:tc>
+          <w:tcPr>
+            <w:tcW w:type="dxa" w:w="3216"/>
+            <w:vAlign w:val="center"/>
+          </w:tcPr>
+          <w:p>
+            <w:pPr>
+              <w:spacing w:line="360" w:lineRule="auto" w:before="0" w:after="0"/>
+              <w:ind w:firstLine="0"/>
+              <w:jc w:val="center"/>
+            </w:pPr>
+            <w:r/>
+            <w:r>
+              <w:rPr>
+                <w:rFonts w:ascii="Times New Roman" w:hAnsi="Times New Roman" w:eastAsia="SimSun"/>
+                <w:b w:val="0"/>
+                <w:sz w:val="21"/>
+              </w:rPr>
+              <w:t>vision_image_forward</w:t>
+            </w:r>
+          </w:p>
+        </w:tc>
+        <w:tc>
+          <w:tcPr>
+            <w:tcW w:type="dxa" w:w="3216"/>
+            <w:vAlign w:val="center"/>
+          </w:tcPr>
+          <w:p>
+            <w:pPr>
+              <w:spacing w:line="360" w:lineRule="auto" w:before="0" w:after="0"/>
+              <w:ind w:firstLine="0"/>
+              <w:jc w:val="center"/>
+            </w:pPr>
+            <w:r/>
+            <w:r>
+              <w:rPr>
+                <w:rFonts w:ascii="Times New Roman" w:hAnsi="Times New Roman" w:eastAsia="SimSun"/>
+                <w:b w:val="0"/>
+                <w:sz w:val="21"/>
+              </w:rPr>
+              <w:t>26.506 ms</w:t>
+            </w:r>
+          </w:p>
+        </w:tc>
+        <w:tc>
+          <w:tcPr>
+            <w:tcW w:type="dxa" w:w="3216"/>
+            <w:vAlign w:val="center"/>
+          </w:tcPr>
+          <w:p>
+            <w:pPr>
+              <w:spacing w:line="360" w:lineRule="auto" w:before="0" w:after="0"/>
+              <w:ind w:firstLine="0"/>
+              <w:jc w:val="left"/>
+            </w:pPr>
+            <w:r/>
+            <w:r>
+              <w:rPr>
+                <w:rFonts w:ascii="Times New Roman" w:hAnsi="Times New Roman" w:eastAsia="SimSun"/>
+                <w:b w:val="0"/>
+                <w:sz w:val="21"/>
+              </w:rPr>
+              <w:t>视觉塔处理图像的耗时。</w:t>
+            </w:r>
+          </w:p>
+        </w:tc>
+      </w:tr>
+      <w:tr>
+        <w:tc>
+          <w:tcPr>
+            <w:tcW w:type="dxa" w:w="3216"/>
+            <w:vAlign w:val="center"/>
+          </w:tcPr>
+          <w:p>
+            <w:pPr>
+              <w:spacing w:line="360" w:lineRule="auto" w:before="0" w:after="0"/>
+              <w:ind w:firstLine="0"/>
+              <w:jc w:val="center"/>
+            </w:pPr>
+            <w:r/>
+            <w:r>
+              <w:rPr>
+                <w:rFonts w:ascii="Times New Roman" w:hAnsi="Times New Roman" w:eastAsia="SimSun"/>
+                <w:b w:val="0"/>
+                <w:sz w:val="21"/>
+              </w:rPr>
+              <w:t>embed_processing</w:t>
+            </w:r>
+          </w:p>
+        </w:tc>
+        <w:tc>
+          <w:tcPr>
+            <w:tcW w:type="dxa" w:w="3216"/>
+            <w:vAlign w:val="center"/>
+          </w:tcPr>
+          <w:p>
+            <w:pPr>
+              <w:spacing w:line="360" w:lineRule="auto" w:before="0" w:after="0"/>
+              <w:ind w:firstLine="0"/>
+              <w:jc w:val="center"/>
+            </w:pPr>
+            <w:r/>
+            <w:r>
+              <w:rPr>
+                <w:rFonts w:ascii="Times New Roman" w:hAnsi="Times New Roman" w:eastAsia="SimSun"/>
+                <w:b w:val="0"/>
+                <w:sz w:val="21"/>
+              </w:rPr>
+              <w:t>26.840 ms</w:t>
+            </w:r>
+          </w:p>
+        </w:tc>
+        <w:tc>
+          <w:tcPr>
+            <w:tcW w:type="dxa" w:w="3216"/>
+            <w:vAlign w:val="center"/>
+          </w:tcPr>
+          <w:p>
+            <w:pPr>
+              <w:spacing w:line="360" w:lineRule="auto" w:before="0" w:after="0"/>
+              <w:ind w:firstLine="0"/>
+              <w:jc w:val="left"/>
+            </w:pPr>
+            <w:r/>
+            <w:r>
+              <w:rPr>
+                <w:rFonts w:ascii="Times New Roman" w:hAnsi="Times New Roman" w:eastAsia="SimSun"/>
+                <w:b w:val="0"/>
+                <w:sz w:val="21"/>
+              </w:rPr>
+              <w:t>embedding 和多模态输入拼接处理耗时；该项包含视觉特征写入输入 embedding 的过程。</w:t>
+            </w:r>
+          </w:p>
+        </w:tc>
+      </w:tr>
+      <w:tr>
+        <w:tc>
+          <w:tcPr>
+            <w:tcW w:type="dxa" w:w="3216"/>
+            <w:vAlign w:val="center"/>
+          </w:tcPr>
+          <w:p>
+            <w:pPr>
+              <w:spacing w:line="360" w:lineRule="auto" w:before="0" w:after="0"/>
+              <w:ind w:firstLine="0"/>
+              <w:jc w:val="center"/>
+            </w:pPr>
+            <w:r/>
+            <w:r>
+              <w:rPr>
+                <w:rFonts w:ascii="Times New Roman" w:hAnsi="Times New Roman" w:eastAsia="SimSun"/>
+                <w:b w:val="0"/>
+                <w:sz w:val="21"/>
+              </w:rPr>
+              <w:t>position_encoding</w:t>
+            </w:r>
+          </w:p>
+        </w:tc>
+        <w:tc>
+          <w:tcPr>
+            <w:tcW w:type="dxa" w:w="3216"/>
+            <w:vAlign w:val="center"/>
+          </w:tcPr>
+          <w:p>
+            <w:pPr>
+              <w:spacing w:line="360" w:lineRule="auto" w:before="0" w:after="0"/>
+              <w:ind w:firstLine="0"/>
+              <w:jc w:val="center"/>
+            </w:pPr>
+            <w:r/>
+            <w:r>
+              <w:rPr>
+                <w:rFonts w:ascii="Times New Roman" w:hAnsi="Times New Roman" w:eastAsia="SimSun"/>
+                <w:b w:val="0"/>
+                <w:sz w:val="21"/>
+              </w:rPr>
+              <w:t>0.573 ms</w:t>
+            </w:r>
+          </w:p>
+        </w:tc>
+        <w:tc>
+          <w:tcPr>
+            <w:tcW w:type="dxa" w:w="3216"/>
+            <w:vAlign w:val="center"/>
+          </w:tcPr>
+          <w:p>
+            <w:pPr>
+              <w:spacing w:line="360" w:lineRule="auto" w:before="0" w:after="0"/>
+              <w:ind w:firstLine="0"/>
+              <w:jc w:val="left"/>
+            </w:pPr>
+            <w:r/>
+            <w:r>
+              <w:rPr>
+                <w:rFonts w:ascii="Times New Roman" w:hAnsi="Times New Roman" w:eastAsia="SimSun"/>
+                <w:b w:val="0"/>
+                <w:sz w:val="21"/>
+              </w:rPr>
+              <w:t>RoPE / position id 等位置编码准备耗时。</w:t>
+            </w:r>
+          </w:p>
+        </w:tc>
+      </w:tr>
+      <w:tr>
+        <w:tc>
+          <w:tcPr>
+            <w:tcW w:type="dxa" w:w="3216"/>
+            <w:vAlign w:val="center"/>
+          </w:tcPr>
+          <w:p>
+            <w:pPr>
+              <w:spacing w:line="360" w:lineRule="auto" w:before="0" w:after="0"/>
+              <w:ind w:firstLine="0"/>
+              <w:jc w:val="center"/>
+            </w:pPr>
+            <w:r/>
+            <w:r>
+              <w:rPr>
+                <w:rFonts w:ascii="Times New Roman" w:hAnsi="Times New Roman" w:eastAsia="SimSun"/>
+                <w:b w:val="0"/>
+                <w:sz w:val="21"/>
+              </w:rPr>
+              <w:t>action_initialization</w:t>
+            </w:r>
+          </w:p>
+        </w:tc>
+        <w:tc>
+          <w:tcPr>
+            <w:tcW w:type="dxa" w:w="3216"/>
+            <w:vAlign w:val="center"/>
+          </w:tcPr>
+          <w:p>
+            <w:pPr>
+              <w:spacing w:line="360" w:lineRule="auto" w:before="0" w:after="0"/>
+              <w:ind w:firstLine="0"/>
+              <w:jc w:val="center"/>
+            </w:pPr>
+            <w:r/>
+            <w:r>
+              <w:rPr>
+                <w:rFonts w:ascii="Times New Roman" w:hAnsi="Times New Roman" w:eastAsia="SimSun"/>
+                <w:b w:val="0"/>
+                <w:sz w:val="21"/>
+              </w:rPr>
+              <w:t>0.363 ms</w:t>
+            </w:r>
+          </w:p>
+        </w:tc>
+        <w:tc>
+          <w:tcPr>
+            <w:tcW w:type="dxa" w:w="3216"/>
+            <w:vAlign w:val="center"/>
+          </w:tcPr>
+          <w:p>
+            <w:pPr>
+              <w:spacing w:line="360" w:lineRule="auto" w:before="0" w:after="0"/>
+              <w:ind w:firstLine="0"/>
+              <w:jc w:val="left"/>
+            </w:pPr>
+            <w:r/>
+            <w:r>
+              <w:rPr>
+                <w:rFonts w:ascii="Times New Roman" w:hAnsi="Times New Roman" w:eastAsia="SimSun"/>
+                <w:b w:val="0"/>
+                <w:sz w:val="21"/>
+              </w:rPr>
+              <w:t>diffusion / flow action 初始噪声与 action embedding 初始化耗时。</w:t>
+            </w:r>
+          </w:p>
+        </w:tc>
+      </w:tr>
+      <w:tr>
+        <w:tc>
+          <w:tcPr>
+            <w:tcW w:type="dxa" w:w="3216"/>
+            <w:vAlign w:val="center"/>
+          </w:tcPr>
+          <w:p>
+            <w:pPr>
+              <w:spacing w:line="360" w:lineRule="auto" w:before="0" w:after="0"/>
+              <w:ind w:firstLine="0"/>
+              <w:jc w:val="center"/>
+            </w:pPr>
+            <w:r/>
+            <w:r>
+              <w:rPr>
+                <w:rFonts w:ascii="Times New Roman" w:hAnsi="Times New Roman" w:eastAsia="SimSun"/>
+                <w:b w:val="0"/>
+                <w:sz w:val="21"/>
+              </w:rPr>
+              <w:t>prefetch_forward</w:t>
+            </w:r>
+          </w:p>
+        </w:tc>
+        <w:tc>
+          <w:tcPr>
+            <w:tcW w:type="dxa" w:w="3216"/>
+            <w:vAlign w:val="center"/>
+          </w:tcPr>
+          <w:p>
+            <w:pPr>
+              <w:spacing w:line="360" w:lineRule="auto" w:before="0" w:after="0"/>
+              <w:ind w:firstLine="0"/>
+              <w:jc w:val="center"/>
+            </w:pPr>
+            <w:r/>
+            <w:r>
+              <w:rPr>
+                <w:rFonts w:ascii="Times New Roman" w:hAnsi="Times New Roman" w:eastAsia="SimSun"/>
+                <w:b w:val="0"/>
+                <w:sz w:val="21"/>
+              </w:rPr>
+              <w:t>29.787 ms</w:t>
+            </w:r>
+          </w:p>
+        </w:tc>
+        <w:tc>
+          <w:tcPr>
+            <w:tcW w:type="dxa" w:w="3216"/>
+            <w:vAlign w:val="center"/>
+          </w:tcPr>
+          <w:p>
+            <w:pPr>
+              <w:spacing w:line="360" w:lineRule="auto" w:before="0" w:after="0"/>
+              <w:ind w:firstLine="0"/>
+              <w:jc w:val="left"/>
+            </w:pPr>
+            <w:r/>
+            <w:r>
+              <w:rPr>
+                <w:rFonts w:ascii="Times New Roman" w:hAnsi="Times New Roman" w:eastAsia="SimSun"/>
+                <w:b w:val="0"/>
+                <w:sz w:val="21"/>
+              </w:rPr>
+              <w:t>prefix 阶段 Transformer forward 耗时。</w:t>
+            </w:r>
+          </w:p>
+        </w:tc>
+      </w:tr>
+      <w:tr>
+        <w:tc>
+          <w:tcPr>
+            <w:tcW w:type="dxa" w:w="3216"/>
+            <w:vAlign w:val="center"/>
+          </w:tcPr>
+          <w:p>
+            <w:pPr>
+              <w:spacing w:line="360" w:lineRule="auto" w:before="0" w:after="0"/>
+              <w:ind w:firstLine="0"/>
+              <w:jc w:val="center"/>
+            </w:pPr>
+            <w:r/>
+            <w:r>
+              <w:rPr>
+                <w:rFonts w:ascii="Times New Roman" w:hAnsi="Times New Roman" w:eastAsia="SimSun"/>
+                <w:b w:val="0"/>
+                <w:sz w:val="21"/>
+              </w:rPr>
+              <w:t>cache_preprocessing</w:t>
+            </w:r>
+          </w:p>
+        </w:tc>
+        <w:tc>
+          <w:tcPr>
+            <w:tcW w:type="dxa" w:w="3216"/>
+            <w:vAlign w:val="center"/>
+          </w:tcPr>
+          <w:p>
+            <w:pPr>
+              <w:spacing w:line="360" w:lineRule="auto" w:before="0" w:after="0"/>
+              <w:ind w:firstLine="0"/>
+              <w:jc w:val="center"/>
+            </w:pPr>
+            <w:r/>
+            <w:r>
+              <w:rPr>
+                <w:rFonts w:ascii="Times New Roman" w:hAnsi="Times New Roman" w:eastAsia="SimSun"/>
+                <w:b w:val="0"/>
+                <w:sz w:val="21"/>
+              </w:rPr>
+              <w:t>1.150 ms</w:t>
+            </w:r>
+          </w:p>
+        </w:tc>
+        <w:tc>
+          <w:tcPr>
+            <w:tcW w:type="dxa" w:w="3216"/>
+            <w:vAlign w:val="center"/>
+          </w:tcPr>
+          <w:p>
+            <w:pPr>
+              <w:spacing w:line="360" w:lineRule="auto" w:before="0" w:after="0"/>
+              <w:ind w:firstLine="0"/>
+              <w:jc w:val="left"/>
+            </w:pPr>
+            <w:r/>
+            <w:r>
+              <w:rPr>
+                <w:rFonts w:ascii="Times New Roman" w:hAnsi="Times New Roman" w:eastAsia="SimSun"/>
+                <w:b w:val="0"/>
+                <w:sz w:val="21"/>
+              </w:rPr>
+              <w:t>KV-cache 裁剪和整理耗时。</w:t>
+            </w:r>
+          </w:p>
+        </w:tc>
+      </w:tr>
+      <w:tr>
+        <w:tc>
+          <w:tcPr>
+            <w:tcW w:type="dxa" w:w="3216"/>
+            <w:vAlign w:val="center"/>
+          </w:tcPr>
+          <w:p>
+            <w:pPr>
+              <w:spacing w:line="360" w:lineRule="auto" w:before="0" w:after="0"/>
+              <w:ind w:firstLine="0"/>
+              <w:jc w:val="center"/>
+            </w:pPr>
+            <w:r/>
+            <w:r>
+              <w:rPr>
+                <w:rFonts w:ascii="Times New Roman" w:hAnsi="Times New Roman" w:eastAsia="SimSun"/>
+                <w:b w:val="0"/>
+                <w:sz w:val="21"/>
+              </w:rPr>
+              <w:t>ode_integration</w:t>
+            </w:r>
+          </w:p>
+        </w:tc>
+        <w:tc>
+          <w:tcPr>
+            <w:tcW w:type="dxa" w:w="3216"/>
+            <w:vAlign w:val="center"/>
+          </w:tcPr>
+          <w:p>
+            <w:pPr>
+              <w:spacing w:line="360" w:lineRule="auto" w:before="0" w:after="0"/>
+              <w:ind w:firstLine="0"/>
+              <w:jc w:val="center"/>
+            </w:pPr>
+            <w:r/>
+            <w:r>
+              <w:rPr>
+                <w:rFonts w:ascii="Times New Roman" w:hAnsi="Times New Roman" w:eastAsia="SimSun"/>
+                <w:b w:val="0"/>
+                <w:sz w:val="21"/>
+              </w:rPr>
+              <w:t>276.320 ms</w:t>
+            </w:r>
+          </w:p>
+        </w:tc>
+        <w:tc>
+          <w:tcPr>
+            <w:tcW w:type="dxa" w:w="3216"/>
+            <w:vAlign w:val="center"/>
+          </w:tcPr>
+          <w:p>
+            <w:pPr>
+              <w:spacing w:line="360" w:lineRule="auto" w:before="0" w:after="0"/>
+              <w:ind w:firstLine="0"/>
+              <w:jc w:val="left"/>
+            </w:pPr>
+            <w:r/>
+            <w:r>
+              <w:rPr>
+                <w:rFonts w:ascii="Times New Roman" w:hAnsi="Times New Roman" w:eastAsia="SimSun"/>
+                <w:b w:val="0"/>
+                <w:sz w:val="21"/>
+              </w:rPr>
+              <w:t>ODE integration 多步动作生成耗时，是当前完整推理链路中的主要耗时部分。</w:t>
+            </w:r>
+          </w:p>
+        </w:tc>
+      </w:tr>
+      <w:tr>
+        <w:tc>
+          <w:tcPr>
+            <w:tcW w:type="dxa" w:w="3216"/>
+            <w:vAlign w:val="center"/>
+          </w:tcPr>
+          <w:p>
+            <w:pPr>
+              <w:spacing w:line="360" w:lineRule="auto" w:before="0" w:after="0"/>
+              <w:ind w:firstLine="0"/>
+              <w:jc w:val="center"/>
+            </w:pPr>
+            <w:r/>
+            <w:r>
+              <w:rPr>
+                <w:rFonts w:ascii="Times New Roman" w:hAnsi="Times New Roman" w:eastAsia="SimSun"/>
+                <w:b w:val="0"/>
+                <w:sz w:val="21"/>
+              </w:rPr>
+              <w:t>postprocessing</w:t>
+            </w:r>
+          </w:p>
+        </w:tc>
+        <w:tc>
+          <w:tcPr>
+            <w:tcW w:type="dxa" w:w="3216"/>
+            <w:vAlign w:val="center"/>
+          </w:tcPr>
+          <w:p>
+            <w:pPr>
+              <w:spacing w:line="360" w:lineRule="auto" w:before="0" w:after="0"/>
+              <w:ind w:firstLine="0"/>
+              <w:jc w:val="center"/>
+            </w:pPr>
+            <w:r/>
+            <w:r>
+              <w:rPr>
+                <w:rFonts w:ascii="Times New Roman" w:hAnsi="Times New Roman" w:eastAsia="SimSun"/>
+                <w:b w:val="0"/>
+                <w:sz w:val="21"/>
+              </w:rPr>
+              <w:t>0.010 ms</w:t>
+            </w:r>
+          </w:p>
+        </w:tc>
+        <w:tc>
+          <w:tcPr>
+            <w:tcW w:type="dxa" w:w="3216"/>
+            <w:vAlign w:val="center"/>
+          </w:tcPr>
+          <w:p>
+            <w:pPr>
+              <w:spacing w:line="360" w:lineRule="auto" w:before="0" w:after="0"/>
+              <w:ind w:firstLine="0"/>
+              <w:jc w:val="left"/>
+            </w:pPr>
+            <w:r/>
+            <w:r>
+              <w:rPr>
+                <w:rFonts w:ascii="Times New Roman" w:hAnsi="Times New Roman" w:eastAsia="SimSun"/>
+                <w:b w:val="0"/>
+                <w:sz w:val="21"/>
+              </w:rPr>
+              <w:t>动作反归一化与输出组装耗时。</w:t>
+            </w:r>
+          </w:p>
+        </w:tc>
+      </w:tr>
+      <w:tr>
+        <w:tc>
+          <w:tcPr>
+            <w:tcW w:type="dxa" w:w="3216"/>
+            <w:vAlign w:val="center"/>
+          </w:tcPr>
+          <w:p>
+            <w:pPr>
+              <w:spacing w:line="360" w:lineRule="auto" w:before="0" w:after="0"/>
+              <w:ind w:firstLine="0"/>
+              <w:jc w:val="center"/>
+            </w:pPr>
+            <w:r/>
+            <w:r>
+              <w:rPr>
+                <w:rFonts w:ascii="Times New Roman" w:hAnsi="Times New Roman" w:eastAsia="SimSun"/>
+                <w:b w:val="0"/>
+                <w:sz w:val="21"/>
+              </w:rPr>
+              <w:t>total_time</w:t>
+            </w:r>
+          </w:p>
+        </w:tc>
+        <w:tc>
+          <w:tcPr>
+            <w:tcW w:type="dxa" w:w="3216"/>
+            <w:vAlign w:val="center"/>
+          </w:tcPr>
+          <w:p>
+            <w:pPr>
+              <w:spacing w:line="360" w:lineRule="auto" w:before="0" w:after="0"/>
+              <w:ind w:firstLine="0"/>
+              <w:jc w:val="center"/>
+            </w:pPr>
+            <w:r/>
+            <w:r>
+              <w:rPr>
+                <w:rFonts w:ascii="Times New Roman" w:hAnsi="Times New Roman" w:eastAsia="SimSun"/>
+                <w:b w:val="0"/>
+                <w:sz w:val="21"/>
+              </w:rPr>
+              <w:t>335.468 ms</w:t>
+            </w:r>
+          </w:p>
+        </w:tc>
+        <w:tc>
+          <w:tcPr>
+            <w:tcW w:type="dxa" w:w="3216"/>
+            <w:vAlign w:val="center"/>
+          </w:tcPr>
+          <w:p>
+            <w:pPr>
+              <w:spacing w:line="360" w:lineRule="auto" w:before="0" w:after="0"/>
+              <w:ind w:firstLine="0"/>
+              <w:jc w:val="left"/>
+            </w:pPr>
+            <w:r/>
+            <w:r>
+              <w:rPr>
+                <w:rFonts w:ascii="Times New Roman" w:hAnsi="Times New Roman" w:eastAsia="SimSun"/>
+                <w:b w:val="0"/>
+                <w:sz w:val="21"/>
+              </w:rPr>
+              <w:t>最后一次完整动作预测推理耗时。</w:t>
+            </w:r>
+          </w:p>
+        </w:tc>
+      </w:tr>
+      <w:tr>
+        <w:tc>
+          <w:tcPr>
+            <w:tcW w:type="dxa" w:w="3216"/>
+            <w:vAlign w:val="center"/>
+          </w:tcPr>
+          <w:p>
+            <w:pPr>
+              <w:spacing w:line="360" w:lineRule="auto" w:before="0" w:after="0"/>
+              <w:ind w:firstLine="0"/>
+              <w:jc w:val="center"/>
+            </w:pPr>
+            <w:r/>
+            <w:r>
+              <w:rPr>
+                <w:rFonts w:ascii="Times New Roman" w:hAnsi="Times New Roman" w:eastAsia="SimSun"/>
+                <w:b w:val="0"/>
+                <w:sz w:val="21"/>
+              </w:rPr>
+              <w:t>Average total_time over 20 runs</w:t>
+            </w:r>
+          </w:p>
+        </w:tc>
+        <w:tc>
+          <w:tcPr>
+            <w:tcW w:type="dxa" w:w="3216"/>
+            <w:vAlign w:val="center"/>
+          </w:tcPr>
+          <w:p>
+            <w:pPr>
+              <w:spacing w:line="360" w:lineRule="auto" w:before="0" w:after="0"/>
+              <w:ind w:firstLine="0"/>
+              <w:jc w:val="center"/>
+            </w:pPr>
+            <w:r/>
+            <w:r>
+              <w:rPr>
+                <w:rFonts w:ascii="Times New Roman" w:hAnsi="Times New Roman" w:eastAsia="SimSun"/>
+                <w:b w:val="0"/>
+                <w:sz w:val="21"/>
+              </w:rPr>
+              <w:t>339.891 ms</w:t>
+            </w:r>
+          </w:p>
+        </w:tc>
+        <w:tc>
+          <w:tcPr>
+            <w:tcW w:type="dxa" w:w="3216"/>
+            <w:vAlign w:val="center"/>
+          </w:tcPr>
+          <w:p>
+            <w:pPr>
+              <w:spacing w:line="360" w:lineRule="auto" w:before="0" w:after="0"/>
+              <w:ind w:firstLine="0"/>
+              <w:jc w:val="left"/>
+            </w:pPr>
+            <w:r/>
+            <w:r>
+              <w:rPr>
+                <w:rFonts w:ascii="Times New Roman" w:hAnsi="Times New Roman" w:eastAsia="SimSun"/>
+                <w:b w:val="0"/>
+                <w:sz w:val="21"/>
+              </w:rPr>
+              <w:t>20 次正式统计的平均完整推理耗时，报告中建议优先引用该值。</w:t>
+            </w:r>
+          </w:p>
+        </w:tc>
+      </w:tr>
+    </w:tbl>
+    <w:p/>
+    <w:p>
+      <w:pPr>
+        <w:spacing w:line="360" w:lineRule="auto" w:before="0" w:after="120"/>
+        <w:ind w:firstLine="420"/>
+      </w:pPr>
+      <w:r>
+        <w:rPr>
+          <w:rFonts w:ascii="Times New Roman" w:hAnsi="Times New Roman" w:eastAsia="SimSun"/>
+          <w:b w:val="0"/>
+          <w:sz w:val="21"/>
+        </w:rPr>
+        <w:t>需要注意，时间分项中存在嵌套关系，例如 vision_image_forward 属于 embed_processing 内部的一部分，因此不要把所有分项简单相加当作 total_time。报告中最稳妥的速度指标是 Average total_time over 20 runs = 339.891 ms。</w:t>
+      </w:r>
+    </w:p>
+    <w:p>
+      <w:pPr>
+        <w:spacing w:line="360" w:lineRule="auto" w:before="0" w:after="120"/>
+        <w:ind w:firstLine="0"/>
+      </w:pPr>
+      <w:r>
+        <w:rPr>
+          <w:rFonts w:ascii="Times New Roman" w:hAnsi="Times New Roman" w:eastAsia="SimSun"/>
+          <w:b/>
+          <w:sz w:val="24"/>
+        </w:rPr>
+        <w:t>八、如何解读这次结果</w:t>
+      </w:r>
+    </w:p>
+    <w:p>
+      <w:pPr>
+        <w:spacing w:line="360" w:lineRule="auto" w:before="0" w:after="120"/>
+        <w:ind w:firstLine="420"/>
+      </w:pPr>
+      <w:r>
+        <w:rPr>
+          <w:rFonts w:ascii="Times New Roman" w:hAnsi="Times New Roman" w:eastAsia="SimSun"/>
+          <w:b w:val="0"/>
+          <w:sz w:val="21"/>
+        </w:rPr>
+        <w:t>从复杂度角度看，视觉 token 从 81 减少到 41，总序列长度从 166 降到 126。由于 attention 的主要计算近似与序列长度平方相关，因此理论 attention 复杂度下降到原来的 57.61%，对应下降 42.39%。这说明视觉 token 剪枝确实会显著降低 Transformer attention 部分的理论计算压力。</w:t>
+      </w:r>
+    </w:p>
+    <w:p>
+      <w:pPr>
+        <w:spacing w:line="360" w:lineRule="auto" w:before="0" w:after="120"/>
+        <w:ind w:firstLine="420"/>
+      </w:pPr>
+      <w:r>
+        <w:rPr>
+          <w:rFonts w:ascii="Times New Roman" w:hAnsi="Times New Roman" w:eastAsia="SimSun"/>
+          <w:b w:val="0"/>
+          <w:sz w:val="21"/>
+        </w:rPr>
+        <w:t>从粗粒度 FLOPs 角度看，estimated_train_flops 从约 1.510 × 10^12 降到 1.357 × 10^12，下降 10.09%。这个下降幅度小于 attention 复杂度下降幅度，是正常现象，因为全模型 FLOPs 不只包含 attention，还包括视觉编码、MLP、投影层、action head 等其他计算。</w:t>
+      </w:r>
+    </w:p>
+    <w:p>
+      <w:pPr>
+        <w:spacing w:line="360" w:lineRule="auto" w:before="0" w:after="120"/>
+        <w:ind w:firstLine="420"/>
+      </w:pPr>
+      <w:r>
+        <w:rPr>
+          <w:rFonts w:ascii="Times New Roman" w:hAnsi="Times New Roman" w:eastAsia="SimSun"/>
+          <w:b w:val="0"/>
+          <w:sz w:val="21"/>
+        </w:rPr>
+        <w:t>从实际时间角度看，完整动作预测平均耗时为 339.891 ms。当前耗时最大的部分是 ODE integration，最后一次为 276.320 ms。这意味着即使 attention 复杂度下降明显，完整推理耗时也不会按 42.39% 等比例下降，因为完整链路中还有大量与视觉 token 数无关或弱相关的计算。</w:t>
+      </w:r>
+    </w:p>
+    <w:p>
+      <w:pPr>
+        <w:spacing w:line="360" w:lineRule="auto" w:before="0" w:after="120"/>
+        <w:ind w:firstLine="0"/>
+      </w:pPr>
+      <w:r>
+        <w:rPr>
+          <w:rFonts w:ascii="Times New Roman" w:hAnsi="Times New Roman" w:eastAsia="SimSun"/>
+          <w:b/>
+          <w:sz w:val="24"/>
+        </w:rPr>
+        <w:t>九、为什么不用 fvcore 直接测完整 FLOPs</w:t>
+      </w:r>
+    </w:p>
+    <w:p>
+      <w:pPr>
+        <w:spacing w:line="360" w:lineRule="auto" w:before="0" w:after="120"/>
+        <w:ind w:firstLine="420"/>
+      </w:pPr>
+      <w:r>
+        <w:rPr>
+          <w:rFonts w:ascii="Times New Roman" w:hAnsi="Times New Roman" w:eastAsia="SimSun"/>
+          <w:b w:val="0"/>
+          <w:sz w:val="21"/>
+        </w:rPr>
+        <w:t>之前尝试过使用 fvcore.nn.FlopCountAnalysis 对完整 forward / action prediction 路径做 tracing，但在当前模型上出现过 NoneType object has no attribute layers 等错误。这不是简单的语法错误，而是因为完整动作预测路径里包含 KV-cache、动态控制流、自定义 fusions ops、MoE token 分组和 ODE 多步循环。fvcore 更适合标准、静态、单次 forward 的 PyTorch module，对这类复杂推理链路支持不好。</w:t>
+      </w:r>
+    </w:p>
+    <w:p>
+      <w:pPr>
+        <w:spacing w:line="360" w:lineRule="auto" w:before="0" w:after="120"/>
+        <w:ind w:firstLine="420"/>
+      </w:pPr>
+      <w:r>
+        <w:rPr>
+          <w:rFonts w:ascii="Times New Roman" w:hAnsi="Times New Roman" w:eastAsia="SimSun"/>
+          <w:b w:val="0"/>
+          <w:sz w:val="21"/>
+        </w:rPr>
+        <w:t>因此当前方案选择基于 token 数进行理论复杂度估算。它的优点是稳定、可解释、不会引入额外依赖，也不会影响模型输出；局限是它不是硬件 profiler，也不是全模型逐算子的精确 FLOPs 统计。</w:t>
+      </w:r>
+    </w:p>
+    <w:p>
+      <w:pPr>
+        <w:spacing w:line="360" w:lineRule="auto" w:before="0" w:after="120"/>
+        <w:ind w:firstLine="0"/>
+      </w:pPr>
+      <w:r>
+        <w:rPr>
+          <w:rFonts w:ascii="Times New Roman" w:hAnsi="Times New Roman" w:eastAsia="SimSun"/>
+          <w:b/>
+          <w:sz w:val="24"/>
+        </w:rPr>
+        <w:t>十、结论</w:t>
+      </w:r>
+    </w:p>
+    <w:tbl>
+      <w:tblPr>
+        <w:tblStyle w:val="TableGrid"/>
+        <w:tblW w:type="auto" w:w="0"/>
+        <w:jc w:val="center"/>
+        <w:tblLook w:firstColumn="1" w:firstRow="1" w:lastColumn="0" w:lastRow="0" w:noHBand="0" w:noVBand="1" w:val="04A0"/>
+      </w:tblPr>
+      <w:tblGrid>
+        <w:gridCol w:w="4824"/>
+        <w:gridCol w:w="4824"/>
+      </w:tblGrid>
+      <w:tr>
+        <w:tc>
+          <w:tcPr>
+            <w:tcW w:type="dxa" w:w="4824"/>
+            <w:vAlign w:val="center"/>
+            <w:shd w:fill="D9EAF7"/>
+          </w:tcPr>
+          <w:p>
+            <w:pPr>
+              <w:spacing w:line="360" w:lineRule="auto" w:before="0" w:after="0"/>
+              <w:ind w:firstLine="0"/>
+              <w:jc w:val="center"/>
+            </w:pPr>
+            <w:r/>
+            <w:r>
+              <w:rPr>
+                <w:rFonts w:ascii="Times New Roman" w:hAnsi="Times New Roman" w:eastAsia="SimSun"/>
+                <w:b/>
+                <w:sz w:val="21"/>
+              </w:rPr>
+              <w:t>问题</w:t>
+            </w:r>
+          </w:p>
+        </w:tc>
+        <w:tc>
+          <w:tcPr>
+            <w:tcW w:type="dxa" w:w="4824"/>
+            <w:vAlign w:val="center"/>
+            <w:shd w:fill="D9EAF7"/>
+          </w:tcPr>
+          <w:p>
+            <w:pPr>
+              <w:spacing w:line="360" w:lineRule="auto" w:before="0" w:after="0"/>
+              <w:ind w:firstLine="0"/>
+              <w:jc w:val="center"/>
+            </w:pPr>
+            <w:r/>
+            <w:r>
+              <w:rPr>
+                <w:rFonts w:ascii="Times New Roman" w:hAnsi="Times New Roman" w:eastAsia="SimSun"/>
+                <w:b/>
+                <w:sz w:val="21"/>
+              </w:rPr>
+              <w:t>本次结论</w:t>
+            </w:r>
+          </w:p>
+        </w:tc>
+      </w:tr>
+      <w:tr>
+        <w:tc>
+          <w:tcPr>
+            <w:tcW w:type="dxa" w:w="4824"/>
+            <w:vAlign w:val="center"/>
+          </w:tcPr>
+          <w:p>
+            <w:pPr>
+              <w:spacing w:line="360" w:lineRule="auto" w:before="0" w:after="0"/>
+              <w:ind w:firstLine="0"/>
+              <w:jc w:val="center"/>
+            </w:pPr>
+            <w:r/>
+            <w:r>
+              <w:rPr>
+                <w:rFonts w:ascii="Times New Roman" w:hAnsi="Times New Roman" w:eastAsia="SimSun"/>
+                <w:b w:val="0"/>
+                <w:sz w:val="21"/>
+              </w:rPr>
+              <w:t>有没有拿到剪枝前后 token 数？</w:t>
+            </w:r>
+          </w:p>
+        </w:tc>
+        <w:tc>
+          <w:tcPr>
+            <w:tcW w:type="dxa" w:w="4824"/>
+            <w:vAlign w:val="center"/>
+          </w:tcPr>
+          <w:p>
+            <w:pPr>
+              <w:spacing w:line="360" w:lineRule="auto" w:before="0" w:after="0"/>
+              <w:ind w:firstLine="0"/>
+              <w:jc w:val="center"/>
+            </w:pPr>
+            <w:r/>
+            <w:r>
+              <w:rPr>
+                <w:rFonts w:ascii="Times New Roman" w:hAnsi="Times New Roman" w:eastAsia="SimSun"/>
+                <w:b w:val="0"/>
+                <w:sz w:val="21"/>
+              </w:rPr>
+              <w:t>已拿到。vision_tokens_before=81，vision_tokens_after=41，text_tokens=53，action_tokens=32。</w:t>
+            </w:r>
+          </w:p>
+        </w:tc>
+      </w:tr>
+      <w:tr>
+        <w:tc>
+          <w:tcPr>
+            <w:tcW w:type="dxa" w:w="4824"/>
+            <w:vAlign w:val="center"/>
+          </w:tcPr>
+          <w:p>
+            <w:pPr>
+              <w:spacing w:line="360" w:lineRule="auto" w:before="0" w:after="0"/>
+              <w:ind w:firstLine="0"/>
+              <w:jc w:val="center"/>
+            </w:pPr>
+            <w:r/>
+            <w:r>
+              <w:rPr>
+                <w:rFonts w:ascii="Times New Roman" w:hAnsi="Times New Roman" w:eastAsia="SimSun"/>
+                <w:b w:val="0"/>
+                <w:sz w:val="21"/>
+              </w:rPr>
+              <w:t>理论 attention 复杂度是否下降？</w:t>
+            </w:r>
+          </w:p>
+        </w:tc>
+        <w:tc>
+          <w:tcPr>
+            <w:tcW w:type="dxa" w:w="4824"/>
+            <w:vAlign w:val="center"/>
+          </w:tcPr>
+          <w:p>
+            <w:pPr>
+              <w:spacing w:line="360" w:lineRule="auto" w:before="0" w:after="0"/>
+              <w:ind w:firstLine="0"/>
+              <w:jc w:val="center"/>
+            </w:pPr>
+            <w:r/>
+            <w:r>
+              <w:rPr>
+                <w:rFonts w:ascii="Times New Roman" w:hAnsi="Times New Roman" w:eastAsia="SimSun"/>
+                <w:b w:val="0"/>
+                <w:sz w:val="21"/>
+              </w:rPr>
+              <w:t>已下降。seq_len 从 166 降到 126，attention 理论复杂度下降 42.39%。</w:t>
+            </w:r>
+          </w:p>
+        </w:tc>
+      </w:tr>
+      <w:tr>
+        <w:tc>
+          <w:tcPr>
+            <w:tcW w:type="dxa" w:w="4824"/>
+            <w:vAlign w:val="center"/>
+          </w:tcPr>
+          <w:p>
+            <w:pPr>
+              <w:spacing w:line="360" w:lineRule="auto" w:before="0" w:after="0"/>
+              <w:ind w:firstLine="0"/>
+              <w:jc w:val="center"/>
+            </w:pPr>
+            <w:r/>
+            <w:r>
+              <w:rPr>
+                <w:rFonts w:ascii="Times New Roman" w:hAnsi="Times New Roman" w:eastAsia="SimSun"/>
+                <w:b w:val="0"/>
+                <w:sz w:val="21"/>
+              </w:rPr>
+              <w:t>粗粒度 FLOPs 是否下降？</w:t>
+            </w:r>
+          </w:p>
+        </w:tc>
+        <w:tc>
+          <w:tcPr>
+            <w:tcW w:type="dxa" w:w="4824"/>
+            <w:vAlign w:val="center"/>
+          </w:tcPr>
+          <w:p>
+            <w:pPr>
+              <w:spacing w:line="360" w:lineRule="auto" w:before="0" w:after="0"/>
+              <w:ind w:firstLine="0"/>
+              <w:jc w:val="center"/>
+            </w:pPr>
+            <w:r/>
+            <w:r>
+              <w:rPr>
+                <w:rFonts w:ascii="Times New Roman" w:hAnsi="Times New Roman" w:eastAsia="SimSun"/>
+                <w:b w:val="0"/>
+                <w:sz w:val="21"/>
+              </w:rPr>
+              <w:t>已下降。estimated_train_flops_reduction=10.09%。</w:t>
+            </w:r>
+          </w:p>
+        </w:tc>
+      </w:tr>
+      <w:tr>
+        <w:tc>
+          <w:tcPr>
+            <w:tcW w:type="dxa" w:w="4824"/>
+            <w:vAlign w:val="center"/>
+          </w:tcPr>
+          <w:p>
+            <w:pPr>
+              <w:spacing w:line="360" w:lineRule="auto" w:before="0" w:after="0"/>
+              <w:ind w:firstLine="0"/>
+              <w:jc w:val="center"/>
+            </w:pPr>
+            <w:r/>
+            <w:r>
+              <w:rPr>
+                <w:rFonts w:ascii="Times New Roman" w:hAnsi="Times New Roman" w:eastAsia="SimSun"/>
+                <w:b w:val="0"/>
+                <w:sz w:val="21"/>
+              </w:rPr>
+              <w:t>实际推理耗时是多少？</w:t>
+            </w:r>
+          </w:p>
+        </w:tc>
+        <w:tc>
+          <w:tcPr>
+            <w:tcW w:type="dxa" w:w="4824"/>
+            <w:vAlign w:val="center"/>
+          </w:tcPr>
+          <w:p>
+            <w:pPr>
+              <w:spacing w:line="360" w:lineRule="auto" w:before="0" w:after="0"/>
+              <w:ind w:firstLine="0"/>
+              <w:jc w:val="center"/>
+            </w:pPr>
+            <w:r/>
+            <w:r>
+              <w:rPr>
+                <w:rFonts w:ascii="Times New Roman" w:hAnsi="Times New Roman" w:eastAsia="SimSun"/>
+                <w:b w:val="0"/>
+                <w:sz w:val="21"/>
+              </w:rPr>
+              <w:t>20 次平均 total_time 为 339.891 ms，最后一次 total_time 为 335.468 ms。</w:t>
+            </w:r>
+          </w:p>
+        </w:tc>
+      </w:tr>
+      <w:tr>
+        <w:tc>
+          <w:tcPr>
+            <w:tcW w:type="dxa" w:w="4824"/>
+            <w:vAlign w:val="center"/>
+          </w:tcPr>
+          <w:p>
+            <w:pPr>
+              <w:spacing w:line="360" w:lineRule="auto" w:before="0" w:after="0"/>
+              <w:ind w:firstLine="0"/>
+              <w:jc w:val="center"/>
+            </w:pPr>
+            <w:r/>
+            <w:r>
+              <w:rPr>
+                <w:rFonts w:ascii="Times New Roman" w:hAnsi="Times New Roman" w:eastAsia="SimSun"/>
+                <w:b w:val="0"/>
+                <w:sz w:val="21"/>
+              </w:rPr>
+              <w:t>这是不是精准硬件 FLOPs？</w:t>
+            </w:r>
+          </w:p>
+        </w:tc>
+        <w:tc>
+          <w:tcPr>
+            <w:tcW w:type="dxa" w:w="4824"/>
+            <w:vAlign w:val="center"/>
+          </w:tcPr>
+          <w:p>
+            <w:pPr>
+              <w:spacing w:line="360" w:lineRule="auto" w:before="0" w:after="0"/>
+              <w:ind w:firstLine="0"/>
+              <w:jc w:val="center"/>
+            </w:pPr>
+            <w:r/>
+            <w:r>
+              <w:rPr>
+                <w:rFonts w:ascii="Times New Roman" w:hAnsi="Times New Roman" w:eastAsia="SimSun"/>
+                <w:b w:val="0"/>
+                <w:sz w:val="21"/>
+              </w:rPr>
+              <w:t>不是。复杂度部分是基于 token 数和模型配置的理论估算；时间部分是 CUDA Event 真实测量。</w:t>
+            </w:r>
+          </w:p>
+        </w:tc>
+      </w:tr>
+      <w:tr>
+        <w:tc>
+          <w:tcPr>
+            <w:tcW w:type="dxa" w:w="4824"/>
+            <w:vAlign w:val="center"/>
+          </w:tcPr>
+          <w:p>
+            <w:pPr>
+              <w:spacing w:line="360" w:lineRule="auto" w:before="0" w:after="0"/>
+              <w:ind w:firstLine="0"/>
+              <w:jc w:val="center"/>
+            </w:pPr>
+            <w:r/>
+            <w:r>
+              <w:rPr>
+                <w:rFonts w:ascii="Times New Roman" w:hAnsi="Times New Roman" w:eastAsia="SimSun"/>
+                <w:b w:val="0"/>
+                <w:sz w:val="21"/>
+              </w:rPr>
+              <w:t>是否影响模型正常运行？</w:t>
+            </w:r>
+          </w:p>
+        </w:tc>
+        <w:tc>
+          <w:tcPr>
+            <w:tcW w:type="dxa" w:w="4824"/>
+            <w:vAlign w:val="center"/>
+          </w:tcPr>
+          <w:p>
+            <w:pPr>
+              <w:spacing w:line="360" w:lineRule="auto" w:before="0" w:after="0"/>
+              <w:ind w:firstLine="0"/>
+              <w:jc w:val="center"/>
+            </w:pPr>
+            <w:r/>
+            <w:r>
+              <w:rPr>
+                <w:rFonts w:ascii="Times New Roman" w:hAnsi="Times New Roman" w:eastAsia="SimSun"/>
+                <w:b w:val="0"/>
+                <w:sz w:val="21"/>
+              </w:rPr>
+              <w:t>不影响。统计逻辑默认关闭，只有显式打开 profiling 或传入复杂度参数时才会输出日志。</w:t>
+            </w:r>
+          </w:p>
+        </w:tc>
+      </w:tr>
+    </w:tbl>
+    <w:p/>
+    <w:p>
+      <w:pPr>
+        <w:spacing w:line="360" w:lineRule="auto" w:before="0" w:after="120"/>
+        <w:ind w:firstLine="0"/>
+      </w:pPr>
+      <w:r>
+        <w:rPr>
+          <w:rFonts w:ascii="Times New Roman" w:hAnsi="Times New Roman" w:eastAsia="SimSun"/>
+          <w:b/>
+          <w:sz w:val="24"/>
+        </w:rPr>
+        <w:t>十一、后续建议</w:t>
+      </w:r>
+    </w:p>
+    <w:p>
+      <w:pPr>
+        <w:spacing w:line="360" w:lineRule="auto" w:before="0" w:after="120"/>
+        <w:ind w:firstLine="420"/>
+      </w:pPr>
+      <w:r>
+        <w:rPr>
+          <w:rFonts w:ascii="Times New Roman" w:hAnsi="Times New Roman" w:eastAsia="SimSun"/>
+          <w:b w:val="0"/>
+          <w:sz w:val="21"/>
+        </w:rPr>
+        <w:t>如果后续 vispruner 真正接入推理路径，建议把实际剪枝后的视觉 token mask 或 vision_tokens_after 直接传入 _log_complexity_track，而不是继续用 vision_keep_ratio 模拟。这样报告中的 vision_tokens_after 会来自真实剪枝结果。</w:t>
+      </w:r>
+    </w:p>
+    <w:p>
+      <w:pPr>
+        <w:spacing w:line="360" w:lineRule="auto" w:before="0" w:after="120"/>
+        <w:ind w:firstLine="420"/>
+      </w:pPr>
+      <w:r>
+        <w:rPr>
+          <w:rFonts w:ascii="Times New Roman" w:hAnsi="Times New Roman" w:eastAsia="SimSun"/>
+          <w:b w:val="0"/>
+          <w:sz w:val="21"/>
+        </w:rPr>
+        <w:t>如果后续需要更细粒度的性能分析，可以分模块统计 visual encoder FLOPs、prefill / prefix Transformer FLOPs、postfix Transformer FLOPs 和 action head FLOPs。但这属于下一阶段的细化 profiling，不建议再强行对完整 diffusion 链路做一次性 fvcore tracing。</w:t>
+      </w:r>
+    </w:p>
+    <w:p>
+      <w:pPr>
+        <w:spacing w:line="360" w:lineRule="auto" w:before="0" w:after="120"/>
+        <w:ind w:firstLine="420"/>
+      </w:pPr>
+      <w:r>
+        <w:rPr>
+          <w:rFonts w:ascii="Times New Roman" w:hAnsi="Times New Roman" w:eastAsia="SimSun"/>
+          <w:b w:val="0"/>
+          <w:sz w:val="21"/>
+        </w:rPr>
+        <w:t>GitHub 仓库：git@github.com:Acton618/wallx.git。本文档文件：wall_x/wallx_time_flops_handoff_report.docx。</w:t>
       </w:r>
     </w:p>
     <w:sectPr>
       <w:pgSz w:w="12240" w:h="15840"/>
-      <w:pgMar w:top="1440" w:right="1800" w:bottom="1440" w:left="1800" w:header="720" w:footer="720" w:gutter="0"/>
+      <w:pgMar w:top="1152" w:right="1296" w:bottom="1152" w:left="1296" w:header="720" w:footer="720" w:gutter="0"/>
       <w:cols w:space="720"/>
       <w:docGrid w:linePitch="360"/>
     </w:sectPr>
@@ -1196,8 +3486,12 @@
     <w:name w:val="Normal"/>
     <w:qFormat/>
     <w:rsid w:val="00FC693F"/>
+    <w:pPr>
+      <w:spacing w:line="360" w:lineRule="auto" w:after="120"/>
+      <w:ind w:firstLine="420"/>
+    </w:pPr>
     <w:rPr>
-      <w:rFonts w:ascii="Arial" w:hAnsi="Arial" w:eastAsia="Microsoft YaHei"/>
+      <w:rFonts w:ascii="Times New Roman" w:hAnsi="Times New Roman" w:eastAsia="SimSun"/>
       <w:sz w:val="21"/>
     </w:rPr>
   </w:style>

</xml_diff>